<commit_message>
finished proof-reading chapter 1, added new chapter E and F too, some material in that last chapter yet to be completed and proof-read
</commit_message>
<xml_diff>
--- a/FOLLOW-UP/BOOK PROPOSAL to PUBLISHERS/Francis and Taylor/Book  Proposal Form.docx
+++ b/FOLLOW-UP/BOOK PROPOSAL to PUBLISHERS/Francis and Taylor/Book  Proposal Form.docx
@@ -1,6 +1,6 @@
 
 <file path=word/document.xml><?xml version="1.0" encoding="utf-8"?>
-<w:document xmlns:wpc="http://schemas.microsoft.com/office/word/2010/wordprocessingCanvas" xmlns:cx="http://schemas.microsoft.com/office/drawing/2014/chartex" xmlns:cx1="http://schemas.microsoft.com/office/drawing/2015/9/8/chartex" xmlns:cx2="http://schemas.microsoft.com/office/drawing/2015/10/21/chartex" xmlns:cx3="http://schemas.microsoft.com/office/drawing/2016/5/9/chartex" xmlns:cx4="http://schemas.microsoft.com/office/drawing/2016/5/10/chartex" xmlns:cx5="http://schemas.microsoft.com/office/drawing/2016/5/11/chartex" xmlns:cx6="http://schemas.microsoft.com/office/drawing/2016/5/12/chartex" xmlns:cx7="http://schemas.microsoft.com/office/drawing/2016/5/13/chartex" xmlns:cx8="http://schemas.microsoft.com/office/drawing/2016/5/14/chartex" xmlns:mc="http://schemas.openxmlformats.org/markup-compatibility/2006" xmlns:aink="http://schemas.microsoft.com/office/drawing/2016/ink" xmlns:am3d="http://schemas.microsoft.com/office/drawing/2017/model3d" xmlns:o="urn:schemas-microsoft-com:office:office" xmlns:oel="http://schemas.microsoft.com/office/2019/extlst" xmlns:r="http://schemas.openxmlformats.org/officeDocument/2006/relationships" xmlns:m="http://schemas.openxmlformats.org/officeDocument/2006/math" xmlns:v="urn:schemas-microsoft-com:vml" xmlns:wp14="http://schemas.microsoft.com/office/word/2010/wordprocessingDrawing" xmlns:wp="http://schemas.openxmlformats.org/drawingml/2006/wordprocessingDrawing" xmlns:w10="urn:schemas-microsoft-com:office:word" xmlns:w="http://schemas.openxmlformats.org/wordprocessingml/2006/main" xmlns:w14="http://schemas.microsoft.com/office/word/2010/wordml" xmlns:w15="http://schemas.microsoft.com/office/word/2012/wordml" xmlns:w16cex="http://schemas.microsoft.com/office/word/2018/wordml/cex" xmlns:w16cid="http://schemas.microsoft.com/office/word/2016/wordml/cid" xmlns:w16="http://schemas.microsoft.com/office/word/2018/wordml" xmlns:w16du="http://schemas.microsoft.com/office/word/2023/wordml/word16du" xmlns:w16sdtdh="http://schemas.microsoft.com/office/word/2020/wordml/sdtdatahash" xmlns:w16sdtfl="http://schemas.microsoft.com/office/word/2024/wordml/sdtformatlock" xmlns:w16se="http://schemas.microsoft.com/office/word/2015/wordml/symex" xmlns:wpg="http://schemas.microsoft.com/office/word/2010/wordprocessingGroup" xmlns:wpi="http://schemas.microsoft.com/office/word/2010/wordprocessingInk" xmlns:wne="http://schemas.microsoft.com/office/word/2006/wordml" xmlns:wps="http://schemas.microsoft.com/office/word/2010/wordprocessingShape" mc:Ignorable="w14 w15 w16se w16cid w16 w16cex w16sdtdh w16sdtfl w16du wp14">
+<w:document xmlns:wpc="http://schemas.microsoft.com/office/word/2010/wordprocessingCanvas" xmlns:mc="http://schemas.openxmlformats.org/markup-compatibility/2006" xmlns:o="urn:schemas-microsoft-com:office:office" xmlns:r="http://schemas.openxmlformats.org/officeDocument/2006/relationships" xmlns:m="http://schemas.openxmlformats.org/officeDocument/2006/math" xmlns:v="urn:schemas-microsoft-com:vml" xmlns:wp14="http://schemas.microsoft.com/office/word/2010/wordprocessingDrawing" xmlns:wp="http://schemas.openxmlformats.org/drawingml/2006/wordprocessingDrawing" xmlns:w10="urn:schemas-microsoft-com:office:word" xmlns:w="http://schemas.openxmlformats.org/wordprocessingml/2006/main" xmlns:w14="http://schemas.microsoft.com/office/word/2010/wordml" xmlns:w15="http://schemas.microsoft.com/office/word/2012/wordml" xmlns:wpg="http://schemas.microsoft.com/office/word/2010/wordprocessingGroup" xmlns:wpi="http://schemas.microsoft.com/office/word/2010/wordprocessingInk" xmlns:wne="http://schemas.microsoft.com/office/word/2006/wordml" xmlns:wps="http://schemas.microsoft.com/office/word/2010/wordprocessingShape" mc:Ignorable="w14 w15 wp14">
   <w:body>
     <w:p>
       <w:pPr>
@@ -83,7 +83,21 @@
         <w:rPr>
           <w:rFonts w:ascii="Calibri Light" w:hAnsi="Calibri Light" w:cs="Calibri Light"/>
         </w:rPr>
-        <w:t xml:space="preserve">The information provided in this document will be used for peer reviews and for the consideration of contract approval, so </w:t>
+        <w:t xml:space="preserve">The information provided in this document </w:t>
+      </w:r>
+      <w:proofErr w:type="gramStart"/>
+      <w:r>
+        <w:rPr>
+          <w:rFonts w:ascii="Calibri Light" w:hAnsi="Calibri Light" w:cs="Calibri Light"/>
+        </w:rPr>
+        <w:t>will be used</w:t>
+      </w:r>
+      <w:proofErr w:type="gramEnd"/>
+      <w:r>
+        <w:rPr>
+          <w:rFonts w:ascii="Calibri Light" w:hAnsi="Calibri Light" w:cs="Calibri Light"/>
+        </w:rPr>
+        <w:t xml:space="preserve"> for peer reviews and for the consideration of contract approval, so </w:t>
       </w:r>
       <w:r>
         <w:rPr>
@@ -142,7 +156,27 @@
           <w:iCs/>
           <w:lang w:val="en-GB"/>
         </w:rPr>
-        <w:t>Proposals must not use artificial intelligence tools to generate responses, including LLM based tools like ChatGPT. If it is deemed that AI was used to generate responses the proposals will be disqualified from consideration</w:t>
+        <w:t xml:space="preserve">Proposals must not use artificial intelligence tools to generate responses, including LLM based tools like ChatGPT. If it is deemed that AI was used to generate </w:t>
+      </w:r>
+      <w:proofErr w:type="gramStart"/>
+      <w:r>
+        <w:rPr>
+          <w:rFonts w:ascii="Calibri Light" w:hAnsi="Calibri Light" w:cs="Calibri Light"/>
+          <w:bCs/>
+          <w:iCs/>
+          <w:lang w:val="en-GB"/>
+        </w:rPr>
+        <w:t>responses</w:t>
+      </w:r>
+      <w:proofErr w:type="gramEnd"/>
+      <w:r>
+        <w:rPr>
+          <w:rFonts w:ascii="Calibri Light" w:hAnsi="Calibri Light" w:cs="Calibri Light"/>
+          <w:bCs/>
+          <w:iCs/>
+          <w:lang w:val="en-GB"/>
+        </w:rPr>
+        <w:t xml:space="preserve"> the proposals will be disqualified from consideration</w:t>
       </w:r>
     </w:p>
     <w:p>
@@ -218,13 +252,23 @@
           <w:iCs/>
         </w:rPr>
       </w:pPr>
+      <w:proofErr w:type="gramStart"/>
       <w:r>
         <w:rPr>
           <w:rFonts w:ascii="Calibri Light" w:hAnsi="Calibri Light" w:cs="Calibri Light"/>
           <w:bCs/>
           <w:iCs/>
         </w:rPr>
-        <w:t xml:space="preserve">I confirm that no AI software was used in answering this proposal form   </w:t>
+        <w:t>I</w:t>
+      </w:r>
+      <w:proofErr w:type="gramEnd"/>
+      <w:r>
+        <w:rPr>
+          <w:rFonts w:ascii="Calibri Light" w:hAnsi="Calibri Light" w:cs="Calibri Light"/>
+          <w:bCs/>
+          <w:iCs/>
+        </w:rPr>
+        <w:t xml:space="preserve"> confirm that no AI software was used in answering this proposal form   </w:t>
       </w:r>
       <w:r>
         <w:rPr>
@@ -239,7 +283,7 @@
           <w:rFonts w:ascii="Calibri Light" w:hAnsi="Calibri Light" w:cs="Calibri Light"/>
           <w:bCs/>
         </w:rPr>
-        <w:object w:dxaOrig="1440" w:dyaOrig="1440" w14:anchorId="3C732068">
+        <w:object w:dxaOrig="960" w:dyaOrig="435" w14:anchorId="3C732068">
           <v:shapetype id="_x0000_t75" coordsize="21600,21600" o:spt="75" o:preferrelative="t" path="m@4@5l@4@11@9@11@9@5xe" filled="f" stroked="f">
             <v:stroke joinstyle="miter"/>
             <v:formulas>
@@ -259,10 +303,10 @@
             <v:path o:extrusionok="f" gradientshapeok="t" o:connecttype="rect"/>
             <o:lock v:ext="edit" aspectratio="t"/>
           </v:shapetype>
-          <v:shape id="_x0000_i1046" type="#_x0000_t75" style="width:48pt;height:21.75pt" o:ole="">
+          <v:shape id="_x0000_i1033" type="#_x0000_t75" style="width:48pt;height:21.75pt" o:ole="">
             <v:imagedata r:id="rId9" o:title=""/>
           </v:shape>
-          <w:control r:id="rId10" w:name="CheckBox12211" w:shapeid="_x0000_i1046"/>
+          <w:control r:id="rId10" w:name="CheckBox12211" w:shapeid="_x0000_i1033"/>
         </w:object>
       </w:r>
     </w:p>
@@ -286,13 +330,23 @@
           <w:i/>
         </w:rPr>
       </w:pPr>
+      <w:proofErr w:type="gramStart"/>
       <w:r>
         <w:rPr>
           <w:rFonts w:ascii="Calibri Light" w:hAnsi="Calibri Light" w:cs="Calibri Light"/>
           <w:bCs/>
           <w:iCs/>
         </w:rPr>
-        <w:t xml:space="preserve">I confirm that AI software was used in improving language of the proposal  </w:t>
+        <w:t>I</w:t>
+      </w:r>
+      <w:proofErr w:type="gramEnd"/>
+      <w:r>
+        <w:rPr>
+          <w:rFonts w:ascii="Calibri Light" w:hAnsi="Calibri Light" w:cs="Calibri Light"/>
+          <w:bCs/>
+          <w:iCs/>
+        </w:rPr>
+        <w:t xml:space="preserve"> confirm that AI software was used in improving language of the proposal  </w:t>
       </w:r>
       <w:r>
         <w:rPr>
@@ -307,11 +361,11 @@
           <w:rFonts w:ascii="Calibri Light" w:hAnsi="Calibri Light" w:cs="Calibri Light"/>
           <w:bCs/>
         </w:rPr>
-        <w:object w:dxaOrig="1440" w:dyaOrig="1440" w14:anchorId="27AF11B8">
-          <v:shape id="_x0000_i1045" type="#_x0000_t75" style="width:48pt;height:21.75pt" o:ole="">
+        <w:object w:dxaOrig="960" w:dyaOrig="435" w14:anchorId="27AF11B8">
+          <v:shape id="_x0000_i1031" type="#_x0000_t75" style="width:48pt;height:21.75pt" o:ole="">
             <v:imagedata r:id="rId11" o:title=""/>
           </v:shape>
-          <w:control r:id="rId12" w:name="CheckBox122111" w:shapeid="_x0000_i1045"/>
+          <w:control r:id="rId12" w:name="CheckBox122111" w:shapeid="_x0000_i1031"/>
         </w:object>
       </w:r>
       <w:r>
@@ -455,6 +509,13 @@
                 <w:snapToGrid w:val="0"/>
               </w:rPr>
             </w:pPr>
+            <w:r>
+              <w:rPr>
+                <w:rFonts w:ascii="Calibri Light" w:hAnsi="Calibri Light" w:cs="Calibri Light"/>
+                <w:snapToGrid w:val="0"/>
+              </w:rPr>
+              <w:t>Joseph Willrich Lutalo</w:t>
+            </w:r>
           </w:p>
         </w:tc>
       </w:tr>
@@ -500,6 +561,13 @@
                 <w:snapToGrid w:val="0"/>
               </w:rPr>
             </w:pPr>
+            <w:r>
+              <w:rPr>
+                <w:rFonts w:ascii="Calibri Light" w:hAnsi="Calibri Light" w:cs="Calibri Light"/>
+                <w:snapToGrid w:val="0"/>
+              </w:rPr>
+              <w:t>Nuchwezi Research</w:t>
+            </w:r>
           </w:p>
         </w:tc>
       </w:tr>
@@ -545,6 +613,13 @@
                 <w:snapToGrid w:val="0"/>
               </w:rPr>
             </w:pPr>
+            <w:r>
+              <w:rPr>
+                <w:rFonts w:ascii="Calibri Light" w:hAnsi="Calibri Light" w:cs="Calibri Light"/>
+                <w:snapToGrid w:val="0"/>
+              </w:rPr>
+              <w:t>+256704464749</w:t>
+            </w:r>
           </w:p>
         </w:tc>
       </w:tr>
@@ -590,6 +665,53 @@
                 <w:snapToGrid w:val="0"/>
               </w:rPr>
             </w:pPr>
+            <w:r>
+              <w:rPr>
+                <w:rFonts w:ascii="Calibri Light" w:hAnsi="Calibri Light" w:cs="Calibri Light"/>
+                <w:snapToGrid w:val="0"/>
+              </w:rPr>
+              <w:t>Plot 266, 1</w:t>
+            </w:r>
+            <w:r>
+              <w:rPr>
+                <w:rFonts w:ascii="Calibri Light" w:hAnsi="Calibri Light" w:cs="Calibri Light"/>
+                <w:snapToGrid w:val="0"/>
+                <w:vertAlign w:val="superscript"/>
+              </w:rPr>
+              <w:t>st</w:t>
+            </w:r>
+            <w:r>
+              <w:rPr>
+                <w:rFonts w:ascii="Calibri Light" w:hAnsi="Calibri Light" w:cs="Calibri Light"/>
+                <w:snapToGrid w:val="0"/>
+              </w:rPr>
+              <w:t xml:space="preserve"> </w:t>
+            </w:r>
+            <w:proofErr w:type="spellStart"/>
+            <w:r>
+              <w:rPr>
+                <w:rFonts w:ascii="Calibri Light" w:hAnsi="Calibri Light" w:cs="Calibri Light"/>
+                <w:snapToGrid w:val="0"/>
+              </w:rPr>
+              <w:t>Cwa</w:t>
+            </w:r>
+            <w:proofErr w:type="spellEnd"/>
+            <w:r>
+              <w:rPr>
+                <w:rFonts w:ascii="Calibri Light" w:hAnsi="Calibri Light" w:cs="Calibri Light"/>
+                <w:snapToGrid w:val="0"/>
+              </w:rPr>
+              <w:t xml:space="preserve"> Road, GARUGA-</w:t>
+            </w:r>
+            <w:proofErr w:type="spellStart"/>
+            <w:r>
+              <w:rPr>
+                <w:rFonts w:ascii="Calibri Light" w:hAnsi="Calibri Light" w:cs="Calibri Light"/>
+                <w:snapToGrid w:val="0"/>
+              </w:rPr>
+              <w:t>Bugabo</w:t>
+            </w:r>
+            <w:proofErr w:type="spellEnd"/>
           </w:p>
         </w:tc>
       </w:tr>
@@ -635,6 +757,16 @@
                 <w:snapToGrid w:val="0"/>
               </w:rPr>
             </w:pPr>
+            <w:hyperlink r:id="rId13" w:history="1">
+              <w:r>
+                <w:rPr>
+                  <w:rStyle w:val="Hyperlink"/>
+                  <w:rFonts w:ascii="Calibri Light" w:hAnsi="Calibri Light" w:cs="Calibri Light"/>
+                  <w:snapToGrid w:val="0"/>
+                </w:rPr>
+                <w:t>joewillrich@gmail.com</w:t>
+              </w:r>
+            </w:hyperlink>
           </w:p>
         </w:tc>
       </w:tr>
@@ -892,7 +1024,7 @@
           <w:rFonts w:ascii="Calibri Light" w:hAnsi="Calibri Light" w:cs="Calibri Light"/>
           <w:bCs/>
         </w:rPr>
-        <w:t xml:space="preserve"> YES/NO</w:t>
+        <w:t xml:space="preserve"> YES</w:t>
       </w:r>
     </w:p>
     <w:p>
@@ -916,7 +1048,13 @@
           <w:bCs/>
         </w:rPr>
         <w:tab/>
-        <w:t>YES/NO</w:t>
+      </w:r>
+      <w:r>
+        <w:rPr>
+          <w:rFonts w:ascii="Calibri Light" w:hAnsi="Calibri Light" w:cs="Calibri Light"/>
+          <w:bCs/>
+        </w:rPr>
+        <w:t>NO</w:t>
       </w:r>
     </w:p>
     <w:p>
@@ -1049,12 +1187,12 @@
           <w:rFonts w:ascii="Calibri Light" w:hAnsi="Calibri Light" w:cs="Calibri Light"/>
         </w:rPr>
         <w:sectPr>
-          <w:headerReference w:type="even" r:id="rId13"/>
-          <w:headerReference w:type="default" r:id="rId14"/>
-          <w:footerReference w:type="even" r:id="rId15"/>
-          <w:footerReference w:type="default" r:id="rId16"/>
-          <w:headerReference w:type="first" r:id="rId17"/>
-          <w:footerReference w:type="first" r:id="rId18"/>
+          <w:headerReference w:type="even" r:id="rId14"/>
+          <w:headerReference w:type="default" r:id="rId15"/>
+          <w:footerReference w:type="even" r:id="rId16"/>
+          <w:footerReference w:type="default" r:id="rId17"/>
+          <w:headerReference w:type="first" r:id="rId18"/>
+          <w:footerReference w:type="first" r:id="rId19"/>
           <w:pgSz w:w="12240" w:h="15840"/>
           <w:pgMar w:top="1440" w:right="1440" w:bottom="1440" w:left="1440" w:header="720" w:footer="720" w:gutter="0"/>
           <w:cols w:space="720"/>
@@ -1141,7 +1279,23 @@
                 <w:rFonts w:ascii="Calibri Light" w:hAnsi="Calibri Light" w:cs="Calibri Light"/>
                 <w:snapToGrid w:val="0"/>
               </w:rPr>
-              <w:t xml:space="preserve">Please include 3-5 possible reviewers for this proposal. I will be contacting them to review this proposal and any materials that you supply to me unless you specify otherwise.  </w:t>
+              <w:t xml:space="preserve">Please include 3-5 possible reviewers for this proposal. </w:t>
+            </w:r>
+            <w:proofErr w:type="gramStart"/>
+            <w:r>
+              <w:rPr>
+                <w:rFonts w:ascii="Calibri Light" w:hAnsi="Calibri Light" w:cs="Calibri Light"/>
+                <w:snapToGrid w:val="0"/>
+              </w:rPr>
+              <w:t>I</w:t>
+            </w:r>
+            <w:proofErr w:type="gramEnd"/>
+            <w:r>
+              <w:rPr>
+                <w:rFonts w:ascii="Calibri Light" w:hAnsi="Calibri Light" w:cs="Calibri Light"/>
+                <w:snapToGrid w:val="0"/>
+              </w:rPr>
+              <w:t xml:space="preserve"> will be contacting them to review this proposal and any materials that you supply to me unless you specify otherwise.  </w:t>
             </w:r>
           </w:p>
           <w:p>
@@ -1572,7 +1726,7 @@
                       <w:bCs/>
                       <w:snapToGrid w:val="0"/>
                     </w:rPr>
-                    <w:t>Reviewer’s name (U</w:t>
+                    <w:t>Reviewer’s name (</w:t>
                   </w:r>
                   <w:r>
                     <w:rPr>
@@ -1581,7 +1735,7 @@
                       <w:bCs/>
                       <w:snapToGrid w:val="0"/>
                     </w:rPr>
-                    <w:t>.</w:t>
+                    <w:t>Non-</w:t>
                   </w:r>
                   <w:r>
                     <w:rPr>
@@ -1590,25 +1744,7 @@
                       <w:bCs/>
                       <w:snapToGrid w:val="0"/>
                     </w:rPr>
-                    <w:t>S</w:t>
-                  </w:r>
-                  <w:r>
-                    <w:rPr>
-                      <w:rFonts w:ascii="Calibri Light" w:hAnsi="Calibri Light" w:cs="Calibri Light"/>
-                      <w:b/>
-                      <w:bCs/>
-                      <w:snapToGrid w:val="0"/>
-                    </w:rPr>
-                    <w:t>.</w:t>
-                  </w:r>
-                  <w:r>
-                    <w:rPr>
-                      <w:rFonts w:ascii="Calibri Light" w:hAnsi="Calibri Light" w:cs="Calibri Light"/>
-                      <w:b/>
-                      <w:bCs/>
-                      <w:snapToGrid w:val="0"/>
-                    </w:rPr>
-                    <w:t>)</w:t>
+                    <w:t>US)</w:t>
                   </w:r>
                 </w:p>
               </w:tc>
@@ -1627,6 +1763,55 @@
                       <w:lang w:eastAsia="zh-CN"/>
                     </w:rPr>
                   </w:pPr>
+                  <w:r>
+                    <w:rPr>
+                      <w:rFonts w:ascii="Corbel" w:hAnsi="Corbel"/>
+                      <w:bCs/>
+                      <w:sz w:val="20"/>
+                      <w:szCs w:val="20"/>
+                    </w:rPr>
+                    <w:t>:</w:t>
+                  </w:r>
+                  <w:r>
+                    <w:rPr>
+                      <w:rFonts w:ascii="Corbel" w:hAnsi="Corbel"/>
+                      <w:bCs/>
+                      <w:sz w:val="20"/>
+                      <w:szCs w:val="20"/>
+                    </w:rPr>
+                    <w:t xml:space="preserve"> Ass. Prof. </w:t>
+                  </w:r>
+                  <w:proofErr w:type="spellStart"/>
+                  <w:r>
+                    <w:rPr>
+                      <w:rFonts w:ascii="Corbel" w:hAnsi="Corbel"/>
+                      <w:bCs/>
+                      <w:sz w:val="20"/>
+                      <w:szCs w:val="20"/>
+                    </w:rPr>
+                    <w:t>Juma</w:t>
+                  </w:r>
+                  <w:proofErr w:type="spellEnd"/>
+                  <w:r>
+                    <w:rPr>
+                      <w:rFonts w:ascii="Corbel" w:hAnsi="Corbel"/>
+                      <w:bCs/>
+                      <w:sz w:val="20"/>
+                      <w:szCs w:val="20"/>
+                    </w:rPr>
+                    <w:t xml:space="preserve"> </w:t>
+                  </w:r>
+                  <w:proofErr w:type="spellStart"/>
+                  <w:r>
+                    <w:rPr>
+                      <w:rFonts w:ascii="Corbel" w:hAnsi="Corbel"/>
+                      <w:bCs/>
+                      <w:sz w:val="20"/>
+                      <w:szCs w:val="20"/>
+                    </w:rPr>
+                    <w:t>Kasozi</w:t>
+                  </w:r>
+                  <w:proofErr w:type="spellEnd"/>
                 </w:p>
               </w:tc>
             </w:tr>
@@ -1669,6 +1854,18 @@
                       <w:lang w:eastAsia="zh-CN"/>
                     </w:rPr>
                   </w:pPr>
+                  <w:hyperlink r:id="rId20" w:history="1">
+                    <w:r>
+                      <w:rPr>
+                        <w:rStyle w:val="Hyperlink"/>
+                        <w:rFonts w:ascii="Corbel" w:hAnsi="Corbel"/>
+                        <w:bCs/>
+                        <w:sz w:val="20"/>
+                        <w:szCs w:val="20"/>
+                      </w:rPr>
+                      <w:t>jkasozi2015@gmail.com</w:t>
+                    </w:r>
+                  </w:hyperlink>
                 </w:p>
               </w:tc>
             </w:tr>
@@ -1711,6 +1908,15 @@
                       <w:lang w:val="fr-FR" w:eastAsia="zh-CN"/>
                     </w:rPr>
                   </w:pPr>
+                  <w:r>
+                    <w:rPr>
+                      <w:rFonts w:ascii="Corbel" w:hAnsi="Corbel"/>
+                      <w:bCs/>
+                      <w:sz w:val="20"/>
+                      <w:szCs w:val="20"/>
+                    </w:rPr>
+                    <w:t>(Mathematics, School of Physical Sciences, Makerere University)</w:t>
+                  </w:r>
                 </w:p>
               </w:tc>
             </w:tr>
@@ -1783,6 +1989,46 @@
                       <w:snapToGrid w:val="0"/>
                     </w:rPr>
                   </w:pPr>
+                  <w:r>
+                    <w:rPr>
+                      <w:rFonts w:ascii="Corbel" w:hAnsi="Corbel"/>
+                      <w:bCs/>
+                      <w:sz w:val="20"/>
+                      <w:szCs w:val="20"/>
+                    </w:rPr>
+                    <w:t xml:space="preserve">Prof. Donald </w:t>
+                  </w:r>
+                  <w:proofErr w:type="spellStart"/>
+                  <w:r>
+                    <w:rPr>
+                      <w:rFonts w:ascii="Corbel" w:hAnsi="Corbel"/>
+                      <w:bCs/>
+                      <w:sz w:val="20"/>
+                      <w:szCs w:val="20"/>
+                    </w:rPr>
+                    <w:t>Rugira</w:t>
+                  </w:r>
+                  <w:proofErr w:type="spellEnd"/>
+                  <w:r>
+                    <w:rPr>
+                      <w:rFonts w:ascii="Corbel" w:hAnsi="Corbel"/>
+                      <w:bCs/>
+                      <w:sz w:val="20"/>
+                      <w:szCs w:val="20"/>
+                    </w:rPr>
+                    <w:t xml:space="preserve"> </w:t>
+                  </w:r>
+                  <w:proofErr w:type="spellStart"/>
+                  <w:r>
+                    <w:rPr>
+                      <w:rFonts w:ascii="Corbel" w:hAnsi="Corbel"/>
+                      <w:bCs/>
+                      <w:sz w:val="20"/>
+                      <w:szCs w:val="20"/>
+                    </w:rPr>
+                    <w:t>Kugonza</w:t>
+                  </w:r>
+                  <w:proofErr w:type="spellEnd"/>
                 </w:p>
               </w:tc>
             </w:tr>
@@ -1824,6 +2070,39 @@
                       <w:snapToGrid w:val="0"/>
                     </w:rPr>
                   </w:pPr>
+                  <w:hyperlink r:id="rId21" w:history="1">
+                    <w:r>
+                      <w:rPr>
+                        <w:rStyle w:val="Hyperlink"/>
+                        <w:rFonts w:ascii="Corbel" w:hAnsi="Corbel"/>
+                        <w:bCs/>
+                        <w:sz w:val="20"/>
+                        <w:szCs w:val="20"/>
+                      </w:rPr>
+                      <w:t>donkugonza@gmail.com</w:t>
+                    </w:r>
+                  </w:hyperlink>
+                  <w:r>
+                    <w:rPr>
+                      <w:rFonts w:ascii="Corbel" w:hAnsi="Corbel"/>
+                      <w:bCs/>
+                      <w:sz w:val="20"/>
+                      <w:szCs w:val="20"/>
+                    </w:rPr>
+                    <w:t xml:space="preserve"> , </w:t>
+                  </w:r>
+                  <w:hyperlink r:id="rId22" w:history="1">
+                    <w:r>
+                      <w:rPr>
+                        <w:rStyle w:val="Hyperlink"/>
+                        <w:rFonts w:ascii="Corbel" w:hAnsi="Corbel"/>
+                        <w:bCs/>
+                        <w:sz w:val="20"/>
+                        <w:szCs w:val="20"/>
+                      </w:rPr>
+                      <w:t>donkugonza@caes.mak.ac.ug</w:t>
+                    </w:r>
+                  </w:hyperlink>
                 </w:p>
               </w:tc>
             </w:tr>
@@ -1865,6 +2144,24 @@
                       <w:snapToGrid w:val="0"/>
                     </w:rPr>
                   </w:pPr>
+                  <w:r>
+                    <w:rPr>
+                      <w:rFonts w:ascii="Corbel" w:hAnsi="Corbel"/>
+                      <w:bCs/>
+                      <w:sz w:val="20"/>
+                      <w:szCs w:val="20"/>
+                    </w:rPr>
+                    <w:t xml:space="preserve">Makerere University, </w:t>
+                  </w:r>
+                  <w:r>
+                    <w:rPr>
+                      <w:rFonts w:ascii="Corbel" w:hAnsi="Corbel"/>
+                      <w:bCs/>
+                      <w:sz w:val="20"/>
+                      <w:szCs w:val="20"/>
+                    </w:rPr>
+                    <w:t>College of Agricultural and Environmental Sciences</w:t>
+                  </w:r>
                 </w:p>
               </w:tc>
             </w:tr>
@@ -1946,6 +2243,35 @@
                       <w:snapToGrid w:val="0"/>
                     </w:rPr>
                   </w:pPr>
+                  <w:r>
+                    <w:rPr>
+                      <w:rFonts w:ascii="Corbel" w:hAnsi="Corbel"/>
+                      <w:bCs/>
+                      <w:sz w:val="20"/>
+                      <w:szCs w:val="20"/>
+                    </w:rPr>
+                    <w:t xml:space="preserve">Dr. </w:t>
+                  </w:r>
+                  <w:proofErr w:type="spellStart"/>
+                  <w:r>
+                    <w:rPr>
+                      <w:rFonts w:ascii="Corbel" w:hAnsi="Corbel"/>
+                      <w:bCs/>
+                      <w:sz w:val="20"/>
+                      <w:szCs w:val="20"/>
+                    </w:rPr>
+                    <w:t>Mbiine</w:t>
+                  </w:r>
+                  <w:proofErr w:type="spellEnd"/>
+                  <w:r>
+                    <w:rPr>
+                      <w:rFonts w:ascii="Corbel" w:hAnsi="Corbel"/>
+                      <w:bCs/>
+                      <w:sz w:val="20"/>
+                      <w:szCs w:val="20"/>
+                    </w:rPr>
+                    <w:t xml:space="preserve"> Ronald</w:t>
+                  </w:r>
                 </w:p>
               </w:tc>
             </w:tr>
@@ -1987,6 +2313,47 @@
                       <w:snapToGrid w:val="0"/>
                     </w:rPr>
                   </w:pPr>
+                  <w:hyperlink r:id="rId23" w:history="1">
+                    <w:r>
+                      <w:rPr>
+                        <w:rStyle w:val="Hyperlink"/>
+                        <w:rFonts w:ascii="Calibri Light" w:hAnsi="Calibri Light" w:cs="Calibri Light"/>
+                        <w:snapToGrid w:val="0"/>
+                      </w:rPr>
+                      <w:t>ronald.mbiine@mak.ac.ug</w:t>
+                    </w:r>
+                  </w:hyperlink>
+                  <w:r>
+                    <w:rPr>
+                      <w:rFonts w:ascii="Calibri Light" w:hAnsi="Calibri Light" w:cs="Calibri Light"/>
+                      <w:snapToGrid w:val="0"/>
+                    </w:rPr>
+                    <w:t xml:space="preserve"> </w:t>
+                  </w:r>
+                  <w:r>
+                    <w:rPr>
+                      <w:rFonts w:ascii="Calibri Light" w:hAnsi="Calibri Light" w:cs="Calibri Light"/>
+                      <w:snapToGrid w:val="0"/>
+                    </w:rPr>
+                    <w:t xml:space="preserve">, </w:t>
+                  </w:r>
+                  <w:hyperlink r:id="rId24" w:history="1">
+                    <w:r>
+                      <w:rPr>
+                        <w:rStyle w:val="Hyperlink"/>
+                        <w:rFonts w:ascii="Calibri Light" w:hAnsi="Calibri Light" w:cs="Calibri Light"/>
+                        <w:snapToGrid w:val="0"/>
+                      </w:rPr>
+                      <w:t>mbiineron@gmail.com</w:t>
+                    </w:r>
+                  </w:hyperlink>
+                  <w:r>
+                    <w:rPr>
+                      <w:rFonts w:ascii="Calibri Light" w:hAnsi="Calibri Light" w:cs="Calibri Light"/>
+                      <w:snapToGrid w:val="0"/>
+                    </w:rPr>
+                    <w:t xml:space="preserve"> </w:t>
+                  </w:r>
                 </w:p>
               </w:tc>
             </w:tr>
@@ -2031,6 +2398,15 @@
                       <w:snapToGrid w:val="0"/>
                     </w:rPr>
                   </w:pPr>
+                  <w:r>
+                    <w:rPr>
+                      <w:rFonts w:ascii="Corbel" w:hAnsi="Corbel"/>
+                      <w:bCs/>
+                      <w:sz w:val="20"/>
+                      <w:szCs w:val="20"/>
+                    </w:rPr>
+                    <w:t>(Makerere School of Surgery)</w:t>
+                  </w:r>
                 </w:p>
               </w:tc>
             </w:tr>
@@ -2203,27 +2579,257 @@
           </w:tcPr>
           <w:p>
             <w:pPr>
-              <w:pStyle w:val="BodyText"/>
-              <w:rPr>
-                <w:rStyle w:val="apple-style-span"/>
-                <w:rFonts w:ascii="Calibri Light" w:hAnsi="Calibri Light" w:cs="Calibri Light"/>
-                <w:color w:val="2B3244"/>
-                <w:sz w:val="24"/>
-                <w:szCs w:val="24"/>
-                <w:shd w:val="clear" w:color="auto" w:fill="FFFFFF"/>
+              <w:spacing w:before="60" w:after="60"/>
+              <w:rPr>
+                <w:rFonts w:ascii="Corbel" w:hAnsi="Corbel"/>
+                <w:sz w:val="20"/>
+                <w:szCs w:val="20"/>
               </w:rPr>
             </w:pPr>
             <w:r>
               <w:rPr>
-                <w:rStyle w:val="apple-style-span"/>
-                <w:rFonts w:ascii="Calibri Light" w:hAnsi="Calibri Light" w:cs="Calibri Light"/>
-                <w:color w:val="2B3244"/>
-                <w:sz w:val="24"/>
-                <w:szCs w:val="24"/>
-                <w:shd w:val="clear" w:color="auto" w:fill="FFFFFF"/>
-              </w:rPr>
-              <w:t xml:space="preserve">Please tell us, in 500 words or less, exactly what your book will be about and why we should consider it for publication (for example, fills a gap, hot topic, documents latest research). </w:t>
-            </w:r>
+                <w:rFonts w:ascii="Corbel" w:hAnsi="Corbel"/>
+                <w:sz w:val="20"/>
+                <w:szCs w:val="20"/>
+              </w:rPr>
+              <w:t>It is a</w:t>
+            </w:r>
+            <w:r>
+              <w:rPr>
+                <w:rFonts w:ascii="Corbel" w:hAnsi="Corbel"/>
+                <w:sz w:val="20"/>
+                <w:szCs w:val="20"/>
+              </w:rPr>
+              <w:t xml:space="preserve"> mini-treatise on the mathematics, philosophy and practice</w:t>
+            </w:r>
+            <w:r>
+              <w:rPr>
+                <w:rFonts w:ascii="Corbel" w:hAnsi="Corbel"/>
+                <w:sz w:val="20"/>
+                <w:szCs w:val="20"/>
+              </w:rPr>
+              <w:t xml:space="preserve"> </w:t>
+            </w:r>
+            <w:r>
+              <w:rPr>
+                <w:rFonts w:ascii="Corbel" w:hAnsi="Corbel"/>
+                <w:sz w:val="20"/>
+                <w:szCs w:val="20"/>
+              </w:rPr>
+              <w:t xml:space="preserve">of </w:t>
+            </w:r>
+            <w:proofErr w:type="spellStart"/>
+            <w:r>
+              <w:rPr>
+                <w:rFonts w:ascii="Corbel" w:hAnsi="Corbel"/>
+                <w:sz w:val="20"/>
+                <w:szCs w:val="20"/>
+              </w:rPr>
+              <w:t>Transformatics</w:t>
+            </w:r>
+            <w:proofErr w:type="spellEnd"/>
+            <w:r>
+              <w:rPr>
+                <w:rFonts w:ascii="Corbel" w:hAnsi="Corbel"/>
+                <w:sz w:val="20"/>
+                <w:szCs w:val="20"/>
+              </w:rPr>
+              <w:t xml:space="preserve"> for Geneticists.</w:t>
+            </w:r>
+            <w:r>
+              <w:rPr>
+                <w:rFonts w:ascii="Corbel" w:hAnsi="Corbel"/>
+                <w:sz w:val="20"/>
+                <w:szCs w:val="20"/>
+              </w:rPr>
+              <w:t xml:space="preserve"> The book</w:t>
+            </w:r>
+            <w:r>
+              <w:rPr>
+                <w:rFonts w:ascii="Corbel" w:hAnsi="Corbel"/>
+                <w:sz w:val="20"/>
+                <w:szCs w:val="20"/>
+              </w:rPr>
+              <w:t xml:space="preserve"> explores how ordered sequences of symbols—such as DNA—can be</w:t>
+            </w:r>
+            <w:r>
+              <w:rPr>
+                <w:rFonts w:ascii="Corbel" w:hAnsi="Corbel"/>
+                <w:sz w:val="20"/>
+                <w:szCs w:val="20"/>
+              </w:rPr>
+              <w:t xml:space="preserve"> </w:t>
+            </w:r>
+            <w:r>
+              <w:rPr>
+                <w:rFonts w:ascii="Corbel" w:hAnsi="Corbel"/>
+                <w:sz w:val="20"/>
+                <w:szCs w:val="20"/>
+              </w:rPr>
+              <w:t xml:space="preserve">rigorously </w:t>
+            </w:r>
+            <w:proofErr w:type="spellStart"/>
+            <w:r>
+              <w:rPr>
+                <w:rFonts w:ascii="Corbel" w:hAnsi="Corbel"/>
+                <w:sz w:val="20"/>
+                <w:szCs w:val="20"/>
+              </w:rPr>
+              <w:t>analysed</w:t>
+            </w:r>
+            <w:proofErr w:type="spellEnd"/>
+            <w:r>
+              <w:rPr>
+                <w:rFonts w:ascii="Corbel" w:hAnsi="Corbel"/>
+                <w:sz w:val="20"/>
+                <w:szCs w:val="20"/>
+              </w:rPr>
+              <w:t xml:space="preserve"> and transformed using abstract symbolic machines known as</w:t>
+            </w:r>
+            <w:r>
+              <w:rPr>
+                <w:rFonts w:ascii="Corbel" w:hAnsi="Corbel"/>
+                <w:sz w:val="20"/>
+                <w:szCs w:val="20"/>
+              </w:rPr>
+              <w:t xml:space="preserve"> </w:t>
+            </w:r>
+            <w:r>
+              <w:rPr>
+                <w:rFonts w:ascii="Corbel" w:hAnsi="Corbel"/>
+                <w:sz w:val="20"/>
+                <w:szCs w:val="20"/>
+              </w:rPr>
+              <w:t>sequence transformers.</w:t>
+            </w:r>
+          </w:p>
+          <w:p>
+            <w:pPr>
+              <w:spacing w:before="60" w:after="60"/>
+              <w:rPr>
+                <w:rFonts w:ascii="Corbel" w:hAnsi="Corbel"/>
+                <w:sz w:val="20"/>
+                <w:szCs w:val="20"/>
+              </w:rPr>
+            </w:pPr>
+          </w:p>
+          <w:p>
+            <w:pPr>
+              <w:spacing w:before="60" w:after="60"/>
+              <w:rPr>
+                <w:rFonts w:ascii="Corbel" w:hAnsi="Corbel"/>
+                <w:sz w:val="20"/>
+                <w:szCs w:val="20"/>
+              </w:rPr>
+            </w:pPr>
+            <w:proofErr w:type="gramStart"/>
+            <w:r>
+              <w:rPr>
+                <w:rFonts w:ascii="Corbel" w:hAnsi="Corbel"/>
+                <w:sz w:val="20"/>
+                <w:szCs w:val="20"/>
+              </w:rPr>
+              <w:t xml:space="preserve">The key purpose of writing this book is to bring to the forefront the potential advantages of revisiting genetics and several concepts in the biological sciences, using the newly, and only-recently formalized techniques, ideas and methodologies of </w:t>
+            </w:r>
+            <w:proofErr w:type="spellStart"/>
+            <w:r>
+              <w:rPr>
+                <w:rFonts w:ascii="Corbel" w:hAnsi="Corbel"/>
+                <w:sz w:val="20"/>
+                <w:szCs w:val="20"/>
+              </w:rPr>
+              <w:t>Transformatics</w:t>
+            </w:r>
+            <w:proofErr w:type="spellEnd"/>
+            <w:r>
+              <w:rPr>
+                <w:rFonts w:ascii="Corbel" w:hAnsi="Corbel"/>
+                <w:sz w:val="20"/>
+                <w:szCs w:val="20"/>
+              </w:rPr>
+              <w:t xml:space="preserve"> independently of whatever other proven and or unproven earlier theory and mathematics there might be treating of the matter of sequence transformations, processing and analysis as applied to genetic code.</w:t>
+            </w:r>
+            <w:proofErr w:type="gramEnd"/>
+            <w:r>
+              <w:rPr>
+                <w:rFonts w:ascii="Corbel" w:hAnsi="Corbel"/>
+                <w:sz w:val="20"/>
+                <w:szCs w:val="20"/>
+              </w:rPr>
+              <w:t xml:space="preserve"> It is relevant, because, until this work, either the mathematical concepts put forward, or their application to problems in Genetics hadn’t been formally treated of yet, and specifically, not using the straightforward, basic language and notions of </w:t>
+            </w:r>
+            <w:proofErr w:type="spellStart"/>
+            <w:r>
+              <w:rPr>
+                <w:rFonts w:ascii="Corbel" w:hAnsi="Corbel"/>
+                <w:sz w:val="20"/>
+                <w:szCs w:val="20"/>
+              </w:rPr>
+              <w:t>Transformatics</w:t>
+            </w:r>
+            <w:proofErr w:type="spellEnd"/>
+            <w:r>
+              <w:rPr>
+                <w:rFonts w:ascii="Corbel" w:hAnsi="Corbel"/>
+                <w:sz w:val="20"/>
+                <w:szCs w:val="20"/>
+              </w:rPr>
+              <w:t>.</w:t>
+            </w:r>
+          </w:p>
+          <w:p>
+            <w:pPr>
+              <w:spacing w:before="60" w:after="60"/>
+              <w:rPr>
+                <w:rFonts w:ascii="Corbel" w:hAnsi="Corbel"/>
+                <w:sz w:val="20"/>
+                <w:szCs w:val="20"/>
+              </w:rPr>
+            </w:pPr>
+          </w:p>
+          <w:p>
+            <w:pPr>
+              <w:rPr>
+                <w:rFonts w:ascii="Corbel" w:hAnsi="Corbel"/>
+                <w:sz w:val="20"/>
+                <w:szCs w:val="20"/>
+              </w:rPr>
+            </w:pPr>
+            <w:r>
+              <w:rPr>
+                <w:rFonts w:ascii="Corbel" w:hAnsi="Corbel"/>
+                <w:sz w:val="20"/>
+                <w:szCs w:val="20"/>
+              </w:rPr>
+              <w:t xml:space="preserve">The book equips a reader with prior knowledge of genetics with new lens and methods with which to revisit old and new problems in genetics. For those without prior knowledge in genetics, the book offers a compelling and simple introduction into the theory of genetics, and builds upon that to spur anyone’s interest in intermediate and advanced concepts and problems in genetics and bioinformatics, especially using the basic mathematics of </w:t>
+            </w:r>
+            <w:proofErr w:type="spellStart"/>
+            <w:r>
+              <w:rPr>
+                <w:rFonts w:ascii="Corbel" w:hAnsi="Corbel"/>
+                <w:sz w:val="20"/>
+                <w:szCs w:val="20"/>
+              </w:rPr>
+              <w:t>Transformatics</w:t>
+            </w:r>
+            <w:proofErr w:type="spellEnd"/>
+            <w:r>
+              <w:rPr>
+                <w:rFonts w:ascii="Corbel" w:hAnsi="Corbel"/>
+                <w:sz w:val="20"/>
+                <w:szCs w:val="20"/>
+              </w:rPr>
+              <w:t>.</w:t>
+            </w:r>
+          </w:p>
+          <w:p>
+            <w:pPr>
+              <w:rPr>
+                <w:rFonts w:ascii="Corbel" w:hAnsi="Corbel"/>
+                <w:sz w:val="20"/>
+                <w:szCs w:val="20"/>
+              </w:rPr>
+            </w:pPr>
           </w:p>
           <w:p>
             <w:pPr>
@@ -2255,75 +2861,61 @@
                 <w:szCs w:val="24"/>
               </w:rPr>
             </w:pPr>
+            <w:proofErr w:type="gramStart"/>
             <w:r>
               <w:rPr>
                 <w:rFonts w:ascii="Calibri Light" w:hAnsi="Calibri Light" w:cs="Calibri Light"/>
                 <w:sz w:val="24"/>
                 <w:szCs w:val="24"/>
               </w:rPr>
-              <w:t>Your target audience is from which discipline or industry?  Ple</w:t>
-            </w:r>
+              <w:t>Your target audience is from which discipline or industry?</w:t>
+            </w:r>
+            <w:proofErr w:type="gramEnd"/>
             <w:r>
               <w:rPr>
                 <w:rFonts w:ascii="Calibri Light" w:hAnsi="Calibri Light" w:cs="Calibri Light"/>
                 <w:sz w:val="24"/>
                 <w:szCs w:val="24"/>
               </w:rPr>
-              <w:t xml:space="preserve">ase be specific </w:t>
+              <w:t xml:space="preserve">  </w:t>
+            </w:r>
+            <w:r>
+              <w:rPr>
+                <w:rFonts w:ascii="Corbel" w:hAnsi="Corbel"/>
+                <w:b/>
+                <w:sz w:val="20"/>
+                <w:szCs w:val="20"/>
+              </w:rPr>
+              <w:t xml:space="preserve">Geneticists, Molecular Biologists, </w:t>
             </w:r>
             <w:proofErr w:type="spellStart"/>
             <w:r>
               <w:rPr>
-                <w:rFonts w:ascii="Calibri Light" w:hAnsi="Calibri Light" w:cs="Calibri Light"/>
-                <w:sz w:val="24"/>
-                <w:szCs w:val="24"/>
-              </w:rPr>
-              <w:t>eg</w:t>
+                <w:rFonts w:ascii="Corbel" w:hAnsi="Corbel"/>
+                <w:b/>
+                <w:sz w:val="20"/>
+                <w:szCs w:val="20"/>
+              </w:rPr>
+              <w:t>Bioinformaticians</w:t>
             </w:r>
             <w:proofErr w:type="spellEnd"/>
             <w:r>
               <w:rPr>
-                <w:rFonts w:ascii="Calibri Light" w:hAnsi="Calibri Light" w:cs="Calibri Light"/>
-                <w:sz w:val="24"/>
-                <w:szCs w:val="24"/>
+                <w:rFonts w:ascii="Corbel" w:hAnsi="Corbel"/>
+                <w:b/>
+                <w:sz w:val="20"/>
+                <w:szCs w:val="20"/>
+              </w:rPr>
+              <w:t>, Computer Scientists and Mathematicians (especially Statisticians).</w:t>
+            </w:r>
+            <w:r>
+              <w:rPr>
+                <w:rFonts w:ascii="Corbel" w:hAnsi="Corbel"/>
+                <w:sz w:val="20"/>
+                <w:szCs w:val="20"/>
               </w:rPr>
               <w:t xml:space="preserve"> </w:t>
             </w:r>
-            <w:r>
-              <w:rPr>
-                <w:rFonts w:ascii="Calibri Light" w:hAnsi="Calibri Light" w:cs="Calibri Light"/>
-                <w:sz w:val="24"/>
-                <w:szCs w:val="24"/>
-                <w:u w:val="single"/>
-              </w:rPr>
-              <w:t>not</w:t>
-            </w:r>
-            <w:r>
-              <w:rPr>
-                <w:rFonts w:ascii="Calibri Light" w:hAnsi="Calibri Light" w:cs="Calibri Light"/>
-                <w:sz w:val="24"/>
-                <w:szCs w:val="24"/>
-              </w:rPr>
-              <w:t xml:space="preserve"> </w:t>
-            </w:r>
-            <w:r>
-              <w:rPr>
-                <w:rFonts w:ascii="Calibri Light" w:hAnsi="Calibri Light" w:cs="Calibri Light"/>
-                <w:sz w:val="24"/>
-                <w:szCs w:val="24"/>
-              </w:rPr>
-              <w:t>“Biology” or “Chemistry”, but “Molecular Biology” or “Polymer Chemistry” etc.</w:t>
-            </w:r>
-          </w:p>
-          <w:p>
-            <w:pPr>
-              <w:pStyle w:val="BodyText"/>
-              <w:rPr>
-                <w:rFonts w:ascii="Calibri Light" w:hAnsi="Calibri Light" w:cs="Calibri Light"/>
-                <w:sz w:val="24"/>
-                <w:szCs w:val="24"/>
-              </w:rPr>
-            </w:pPr>
           </w:p>
         </w:tc>
       </w:tr>
@@ -2344,6 +2936,7 @@
               <w:pStyle w:val="BodyText"/>
               <w:rPr>
                 <w:rFonts w:ascii="Calibri Light" w:hAnsi="Calibri Light" w:cs="Calibri Light"/>
+                <w:b/>
                 <w:sz w:val="24"/>
                 <w:szCs w:val="24"/>
               </w:rPr>
@@ -2356,6 +2949,61 @@
               </w:rPr>
               <w:lastRenderedPageBreak/>
               <w:t xml:space="preserve">Please provide a short statement telling us the subject and special features of your book – this will sum up your book in a paragraph or a line (for Non-specialists): </w:t>
+            </w:r>
+            <w:r>
+              <w:rPr>
+                <w:rFonts w:ascii="Calibri Light" w:hAnsi="Calibri Light" w:cs="Calibri Light"/>
+                <w:sz w:val="24"/>
+                <w:szCs w:val="24"/>
+              </w:rPr>
+              <w:t xml:space="preserve"> </w:t>
+            </w:r>
+            <w:r>
+              <w:rPr>
+                <w:rFonts w:ascii="Calibri Light" w:hAnsi="Calibri Light" w:cs="Calibri Light"/>
+                <w:b/>
+                <w:sz w:val="24"/>
+                <w:szCs w:val="24"/>
+              </w:rPr>
+              <w:t>A mini-treatise on the mathematics, philosophy and practice</w:t>
+            </w:r>
+            <w:r>
+              <w:rPr>
+                <w:rFonts w:ascii="Calibri Light" w:hAnsi="Calibri Light" w:cs="Calibri Light"/>
+                <w:b/>
+                <w:sz w:val="24"/>
+                <w:szCs w:val="24"/>
+              </w:rPr>
+              <w:t xml:space="preserve"> </w:t>
+            </w:r>
+            <w:r>
+              <w:rPr>
+                <w:rFonts w:ascii="Calibri Light" w:hAnsi="Calibri Light" w:cs="Calibri Light"/>
+                <w:b/>
+                <w:sz w:val="24"/>
+                <w:szCs w:val="24"/>
+              </w:rPr>
+              <w:t xml:space="preserve">of </w:t>
+            </w:r>
+            <w:proofErr w:type="spellStart"/>
+            <w:r>
+              <w:rPr>
+                <w:rFonts w:ascii="Calibri Light" w:hAnsi="Calibri Light" w:cs="Calibri Light"/>
+                <w:b/>
+                <w:sz w:val="24"/>
+                <w:szCs w:val="24"/>
+              </w:rPr>
+              <w:t>Transformatics</w:t>
+            </w:r>
+            <w:proofErr w:type="spellEnd"/>
+            <w:r>
+              <w:rPr>
+                <w:rFonts w:ascii="Calibri Light" w:hAnsi="Calibri Light" w:cs="Calibri Light"/>
+                <w:b/>
+                <w:sz w:val="24"/>
+                <w:szCs w:val="24"/>
+              </w:rPr>
+              <w:t xml:space="preserve"> for Geneticists.</w:t>
             </w:r>
           </w:p>
           <w:p>
@@ -2459,6 +3107,15 @@
                       <w:szCs w:val="24"/>
                     </w:rPr>
                   </w:pPr>
+                  <w:r>
+                    <w:rPr>
+                      <w:rFonts w:ascii="Calibri Light" w:hAnsi="Calibri Light" w:cs="Calibri Light"/>
+                      <w:snapToGrid w:val="0"/>
+                      <w:sz w:val="24"/>
+                      <w:szCs w:val="24"/>
+                    </w:rPr>
+                    <w:t>X</w:t>
+                  </w:r>
                 </w:p>
               </w:tc>
             </w:tr>
@@ -2509,6 +3166,15 @@
                       <w:szCs w:val="24"/>
                     </w:rPr>
                   </w:pPr>
+                  <w:r>
+                    <w:rPr>
+                      <w:rFonts w:ascii="Calibri Light" w:hAnsi="Calibri Light" w:cs="Calibri Light"/>
+                      <w:snapToGrid w:val="0"/>
+                      <w:sz w:val="24"/>
+                      <w:szCs w:val="24"/>
+                    </w:rPr>
+                    <w:t>X</w:t>
+                  </w:r>
                 </w:p>
               </w:tc>
             </w:tr>
@@ -2561,7 +3227,6 @@
                 </w:tcPr>
                 <w:p>
                   <w:pPr>
-                    <w:jc w:val="center"/>
                     <w:cnfStyle w:val="000000000000" w:firstRow="0" w:lastRow="0" w:firstColumn="0" w:lastColumn="0" w:oddVBand="0" w:evenVBand="0" w:oddHBand="0" w:evenHBand="0" w:firstRowFirstColumn="0" w:firstRowLastColumn="0" w:lastRowFirstColumn="0" w:lastRowLastColumn="0"/>
                     <w:rPr>
                       <w:rFonts w:ascii="Calibri Light" w:eastAsiaTheme="minorEastAsia" w:hAnsi="Calibri Light" w:cs="Calibri Light"/>
@@ -2570,6 +3235,15 @@
                       <w:lang w:eastAsia="zh-CN"/>
                     </w:rPr>
                   </w:pPr>
+                  <w:r>
+                    <w:rPr>
+                      <w:rFonts w:ascii="Calibri Light" w:eastAsiaTheme="minorEastAsia" w:hAnsi="Calibri Light" w:cs="Calibri Light"/>
+                      <w:sz w:val="24"/>
+                      <w:szCs w:val="24"/>
+                      <w:lang w:eastAsia="zh-CN"/>
+                    </w:rPr>
+                    <w:t>X</w:t>
+                  </w:r>
                 </w:p>
               </w:tc>
             </w:tr>
@@ -2812,7 +3486,25 @@
                 <w:b/>
                 <w:snapToGrid w:val="0"/>
               </w:rPr>
-              <w:t>List at least five (5) specific selling features of your book.  Because of these features, the reader will want to purchase your book – list as many as you can that will actually influence our customers to purchase your book over the competition.</w:t>
+              <w:t xml:space="preserve">List at least five (5) specific selling features of your book.  Because of these features, the reader will want to purchase your book – </w:t>
+            </w:r>
+            <w:proofErr w:type="gramStart"/>
+            <w:r>
+              <w:rPr>
+                <w:rFonts w:ascii="Calibri Light" w:hAnsi="Calibri Light" w:cs="Calibri Light"/>
+                <w:b/>
+                <w:snapToGrid w:val="0"/>
+              </w:rPr>
+              <w:t>list</w:t>
+            </w:r>
+            <w:proofErr w:type="gramEnd"/>
+            <w:r>
+              <w:rPr>
+                <w:rFonts w:ascii="Calibri Light" w:hAnsi="Calibri Light" w:cs="Calibri Light"/>
+                <w:b/>
+                <w:snapToGrid w:val="0"/>
+              </w:rPr>
+              <w:t xml:space="preserve"> as many as you can that will actually influence our customers to purchase your book over the competition.</w:t>
             </w:r>
           </w:p>
           <w:p>
@@ -2866,6 +3558,13 @@
                     </w:rPr>
                     <w:t xml:space="preserve"> </w:t>
                   </w:r>
+                  <w:r>
+                    <w:rPr>
+                      <w:rFonts w:ascii="Calibri Light" w:hAnsi="Calibri Light" w:cs="Calibri Light"/>
+                      <w:snapToGrid w:val="0"/>
+                    </w:rPr>
+                    <w:t>Gradual Development of All Core Concepts – always from basics first, to advanced cases and concepts, this, well utilized all across the book.</w:t>
+                  </w:r>
                 </w:p>
               </w:tc>
             </w:tr>
@@ -2889,6 +3588,29 @@
                     </w:rPr>
                     <w:t xml:space="preserve">2)  </w:t>
                   </w:r>
+                  <w:r>
+                    <w:rPr>
+                      <w:rFonts w:ascii="Calibri Light" w:hAnsi="Calibri Light" w:cs="Calibri Light"/>
+                      <w:snapToGrid w:val="0"/>
+                    </w:rPr>
+                    <w:t xml:space="preserve">Well-Illustrated – the book has significant use of illustrations (diagrams, pictures, figures, </w:t>
+                  </w:r>
+                  <w:proofErr w:type="spellStart"/>
+                  <w:r>
+                    <w:rPr>
+                      <w:rFonts w:ascii="Calibri Light" w:hAnsi="Calibri Light" w:cs="Calibri Light"/>
+                      <w:snapToGrid w:val="0"/>
+                    </w:rPr>
+                    <w:t>etc</w:t>
+                  </w:r>
+                  <w:proofErr w:type="spellEnd"/>
+                  <w:r>
+                    <w:rPr>
+                      <w:rFonts w:ascii="Calibri Light" w:hAnsi="Calibri Light" w:cs="Calibri Light"/>
+                      <w:snapToGrid w:val="0"/>
+                    </w:rPr>
+                    <w:t>) to help offer both a conceptual and pictorial depiction of important concepts throughout the text.</w:t>
+                  </w:r>
                 </w:p>
               </w:tc>
             </w:tr>
@@ -2915,6 +3637,32 @@
                     </w:rPr>
                     <w:t xml:space="preserve">3)  </w:t>
                   </w:r>
+                  <w:r>
+                    <w:rPr>
+                      <w:rFonts w:ascii="Calibri Light" w:hAnsi="Calibri Light" w:cs="Calibri Light"/>
+                      <w:bCs/>
+                      <w:snapToGrid w:val="0"/>
+                    </w:rPr>
+                    <w:t xml:space="preserve">Very Navigable – the book is well structured, with a clear Table of Contents, List of Figures, List of Tables, List of Abbreviations, How to Navigate Book section, and an extensive use of </w:t>
+                  </w:r>
+                  <w:proofErr w:type="spellStart"/>
+                  <w:r>
+                    <w:rPr>
+                      <w:rFonts w:ascii="Calibri Light" w:hAnsi="Calibri Light" w:cs="Calibri Light"/>
+                      <w:bCs/>
+                      <w:snapToGrid w:val="0"/>
+                    </w:rPr>
+                    <w:t>well structured</w:t>
+                  </w:r>
+                  <w:proofErr w:type="spellEnd"/>
+                  <w:r>
+                    <w:rPr>
+                      <w:rFonts w:ascii="Calibri Light" w:hAnsi="Calibri Light" w:cs="Calibri Light"/>
+                      <w:bCs/>
+                      <w:snapToGrid w:val="0"/>
+                    </w:rPr>
+                    <w:t xml:space="preserve"> cross-references that make it easy for the reader to identify and locate important theorems, definitions, transformers, transformations, code listings, etc.</w:t>
+                  </w:r>
                 </w:p>
               </w:tc>
             </w:tr>
@@ -2938,6 +3686,29 @@
                     </w:rPr>
                     <w:t xml:space="preserve">4)  </w:t>
                   </w:r>
+                  <w:r>
+                    <w:rPr>
+                      <w:rFonts w:ascii="Calibri Light" w:hAnsi="Calibri Light" w:cs="Calibri Light"/>
+                      <w:snapToGrid w:val="0"/>
+                    </w:rPr>
+                    <w:t xml:space="preserve">Original Content – especially the mathematical treatment of Genetics given in this book </w:t>
+                  </w:r>
+                  <w:proofErr w:type="gramStart"/>
+                  <w:r>
+                    <w:rPr>
+                      <w:rFonts w:ascii="Calibri Light" w:hAnsi="Calibri Light" w:cs="Calibri Light"/>
+                      <w:snapToGrid w:val="0"/>
+                    </w:rPr>
+                    <w:t>hasn’t</w:t>
+                  </w:r>
+                  <w:proofErr w:type="gramEnd"/>
+                  <w:r>
+                    <w:rPr>
+                      <w:rFonts w:ascii="Calibri Light" w:hAnsi="Calibri Light" w:cs="Calibri Light"/>
+                      <w:snapToGrid w:val="0"/>
+                    </w:rPr>
+                    <w:t xml:space="preserve"> been presented anywhere else before.</w:t>
+                  </w:r>
                 </w:p>
               </w:tc>
             </w:tr>
@@ -2960,6 +3731,13 @@
                       <w:snapToGrid w:val="0"/>
                     </w:rPr>
                     <w:t xml:space="preserve">5)  </w:t>
+                  </w:r>
+                  <w:r>
+                    <w:rPr>
+                      <w:rFonts w:ascii="Calibri Light" w:hAnsi="Calibri Light" w:cs="Calibri Light"/>
+                      <w:snapToGrid w:val="0"/>
+                    </w:rPr>
+                    <w:t>Holistic – despite the core subject being genetics, the book has many notes and expository discussions about concepts in genetics and the introduced mathematics that touch on computing, philosophy, culture and art.</w:t>
                   </w:r>
                 </w:p>
               </w:tc>
@@ -3086,9 +3864,29 @@
           <w:sz w:val="24"/>
           <w:szCs w:val="24"/>
         </w:rPr>
-        <w:t xml:space="preserve">, supplying as much information as possible.  Competition can be found on </w:t>
+        <w:t xml:space="preserve">, supplying as much information as possible.  Competition </w:t>
       </w:r>
-      <w:hyperlink r:id="rId19" w:history="1">
+      <w:proofErr w:type="gramStart"/>
+      <w:r>
+        <w:rPr>
+          <w:rFonts w:ascii="Calibri Light" w:hAnsi="Calibri Light" w:cs="Calibri Light"/>
+          <w:snapToGrid w:val="0"/>
+          <w:sz w:val="24"/>
+          <w:szCs w:val="24"/>
+        </w:rPr>
+        <w:t>can be found</w:t>
+      </w:r>
+      <w:proofErr w:type="gramEnd"/>
+      <w:r>
+        <w:rPr>
+          <w:rFonts w:ascii="Calibri Light" w:hAnsi="Calibri Light" w:cs="Calibri Light"/>
+          <w:snapToGrid w:val="0"/>
+          <w:sz w:val="24"/>
+          <w:szCs w:val="24"/>
+        </w:rPr>
+        <w:t xml:space="preserve"> on </w:t>
+      </w:r>
+      <w:hyperlink r:id="rId25" w:history="1">
         <w:r>
           <w:rPr>
             <w:rStyle w:val="Hyperlink"/>
@@ -3151,6 +3949,7 @@
               <w:rPr>
                 <w:rFonts w:ascii="Calibri Light" w:hAnsi="Calibri Light" w:cs="Calibri Light"/>
               </w:rPr>
+              <w:lastRenderedPageBreak/>
               <w:t>Competitive Title #1</w:t>
             </w:r>
           </w:p>
@@ -4227,6 +5026,7 @@
             <w:pPr>
               <w:rPr>
                 <w:rFonts w:ascii="Calibri Light" w:hAnsi="Calibri Light" w:cs="Calibri Light"/>
+                <w:b/>
                 <w:sz w:val="24"/>
                 <w:szCs w:val="24"/>
               </w:rPr>
@@ -4236,6 +5036,54 @@
             <w:pPr>
               <w:rPr>
                 <w:rFonts w:ascii="Calibri Light" w:hAnsi="Calibri Light" w:cs="Calibri Light"/>
+                <w:b/>
+                <w:sz w:val="24"/>
+                <w:szCs w:val="24"/>
+              </w:rPr>
+            </w:pPr>
+            <w:r>
+              <w:rPr>
+                <w:rFonts w:ascii="Calibri Light" w:hAnsi="Calibri Light" w:cs="Calibri Light"/>
+                <w:b/>
+                <w:sz w:val="24"/>
+                <w:szCs w:val="24"/>
+              </w:rPr>
+              <w:t xml:space="preserve">AS OF THIS WRITING, THE MANUSCRIPT IS READY. </w:t>
+            </w:r>
+            <w:proofErr w:type="gramStart"/>
+            <w:r>
+              <w:rPr>
+                <w:rFonts w:ascii="Calibri Light" w:hAnsi="Calibri Light" w:cs="Calibri Light"/>
+                <w:b/>
+                <w:sz w:val="24"/>
+                <w:szCs w:val="24"/>
+              </w:rPr>
+              <w:t>BASICALLY, I</w:t>
+            </w:r>
+            <w:proofErr w:type="gramEnd"/>
+            <w:r>
+              <w:rPr>
+                <w:rFonts w:ascii="Calibri Light" w:hAnsi="Calibri Light" w:cs="Calibri Light"/>
+                <w:b/>
+                <w:sz w:val="24"/>
+                <w:szCs w:val="24"/>
+              </w:rPr>
+              <w:t xml:space="preserve"> HAVE A COMPLETE BOOK DRAFT READY TO REVIEW.</w:t>
+            </w:r>
+          </w:p>
+          <w:p>
+            <w:pPr>
+              <w:rPr>
+                <w:rFonts w:ascii="Calibri Light" w:hAnsi="Calibri Light" w:cs="Calibri Light"/>
+                <w:sz w:val="24"/>
+                <w:szCs w:val="24"/>
+              </w:rPr>
+            </w:pPr>
+          </w:p>
+          <w:p>
+            <w:pPr>
+              <w:rPr>
+                <w:rFonts w:ascii="Calibri Light" w:hAnsi="Calibri Light" w:cs="Calibri Light"/>
                 <w:sz w:val="24"/>
                 <w:szCs w:val="24"/>
               </w:rPr>
@@ -4255,7 +5103,16 @@
                 <w:sz w:val="24"/>
                 <w:szCs w:val="24"/>
               </w:rPr>
-              <w:t>: The average book takes about six full months to publish (sometimes a bit longer depending on size or complexity).  If you are writing a textbook, your manuscript and solutions manual should be completed and submitted before April 15</w:t>
+              <w:t xml:space="preserve">: The average book takes about six full months to publish (sometimes a bit longer depending on size or complexity).  If you are writing a textbook, your manuscript and </w:t>
+            </w:r>
+            <w:r>
+              <w:rPr>
+                <w:rFonts w:ascii="Calibri Light" w:hAnsi="Calibri Light" w:cs="Calibri Light"/>
+                <w:sz w:val="24"/>
+                <w:szCs w:val="24"/>
+              </w:rPr>
+              <w:lastRenderedPageBreak/>
+              <w:t>solutions manual should be completed and submitted before April 15</w:t>
             </w:r>
             <w:r>
               <w:rPr>
@@ -4320,7 +5177,27 @@
                 <w:sz w:val="24"/>
                 <w:szCs w:val="24"/>
               </w:rPr>
-              <w:t>What program will you prepare your text in? Please indicate below with an (X) below:</w:t>
+              <w:t xml:space="preserve">What program will you prepare your text </w:t>
+            </w:r>
+            <w:proofErr w:type="gramStart"/>
+            <w:r>
+              <w:rPr>
+                <w:rFonts w:ascii="Calibri Light" w:hAnsi="Calibri Light" w:cs="Calibri Light"/>
+                <w:b/>
+                <w:sz w:val="24"/>
+                <w:szCs w:val="24"/>
+              </w:rPr>
+              <w:t>in</w:t>
+            </w:r>
+            <w:proofErr w:type="gramEnd"/>
+            <w:r>
+              <w:rPr>
+                <w:rFonts w:ascii="Calibri Light" w:hAnsi="Calibri Light" w:cs="Calibri Light"/>
+                <w:b/>
+                <w:sz w:val="24"/>
+                <w:szCs w:val="24"/>
+              </w:rPr>
+              <w:t>? Please indicate below with an (X) below:</w:t>
             </w:r>
           </w:p>
           <w:tbl>
@@ -4606,7 +5483,6 @@
                       <w:sz w:val="24"/>
                       <w:szCs w:val="24"/>
                     </w:rPr>
-                    <w:lastRenderedPageBreak/>
                     <w:t>Latex Hybrid</w:t>
                   </w:r>
                 </w:p>
@@ -4648,7 +5524,7 @@
                       <w:sz w:val="24"/>
                       <w:szCs w:val="24"/>
                     </w:rPr>
-                    <w:t>The Author shall provide application files in Latex but is not responsible for embedding fonts or incorporating changes to the manuscript, after CRC Press proofreads.  Final pages are handled by CRC.</w:t>
+                    <w:t>X</w:t>
                   </w:r>
                 </w:p>
               </w:tc>
@@ -4788,10 +5664,21 @@
               <w:rPr>
                 <w:rFonts w:ascii="Calibri Light" w:hAnsi="Calibri Light" w:cs="Calibri Light"/>
                 <w:b/>
+                <w:color w:val="E36C0A" w:themeColor="accent6" w:themeShade="BF"/>
                 <w:sz w:val="24"/>
                 <w:szCs w:val="24"/>
               </w:rPr>
             </w:pPr>
+            <w:r>
+              <w:rPr>
+                <w:rFonts w:ascii="Calibri Light" w:hAnsi="Calibri Light" w:cs="Calibri Light"/>
+                <w:b/>
+                <w:color w:val="E36C0A" w:themeColor="accent6" w:themeShade="BF"/>
+                <w:sz w:val="24"/>
+                <w:szCs w:val="24"/>
+              </w:rPr>
+              <w:t>Pages likely to lie between 200-300</w:t>
+            </w:r>
           </w:p>
         </w:tc>
       </w:tr>
@@ -5072,6 +5959,15 @@
                       <w:szCs w:val="24"/>
                     </w:rPr>
                   </w:pPr>
+                  <w:r>
+                    <w:rPr>
+                      <w:rFonts w:ascii="Calibri Light" w:hAnsi="Calibri Light" w:cs="Calibri Light"/>
+                      <w:snapToGrid w:val="0"/>
+                      <w:sz w:val="24"/>
+                      <w:szCs w:val="24"/>
+                    </w:rPr>
+                    <w:t>X</w:t>
+                  </w:r>
                 </w:p>
               </w:tc>
             </w:tr>
@@ -5420,15 +6316,6 @@
                       <w:szCs w:val="24"/>
                     </w:rPr>
                   </w:pPr>
-                  <w:r>
-                    <w:rPr>
-                      <w:rFonts w:ascii="Calibri Light" w:hAnsi="Calibri Light" w:cs="Calibri Light"/>
-                      <w:b/>
-                      <w:sz w:val="24"/>
-                      <w:szCs w:val="24"/>
-                    </w:rPr>
-                    <w:t>x</w:t>
-                  </w:r>
                 </w:p>
               </w:tc>
               <w:tc>
@@ -5646,6 +6533,15 @@
                       <w:szCs w:val="24"/>
                     </w:rPr>
                   </w:pPr>
+                  <w:r>
+                    <w:rPr>
+                      <w:rFonts w:ascii="Calibri Light" w:hAnsi="Calibri Light" w:cs="Calibri Light"/>
+                      <w:b/>
+                      <w:sz w:val="24"/>
+                      <w:szCs w:val="24"/>
+                    </w:rPr>
+                    <w:t>X</w:t>
+                  </w:r>
                 </w:p>
               </w:tc>
               <w:tc>
@@ -5745,6 +6641,15 @@
                       <w:szCs w:val="24"/>
                     </w:rPr>
                   </w:pPr>
+                  <w:r>
+                    <w:rPr>
+                      <w:rFonts w:ascii="Calibri Light" w:hAnsi="Calibri Light" w:cs="Calibri Light"/>
+                      <w:b/>
+                      <w:sz w:val="24"/>
+                      <w:szCs w:val="24"/>
+                    </w:rPr>
+                    <w:t>X</w:t>
+                  </w:r>
                 </w:p>
               </w:tc>
               <w:tc>
@@ -6072,6 +6977,7 @@
                 <w:sz w:val="24"/>
                 <w:szCs w:val="24"/>
               </w:rPr>
+              <w:lastRenderedPageBreak/>
               <w:t>What Conferences should we bring your book to?</w:t>
             </w:r>
           </w:p>
@@ -6230,6 +7136,28 @@
                       <w:szCs w:val="24"/>
                     </w:rPr>
                   </w:pPr>
+                  <w:proofErr w:type="spellStart"/>
+                  <w:r>
+                    <w:rPr>
+                      <w:rFonts w:ascii="Corbel" w:hAnsi="Corbel"/>
+                      <w:b w:val="0"/>
+                      <w:bCs w:val="0"/>
+                      <w:sz w:val="20"/>
+                      <w:szCs w:val="20"/>
+                    </w:rPr>
+                    <w:t>Ashg</w:t>
+                  </w:r>
+                  <w:proofErr w:type="spellEnd"/>
+                  <w:r>
+                    <w:rPr>
+                      <w:rFonts w:ascii="Corbel" w:hAnsi="Corbel"/>
+                      <w:b w:val="0"/>
+                      <w:bCs w:val="0"/>
+                      <w:sz w:val="20"/>
+                      <w:szCs w:val="20"/>
+                    </w:rPr>
+                    <w:t xml:space="preserve"> 2025 annual meeting</w:t>
+                  </w:r>
                 </w:p>
               </w:tc>
               <w:tc>
@@ -6248,6 +7176,28 @@
                       <w:szCs w:val="24"/>
                     </w:rPr>
                   </w:pPr>
+                  <w:proofErr w:type="spellStart"/>
+                  <w:r>
+                    <w:rPr>
+                      <w:rFonts w:ascii="Corbel" w:hAnsi="Corbel"/>
+                      <w:b/>
+                      <w:bCs/>
+                      <w:sz w:val="20"/>
+                      <w:szCs w:val="20"/>
+                    </w:rPr>
+                    <w:t>october</w:t>
+                  </w:r>
+                  <w:proofErr w:type="spellEnd"/>
+                  <w:r>
+                    <w:rPr>
+                      <w:rFonts w:ascii="Corbel" w:hAnsi="Corbel"/>
+                      <w:b/>
+                      <w:bCs/>
+                      <w:sz w:val="20"/>
+                      <w:szCs w:val="20"/>
+                    </w:rPr>
+                    <w:t xml:space="preserve"> 14–18, 2025</w:t>
+                  </w:r>
                 </w:p>
               </w:tc>
               <w:tc>
@@ -6265,6 +7215,40 @@
                       <w:szCs w:val="24"/>
                     </w:rPr>
                   </w:pPr>
+                  <w:proofErr w:type="spellStart"/>
+                  <w:r>
+                    <w:rPr>
+                      <w:rFonts w:ascii="Corbel" w:hAnsi="Corbel"/>
+                      <w:b/>
+                      <w:bCs/>
+                      <w:sz w:val="20"/>
+                      <w:szCs w:val="20"/>
+                    </w:rPr>
+                    <w:t>boston</w:t>
+                  </w:r>
+                  <w:proofErr w:type="spellEnd"/>
+                  <w:r>
+                    <w:rPr>
+                      <w:rFonts w:ascii="Corbel" w:hAnsi="Corbel"/>
+                      <w:b/>
+                      <w:bCs/>
+                      <w:sz w:val="20"/>
+                      <w:szCs w:val="20"/>
+                    </w:rPr>
+                    <w:t xml:space="preserve">, </w:t>
+                  </w:r>
+                  <w:proofErr w:type="spellStart"/>
+                  <w:r>
+                    <w:rPr>
+                      <w:rFonts w:ascii="Corbel" w:hAnsi="Corbel"/>
+                      <w:b/>
+                      <w:bCs/>
+                      <w:sz w:val="20"/>
+                      <w:szCs w:val="20"/>
+                    </w:rPr>
+                    <w:t>usa</w:t>
+                  </w:r>
+                  <w:proofErr w:type="spellEnd"/>
                 </w:p>
               </w:tc>
               <w:tc>
@@ -6282,6 +7266,19 @@
                       <w:szCs w:val="24"/>
                     </w:rPr>
                   </w:pPr>
+                  <w:hyperlink r:id="rId26" w:history="1">
+                    <w:r>
+                      <w:rPr>
+                        <w:rStyle w:val="Hyperlink"/>
+                        <w:rFonts w:ascii="Corbel" w:hAnsi="Corbel"/>
+                        <w:b/>
+                        <w:bCs/>
+                        <w:sz w:val="20"/>
+                        <w:szCs w:val="20"/>
+                      </w:rPr>
+                      <w:t>https://www.ashg.org/meetings/2025meeting</w:t>
+                    </w:r>
+                  </w:hyperlink>
                 </w:p>
               </w:tc>
             </w:tr>
@@ -6305,6 +7302,16 @@
                       <w:szCs w:val="24"/>
                     </w:rPr>
                   </w:pPr>
+                  <w:r>
+                    <w:rPr>
+                      <w:rFonts w:ascii="Corbel" w:hAnsi="Corbel"/>
+                      <w:b w:val="0"/>
+                      <w:bCs w:val="0"/>
+                      <w:sz w:val="20"/>
+                      <w:szCs w:val="20"/>
+                    </w:rPr>
+                    <w:t>Genome informatics 2025</w:t>
+                  </w:r>
                 </w:p>
               </w:tc>
               <w:tc>
@@ -6321,6 +7328,28 @@
                       <w:szCs w:val="24"/>
                     </w:rPr>
                   </w:pPr>
+                  <w:proofErr w:type="spellStart"/>
+                  <w:r>
+                    <w:rPr>
+                      <w:rFonts w:ascii="Corbel" w:hAnsi="Corbel"/>
+                      <w:b/>
+                      <w:bCs/>
+                      <w:sz w:val="20"/>
+                      <w:szCs w:val="20"/>
+                    </w:rPr>
+                    <w:t>november</w:t>
+                  </w:r>
+                  <w:proofErr w:type="spellEnd"/>
+                  <w:r>
+                    <w:rPr>
+                      <w:rFonts w:ascii="Corbel" w:hAnsi="Corbel"/>
+                      <w:b/>
+                      <w:bCs/>
+                      <w:sz w:val="20"/>
+                      <w:szCs w:val="20"/>
+                    </w:rPr>
+                    <w:t xml:space="preserve"> 5–8, 2025</w:t>
+                  </w:r>
                 </w:p>
               </w:tc>
               <w:tc>
@@ -6337,6 +7366,50 @@
                       <w:szCs w:val="24"/>
                     </w:rPr>
                   </w:pPr>
+                  <w:r>
+                    <w:rPr>
+                      <w:rFonts w:ascii="Corbel" w:hAnsi="Corbel"/>
+                      <w:b/>
+                      <w:bCs/>
+                      <w:sz w:val="20"/>
+                      <w:szCs w:val="20"/>
+                    </w:rPr>
+                    <w:t xml:space="preserve">cold spring harbor, new </w:t>
+                  </w:r>
+                  <w:proofErr w:type="spellStart"/>
+                  <w:r>
+                    <w:rPr>
+                      <w:rFonts w:ascii="Corbel" w:hAnsi="Corbel"/>
+                      <w:b/>
+                      <w:bCs/>
+                      <w:sz w:val="20"/>
+                      <w:szCs w:val="20"/>
+                    </w:rPr>
+                    <w:t>york</w:t>
+                  </w:r>
+                  <w:proofErr w:type="spellEnd"/>
+                  <w:r>
+                    <w:rPr>
+                      <w:rFonts w:ascii="Corbel" w:hAnsi="Corbel"/>
+                      <w:b/>
+                      <w:bCs/>
+                      <w:sz w:val="20"/>
+                      <w:szCs w:val="20"/>
+                    </w:rPr>
+                    <w:t xml:space="preserve">, </w:t>
+                  </w:r>
+                  <w:proofErr w:type="spellStart"/>
+                  <w:r>
+                    <w:rPr>
+                      <w:rFonts w:ascii="Corbel" w:hAnsi="Corbel"/>
+                      <w:b/>
+                      <w:bCs/>
+                      <w:sz w:val="20"/>
+                      <w:szCs w:val="20"/>
+                    </w:rPr>
+                    <w:t>usa</w:t>
+                  </w:r>
+                  <w:proofErr w:type="spellEnd"/>
                 </w:p>
               </w:tc>
               <w:tc>
@@ -6353,12 +7426,231 @@
                       <w:szCs w:val="24"/>
                     </w:rPr>
                   </w:pPr>
+                  <w:hyperlink r:id="rId27" w:history="1">
+                    <w:r>
+                      <w:rPr>
+                        <w:rStyle w:val="Hyperlink"/>
+                        <w:rFonts w:ascii="Corbel" w:hAnsi="Corbel"/>
+                        <w:b/>
+                        <w:bCs/>
+                        <w:sz w:val="20"/>
+                        <w:szCs w:val="20"/>
+                      </w:rPr>
+                      <w:t>https://meetings.cshl.edu/meetings.aspx?meet=info</w:t>
+                    </w:r>
+                  </w:hyperlink>
                 </w:p>
               </w:tc>
             </w:tr>
             <w:tr>
               <w:trPr>
                 <w:cnfStyle w:val="000000100000" w:firstRow="0" w:lastRow="0" w:firstColumn="0" w:lastColumn="0" w:oddVBand="0" w:evenVBand="0" w:oddHBand="1" w:evenHBand="0" w:firstRowFirstColumn="0" w:firstRowLastColumn="0" w:lastRowFirstColumn="0" w:lastRowLastColumn="0"/>
+                <w:trHeight w:val="260"/>
+              </w:trPr>
+              <w:tc>
+                <w:tcPr>
+                  <w:cnfStyle w:val="001000000000" w:firstRow="0" w:lastRow="0" w:firstColumn="1" w:lastColumn="0" w:oddVBand="0" w:evenVBand="0" w:oddHBand="0" w:evenHBand="0" w:firstRowFirstColumn="0" w:firstRowLastColumn="0" w:lastRowFirstColumn="0" w:lastRowLastColumn="0"/>
+                  <w:tcW w:w="2122" w:type="dxa"/>
+                </w:tcPr>
+                <w:p>
+                  <w:pPr>
+                    <w:rPr>
+                      <w:rFonts w:ascii="Corbel" w:hAnsi="Corbel"/>
+                      <w:b w:val="0"/>
+                      <w:bCs w:val="0"/>
+                      <w:sz w:val="20"/>
+                      <w:szCs w:val="20"/>
+                    </w:rPr>
+                  </w:pPr>
+                  <w:r>
+                    <w:rPr>
+                      <w:rFonts w:ascii="Corbel" w:hAnsi="Corbel"/>
+                      <w:b w:val="0"/>
+                      <w:bCs w:val="0"/>
+                      <w:sz w:val="20"/>
+                      <w:szCs w:val="20"/>
+                    </w:rPr>
+                    <w:t xml:space="preserve">Pacific symposium on </w:t>
+                  </w:r>
+                  <w:proofErr w:type="spellStart"/>
+                  <w:r>
+                    <w:rPr>
+                      <w:rFonts w:ascii="Corbel" w:hAnsi="Corbel"/>
+                      <w:b w:val="0"/>
+                      <w:bCs w:val="0"/>
+                      <w:sz w:val="20"/>
+                      <w:szCs w:val="20"/>
+                    </w:rPr>
+                    <w:t>biocomputing</w:t>
+                  </w:r>
+                  <w:proofErr w:type="spellEnd"/>
+                  <w:r>
+                    <w:rPr>
+                      <w:rFonts w:ascii="Corbel" w:hAnsi="Corbel"/>
+                      <w:b w:val="0"/>
+                      <w:bCs w:val="0"/>
+                      <w:sz w:val="20"/>
+                      <w:szCs w:val="20"/>
+                    </w:rPr>
+                    <w:t xml:space="preserve"> (</w:t>
+                  </w:r>
+                  <w:proofErr w:type="spellStart"/>
+                  <w:r>
+                    <w:rPr>
+                      <w:rFonts w:ascii="Corbel" w:hAnsi="Corbel"/>
+                      <w:b w:val="0"/>
+                      <w:bCs w:val="0"/>
+                      <w:sz w:val="20"/>
+                      <w:szCs w:val="20"/>
+                    </w:rPr>
+                    <w:t>psb</w:t>
+                  </w:r>
+                  <w:proofErr w:type="spellEnd"/>
+                  <w:r>
+                    <w:rPr>
+                      <w:rFonts w:ascii="Corbel" w:hAnsi="Corbel"/>
+                      <w:b w:val="0"/>
+                      <w:bCs w:val="0"/>
+                      <w:sz w:val="20"/>
+                      <w:szCs w:val="20"/>
+                    </w:rPr>
+                    <w:t xml:space="preserve"> 2026)</w:t>
+                  </w:r>
+                </w:p>
+              </w:tc>
+              <w:tc>
+                <w:tcPr>
+                  <w:tcW w:w="1170" w:type="dxa"/>
+                </w:tcPr>
+                <w:p>
+                  <w:pPr>
+                    <w:cnfStyle w:val="000000100000" w:firstRow="0" w:lastRow="0" w:firstColumn="0" w:lastColumn="0" w:oddVBand="0" w:evenVBand="0" w:oddHBand="1" w:evenHBand="0" w:firstRowFirstColumn="0" w:firstRowLastColumn="0" w:lastRowFirstColumn="0" w:lastRowLastColumn="0"/>
+                    <w:rPr>
+                      <w:rFonts w:ascii="Corbel" w:hAnsi="Corbel"/>
+                      <w:b/>
+                      <w:bCs/>
+                      <w:sz w:val="20"/>
+                      <w:szCs w:val="20"/>
+                    </w:rPr>
+                  </w:pPr>
+                  <w:proofErr w:type="spellStart"/>
+                  <w:r>
+                    <w:rPr>
+                      <w:rFonts w:ascii="Corbel" w:hAnsi="Corbel"/>
+                      <w:b/>
+                      <w:bCs/>
+                      <w:sz w:val="20"/>
+                      <w:szCs w:val="20"/>
+                    </w:rPr>
+                    <w:t>january</w:t>
+                  </w:r>
+                  <w:proofErr w:type="spellEnd"/>
+                  <w:r>
+                    <w:rPr>
+                      <w:rFonts w:ascii="Corbel" w:hAnsi="Corbel"/>
+                      <w:b/>
+                      <w:bCs/>
+                      <w:sz w:val="20"/>
+                      <w:szCs w:val="20"/>
+                    </w:rPr>
+                    <w:t xml:space="preserve"> 3–7, 2026</w:t>
+                  </w:r>
+                </w:p>
+              </w:tc>
+              <w:tc>
+                <w:tcPr>
+                  <w:tcW w:w="1890" w:type="dxa"/>
+                </w:tcPr>
+                <w:p>
+                  <w:pPr>
+                    <w:cnfStyle w:val="000000100000" w:firstRow="0" w:lastRow="0" w:firstColumn="0" w:lastColumn="0" w:oddVBand="0" w:evenVBand="0" w:oddHBand="1" w:evenHBand="0" w:firstRowFirstColumn="0" w:firstRowLastColumn="0" w:lastRowFirstColumn="0" w:lastRowLastColumn="0"/>
+                    <w:rPr>
+                      <w:rFonts w:ascii="Corbel" w:hAnsi="Corbel"/>
+                      <w:b/>
+                      <w:bCs/>
+                      <w:sz w:val="20"/>
+                      <w:szCs w:val="20"/>
+                    </w:rPr>
+                  </w:pPr>
+                  <w:r>
+                    <w:rPr>
+                      <w:rFonts w:ascii="Corbel" w:hAnsi="Corbel"/>
+                      <w:b/>
+                      <w:bCs/>
+                      <w:sz w:val="20"/>
+                      <w:szCs w:val="20"/>
+                    </w:rPr>
+                    <w:t xml:space="preserve">big island, </w:t>
+                  </w:r>
+                  <w:proofErr w:type="spellStart"/>
+                  <w:r>
+                    <w:rPr>
+                      <w:rFonts w:ascii="Corbel" w:hAnsi="Corbel"/>
+                      <w:b/>
+                      <w:bCs/>
+                      <w:sz w:val="20"/>
+                      <w:szCs w:val="20"/>
+                    </w:rPr>
+                    <w:t>hawaii</w:t>
+                  </w:r>
+                  <w:proofErr w:type="spellEnd"/>
+                  <w:r>
+                    <w:rPr>
+                      <w:rFonts w:ascii="Corbel" w:hAnsi="Corbel"/>
+                      <w:b/>
+                      <w:bCs/>
+                      <w:sz w:val="20"/>
+                      <w:szCs w:val="20"/>
+                    </w:rPr>
+                    <w:t xml:space="preserve">, </w:t>
+                  </w:r>
+                  <w:proofErr w:type="spellStart"/>
+                  <w:r>
+                    <w:rPr>
+                      <w:rFonts w:ascii="Corbel" w:hAnsi="Corbel"/>
+                      <w:b/>
+                      <w:bCs/>
+                      <w:sz w:val="20"/>
+                      <w:szCs w:val="20"/>
+                    </w:rPr>
+                    <w:t>usa</w:t>
+                  </w:r>
+                  <w:proofErr w:type="spellEnd"/>
+                </w:p>
+              </w:tc>
+              <w:tc>
+                <w:tcPr>
+                  <w:tcW w:w="3420" w:type="dxa"/>
+                </w:tcPr>
+                <w:p>
+                  <w:pPr>
+                    <w:cnfStyle w:val="000000100000" w:firstRow="0" w:lastRow="0" w:firstColumn="0" w:lastColumn="0" w:oddVBand="0" w:evenVBand="0" w:oddHBand="1" w:evenHBand="0" w:firstRowFirstColumn="0" w:firstRowLastColumn="0" w:lastRowFirstColumn="0" w:lastRowLastColumn="0"/>
+                    <w:rPr>
+                      <w:rFonts w:ascii="Corbel" w:hAnsi="Corbel"/>
+                      <w:b/>
+                      <w:bCs/>
+                      <w:sz w:val="20"/>
+                      <w:szCs w:val="20"/>
+                    </w:rPr>
+                  </w:pPr>
+                  <w:hyperlink r:id="rId28" w:history="1">
+                    <w:r>
+                      <w:rPr>
+                        <w:rStyle w:val="Hyperlink"/>
+                        <w:rFonts w:ascii="Corbel" w:hAnsi="Corbel"/>
+                        <w:b/>
+                        <w:bCs/>
+                        <w:sz w:val="20"/>
+                        <w:szCs w:val="20"/>
+                      </w:rPr>
+                      <w:t>https://psb.stanford.edu/</w:t>
+                    </w:r>
+                  </w:hyperlink>
+                </w:p>
+              </w:tc>
+            </w:tr>
+            <w:tr>
+              <w:trPr>
                 <w:trHeight w:val="247"/>
               </w:trPr>
               <w:tc>
@@ -6377,6 +7669,36 @@
                       <w:szCs w:val="24"/>
                     </w:rPr>
                   </w:pPr>
+                  <w:r>
+                    <w:rPr>
+                      <w:rFonts w:ascii="Corbel" w:hAnsi="Corbel"/>
+                      <w:b w:val="0"/>
+                      <w:bCs w:val="0"/>
+                      <w:sz w:val="20"/>
+                      <w:szCs w:val="20"/>
+                    </w:rPr>
+                    <w:t>Next</w:t>
+                  </w:r>
+                  <w:r>
+                    <w:rPr>
+                      <w:rFonts w:ascii="Corbel" w:hAnsi="Corbel"/>
+                      <w:b w:val="0"/>
+                      <w:bCs w:val="0"/>
+                      <w:sz w:val="20"/>
+                      <w:szCs w:val="20"/>
+                    </w:rPr>
+                    <w:t xml:space="preserve"> gen</w:t>
+                  </w:r>
+                  <w:r>
+                    <w:rPr>
+                      <w:rFonts w:ascii="Corbel" w:hAnsi="Corbel"/>
+                      <w:b w:val="0"/>
+                      <w:bCs w:val="0"/>
+                      <w:sz w:val="20"/>
+                      <w:szCs w:val="20"/>
+                    </w:rPr>
+                    <w:t>omics, spatial &amp; data</w:t>
+                  </w:r>
                 </w:p>
               </w:tc>
               <w:tc>
@@ -6385,14 +7707,46 @@
                 </w:tcPr>
                 <w:p>
                   <w:pPr>
-                    <w:cnfStyle w:val="000000100000" w:firstRow="0" w:lastRow="0" w:firstColumn="0" w:lastColumn="0" w:oddVBand="0" w:evenVBand="0" w:oddHBand="1" w:evenHBand="0" w:firstRowFirstColumn="0" w:firstRowLastColumn="0" w:lastRowFirstColumn="0" w:lastRowLastColumn="0"/>
-                    <w:rPr>
-                      <w:rFonts w:ascii="Calibri Light" w:hAnsi="Calibri Light" w:cs="Calibri Light"/>
-                      <w:snapToGrid w:val="0"/>
-                      <w:sz w:val="24"/>
-                      <w:szCs w:val="24"/>
-                    </w:rPr>
-                  </w:pPr>
+                    <w:cnfStyle w:val="000000000000" w:firstRow="0" w:lastRow="0" w:firstColumn="0" w:lastColumn="0" w:oddVBand="0" w:evenVBand="0" w:oddHBand="0" w:evenHBand="0" w:firstRowFirstColumn="0" w:firstRowLastColumn="0" w:lastRowFirstColumn="0" w:lastRowLastColumn="0"/>
+                    <w:rPr>
+                      <w:rFonts w:ascii="Calibri Light" w:hAnsi="Calibri Light" w:cs="Calibri Light"/>
+                      <w:snapToGrid w:val="0"/>
+                      <w:sz w:val="24"/>
+                      <w:szCs w:val="24"/>
+                    </w:rPr>
+                  </w:pPr>
+                  <w:r>
+                    <w:rPr>
+                      <w:rFonts w:ascii="Corbel" w:hAnsi="Corbel"/>
+                      <w:b/>
+                      <w:bCs/>
+                      <w:sz w:val="20"/>
+                      <w:szCs w:val="20"/>
+                    </w:rPr>
+                    <w:t>31–</w:t>
+                  </w:r>
+                  <w:proofErr w:type="spellStart"/>
+                  <w:r>
+                    <w:rPr>
+                      <w:rFonts w:ascii="Corbel" w:hAnsi="Corbel"/>
+                      <w:b/>
+                      <w:bCs/>
+                      <w:sz w:val="20"/>
+                      <w:szCs w:val="20"/>
+                    </w:rPr>
+                    <w:t>april</w:t>
+                  </w:r>
+                  <w:proofErr w:type="spellEnd"/>
+                  <w:r>
+                    <w:rPr>
+                      <w:rFonts w:ascii="Corbel" w:hAnsi="Corbel"/>
+                      <w:b/>
+                      <w:bCs/>
+                      <w:sz w:val="20"/>
+                      <w:szCs w:val="20"/>
+                    </w:rPr>
+                    <w:t xml:space="preserve"> 1, 2026</w:t>
+                  </w:r>
                 </w:p>
               </w:tc>
               <w:tc>
@@ -6401,14 +7755,48 @@
                 </w:tcPr>
                 <w:p>
                   <w:pPr>
-                    <w:cnfStyle w:val="000000100000" w:firstRow="0" w:lastRow="0" w:firstColumn="0" w:lastColumn="0" w:oddVBand="0" w:evenVBand="0" w:oddHBand="1" w:evenHBand="0" w:firstRowFirstColumn="0" w:firstRowLastColumn="0" w:lastRowFirstColumn="0" w:lastRowLastColumn="0"/>
-                    <w:rPr>
-                      <w:rFonts w:ascii="Calibri Light" w:hAnsi="Calibri Light" w:cs="Calibri Light"/>
-                      <w:snapToGrid w:val="0"/>
-                      <w:sz w:val="24"/>
-                      <w:szCs w:val="24"/>
-                    </w:rPr>
-                  </w:pPr>
+                    <w:cnfStyle w:val="000000000000" w:firstRow="0" w:lastRow="0" w:firstColumn="0" w:lastColumn="0" w:oddVBand="0" w:evenVBand="0" w:oddHBand="0" w:evenHBand="0" w:firstRowFirstColumn="0" w:firstRowLastColumn="0" w:lastRowFirstColumn="0" w:lastRowLastColumn="0"/>
+                    <w:rPr>
+                      <w:rFonts w:ascii="Calibri Light" w:hAnsi="Calibri Light" w:cs="Calibri Light"/>
+                      <w:snapToGrid w:val="0"/>
+                      <w:sz w:val="24"/>
+                      <w:szCs w:val="24"/>
+                    </w:rPr>
+                  </w:pPr>
+                  <w:proofErr w:type="spellStart"/>
+                  <w:r>
+                    <w:rPr>
+                      <w:rFonts w:ascii="Corbel" w:hAnsi="Corbel"/>
+                      <w:b/>
+                      <w:bCs/>
+                      <w:sz w:val="20"/>
+                      <w:szCs w:val="20"/>
+                    </w:rPr>
+                    <w:t>boston</w:t>
+                  </w:r>
+                  <w:proofErr w:type="spellEnd"/>
+                  <w:r>
+                    <w:rPr>
+                      <w:rFonts w:ascii="Corbel" w:hAnsi="Corbel"/>
+                      <w:b/>
+                      <w:bCs/>
+                      <w:sz w:val="20"/>
+                      <w:szCs w:val="20"/>
+                    </w:rPr>
+                    <w:t xml:space="preserve">, </w:t>
+                  </w:r>
+                  <w:proofErr w:type="spellStart"/>
+                  <w:r>
+                    <w:rPr>
+                      <w:rFonts w:ascii="Corbel" w:hAnsi="Corbel"/>
+                      <w:b/>
+                      <w:bCs/>
+                      <w:sz w:val="20"/>
+                      <w:szCs w:val="20"/>
+                    </w:rPr>
+                    <w:t>usa</w:t>
+                  </w:r>
+                  <w:proofErr w:type="spellEnd"/>
                 </w:p>
               </w:tc>
               <w:tc>
@@ -6417,14 +7805,27 @@
                 </w:tcPr>
                 <w:p>
                   <w:pPr>
-                    <w:cnfStyle w:val="000000100000" w:firstRow="0" w:lastRow="0" w:firstColumn="0" w:lastColumn="0" w:oddVBand="0" w:evenVBand="0" w:oddHBand="1" w:evenHBand="0" w:firstRowFirstColumn="0" w:firstRowLastColumn="0" w:lastRowFirstColumn="0" w:lastRowLastColumn="0"/>
-                    <w:rPr>
-                      <w:rFonts w:ascii="Calibri Light" w:hAnsi="Calibri Light" w:cs="Calibri Light"/>
-                      <w:snapToGrid w:val="0"/>
-                      <w:sz w:val="24"/>
-                      <w:szCs w:val="24"/>
-                    </w:rPr>
-                  </w:pPr>
+                    <w:cnfStyle w:val="000000000000" w:firstRow="0" w:lastRow="0" w:firstColumn="0" w:lastColumn="0" w:oddVBand="0" w:evenVBand="0" w:oddHBand="0" w:evenHBand="0" w:firstRowFirstColumn="0" w:firstRowLastColumn="0" w:lastRowFirstColumn="0" w:lastRowLastColumn="0"/>
+                    <w:rPr>
+                      <w:rFonts w:ascii="Calibri Light" w:hAnsi="Calibri Light" w:cs="Calibri Light"/>
+                      <w:snapToGrid w:val="0"/>
+                      <w:sz w:val="24"/>
+                      <w:szCs w:val="24"/>
+                    </w:rPr>
+                  </w:pPr>
+                  <w:hyperlink r:id="rId29" w:history="1">
+                    <w:r>
+                      <w:rPr>
+                        <w:rStyle w:val="Hyperlink"/>
+                        <w:rFonts w:ascii="Corbel" w:hAnsi="Corbel"/>
+                        <w:b/>
+                        <w:bCs/>
+                        <w:sz w:val="20"/>
+                        <w:szCs w:val="20"/>
+                      </w:rPr>
+                      <w:t>https://oxfordglobal.com/precision-medicine/events/nextgen-omics-us/book-now</w:t>
+                    </w:r>
+                  </w:hyperlink>
                 </w:p>
               </w:tc>
             </w:tr>
@@ -6493,9 +7894,9 @@
               <w:tblLook w:val="04A0" w:firstRow="1" w:lastRow="0" w:firstColumn="1" w:lastColumn="0" w:noHBand="0" w:noVBand="1"/>
             </w:tblPr>
             <w:tblGrid>
-              <w:gridCol w:w="2869"/>
-              <w:gridCol w:w="2892"/>
-              <w:gridCol w:w="2834"/>
+              <w:gridCol w:w="2343"/>
+              <w:gridCol w:w="2214"/>
+              <w:gridCol w:w="4038"/>
             </w:tblGrid>
             <w:tr>
               <w:trPr>
@@ -6590,6 +7991,14 @@
                       <w:szCs w:val="24"/>
                     </w:rPr>
                   </w:pPr>
+                  <w:r>
+                    <w:rPr>
+                      <w:rFonts w:ascii="Calibri Light" w:hAnsi="Calibri Light" w:cs="Calibri Light"/>
+                      <w:sz w:val="24"/>
+                      <w:szCs w:val="24"/>
+                    </w:rPr>
+                    <w:t>Nature Genetics</w:t>
+                  </w:r>
                 </w:p>
               </w:tc>
               <w:tc>
@@ -6605,12 +8014,43 @@
                       <w:szCs w:val="24"/>
                     </w:rPr>
                   </w:pPr>
+                  <w:r>
+                    <w:rPr>
+                      <w:rFonts w:ascii="Calibri Light" w:hAnsi="Calibri Light" w:cs="Calibri Light"/>
+                      <w:sz w:val="24"/>
+                      <w:szCs w:val="24"/>
+                    </w:rPr>
+                    <w:t>Springer Nature</w:t>
+                  </w:r>
                 </w:p>
               </w:tc>
               <w:tc>
                 <w:tcPr>
                   <w:tcW w:w="3115" w:type="dxa"/>
                 </w:tcPr>
+                <w:p>
+                  <w:pPr>
+                    <w:cnfStyle w:val="000000100000" w:firstRow="0" w:lastRow="0" w:firstColumn="0" w:lastColumn="0" w:oddVBand="0" w:evenVBand="0" w:oddHBand="1" w:evenHBand="0" w:firstRowFirstColumn="0" w:firstRowLastColumn="0" w:lastRowFirstColumn="0" w:lastRowLastColumn="0"/>
+                    <w:rPr>
+                      <w:rFonts w:ascii="Calibri Light" w:hAnsi="Calibri Light" w:cs="Calibri Light"/>
+                    </w:rPr>
+                  </w:pPr>
+                  <w:hyperlink r:id="rId30" w:history="1">
+                    <w:r>
+                      <w:rPr>
+                        <w:rStyle w:val="Hyperlink"/>
+                        <w:rFonts w:ascii="Calibri Light" w:hAnsi="Calibri Light" w:cs="Calibri Light"/>
+                      </w:rPr>
+                      <w:t>https://www.nature.com/ng</w:t>
+                    </w:r>
+                  </w:hyperlink>
+                  <w:r>
+                    <w:rPr>
+                      <w:rFonts w:ascii="Calibri Light" w:hAnsi="Calibri Light" w:cs="Calibri Light"/>
+                    </w:rPr>
+                    <w:t xml:space="preserve"> </w:t>
+                  </w:r>
+                </w:p>
                 <w:p>
                   <w:pPr>
                     <w:cnfStyle w:val="000000100000" w:firstRow="0" w:lastRow="0" w:firstColumn="0" w:lastColumn="0" w:oddVBand="0" w:evenVBand="0" w:oddHBand="1" w:evenHBand="0" w:firstRowFirstColumn="0" w:firstRowLastColumn="0" w:lastRowFirstColumn="0" w:lastRowLastColumn="0"/>
@@ -6637,6 +8077,14 @@
                       <w:szCs w:val="24"/>
                     </w:rPr>
                   </w:pPr>
+                  <w:r>
+                    <w:rPr>
+                      <w:rFonts w:ascii="Calibri Light" w:hAnsi="Calibri Light" w:cs="Calibri Light"/>
+                      <w:sz w:val="24"/>
+                      <w:szCs w:val="24"/>
+                    </w:rPr>
+                    <w:t>Genome Biology</w:t>
+                  </w:r>
                 </w:p>
               </w:tc>
               <w:tc>
@@ -6652,6 +8100,24 @@
                       <w:szCs w:val="24"/>
                     </w:rPr>
                   </w:pPr>
+                  <w:proofErr w:type="spellStart"/>
+                  <w:r>
+                    <w:rPr>
+                      <w:rFonts w:ascii="Calibri Light" w:hAnsi="Calibri Light" w:cs="Calibri Light"/>
+                      <w:sz w:val="24"/>
+                      <w:szCs w:val="24"/>
+                    </w:rPr>
+                    <w:t>BioMed</w:t>
+                  </w:r>
+                  <w:proofErr w:type="spellEnd"/>
+                  <w:r>
+                    <w:rPr>
+                      <w:rFonts w:ascii="Calibri Light" w:hAnsi="Calibri Light" w:cs="Calibri Light"/>
+                      <w:sz w:val="24"/>
+                      <w:szCs w:val="24"/>
+                    </w:rPr>
+                    <w:t xml:space="preserve"> Central (Springer Nature)</w:t>
+                  </w:r>
                 </w:p>
               </w:tc>
               <w:tc>
@@ -6667,6 +8133,23 @@
                       <w:szCs w:val="24"/>
                     </w:rPr>
                   </w:pPr>
+                  <w:hyperlink r:id="rId31" w:history="1">
+                    <w:r>
+                      <w:rPr>
+                        <w:rStyle w:val="Hyperlink"/>
+                        <w:rFonts w:ascii="Calibri Light" w:hAnsi="Calibri Light" w:cs="Calibri Light"/>
+                      </w:rPr>
+                      <w:t>https://genomebiology.biomedcentral.com</w:t>
+                    </w:r>
+                  </w:hyperlink>
+                  <w:r>
+                    <w:rPr>
+                      <w:rFonts w:ascii="Calibri Light" w:hAnsi="Calibri Light" w:cs="Calibri Light"/>
+                      <w:sz w:val="24"/>
+                      <w:szCs w:val="24"/>
+                    </w:rPr>
+                    <w:t xml:space="preserve"> </w:t>
+                  </w:r>
                 </w:p>
               </w:tc>
             </w:tr>
@@ -6687,6 +8170,14 @@
                       <w:szCs w:val="24"/>
                     </w:rPr>
                   </w:pPr>
+                  <w:r>
+                    <w:rPr>
+                      <w:rFonts w:ascii="Calibri Light" w:hAnsi="Calibri Light" w:cs="Calibri Light"/>
+                      <w:sz w:val="24"/>
+                      <w:szCs w:val="24"/>
+                    </w:rPr>
+                    <w:t>Genome Research</w:t>
+                  </w:r>
                 </w:p>
               </w:tc>
               <w:tc>
@@ -6702,6 +8193,14 @@
                       <w:szCs w:val="24"/>
                     </w:rPr>
                   </w:pPr>
+                  <w:r>
+                    <w:rPr>
+                      <w:rFonts w:ascii="Calibri Light" w:hAnsi="Calibri Light" w:cs="Calibri Light"/>
+                      <w:sz w:val="24"/>
+                      <w:szCs w:val="24"/>
+                    </w:rPr>
+                    <w:t>Cold Spring Harbor Laboratory Press</w:t>
+                  </w:r>
                 </w:p>
               </w:tc>
               <w:tc>
@@ -6717,6 +8216,139 @@
                       <w:szCs w:val="24"/>
                     </w:rPr>
                   </w:pPr>
+                  <w:hyperlink r:id="rId32" w:history="1">
+                    <w:r>
+                      <w:rPr>
+                        <w:rStyle w:val="Hyperlink"/>
+                      </w:rPr>
+                      <w:t>https://genome.cshlp.org</w:t>
+                    </w:r>
+                  </w:hyperlink>
+                  <w:r>
+                    <w:t xml:space="preserve"> </w:t>
+                  </w:r>
+                </w:p>
+              </w:tc>
+            </w:tr>
+            <w:tr>
+              <w:tc>
+                <w:tcPr>
+                  <w:cnfStyle w:val="001000000000" w:firstRow="0" w:lastRow="0" w:firstColumn="1" w:lastColumn="0" w:oddVBand="0" w:evenVBand="0" w:oddHBand="0" w:evenHBand="0" w:firstRowFirstColumn="0" w:firstRowLastColumn="0" w:lastRowFirstColumn="0" w:lastRowLastColumn="0"/>
+                  <w:tcW w:w="3115" w:type="dxa"/>
+                </w:tcPr>
+                <w:p>
+                  <w:pPr>
+                    <w:rPr>
+                      <w:rFonts w:ascii="Calibri Light" w:hAnsi="Calibri Light" w:cs="Calibri Light"/>
+                    </w:rPr>
+                  </w:pPr>
+                  <w:r>
+                    <w:rPr>
+                      <w:rFonts w:ascii="Calibri Light" w:hAnsi="Calibri Light" w:cs="Calibri Light"/>
+                    </w:rPr>
+                    <w:t>Nucleic Acids Research</w:t>
+                  </w:r>
+                </w:p>
+              </w:tc>
+              <w:tc>
+                <w:tcPr>
+                  <w:tcW w:w="3115" w:type="dxa"/>
+                </w:tcPr>
+                <w:p>
+                  <w:pPr>
+                    <w:cnfStyle w:val="000000000000" w:firstRow="0" w:lastRow="0" w:firstColumn="0" w:lastColumn="0" w:oddVBand="0" w:evenVBand="0" w:oddHBand="0" w:evenHBand="0" w:firstRowFirstColumn="0" w:firstRowLastColumn="0" w:lastRowFirstColumn="0" w:lastRowLastColumn="0"/>
+                    <w:rPr>
+                      <w:rFonts w:ascii="Calibri Light" w:hAnsi="Calibri Light" w:cs="Calibri Light"/>
+                    </w:rPr>
+                  </w:pPr>
+                  <w:r>
+                    <w:rPr>
+                      <w:rFonts w:ascii="Calibri Light" w:hAnsi="Calibri Light" w:cs="Calibri Light"/>
+                    </w:rPr>
+                    <w:t>Oxford University Press</w:t>
+                  </w:r>
+                </w:p>
+              </w:tc>
+              <w:tc>
+                <w:tcPr>
+                  <w:tcW w:w="3115" w:type="dxa"/>
+                </w:tcPr>
+                <w:p>
+                  <w:pPr>
+                    <w:cnfStyle w:val="000000000000" w:firstRow="0" w:lastRow="0" w:firstColumn="0" w:lastColumn="0" w:oddVBand="0" w:evenVBand="0" w:oddHBand="0" w:evenHBand="0" w:firstRowFirstColumn="0" w:firstRowLastColumn="0" w:lastRowFirstColumn="0" w:lastRowLastColumn="0"/>
+                  </w:pPr>
+                  <w:hyperlink r:id="rId33" w:history="1">
+                    <w:r>
+                      <w:rPr>
+                        <w:rStyle w:val="Hyperlink"/>
+                      </w:rPr>
+                      <w:t>https://academic.oup.com/nar</w:t>
+                    </w:r>
+                  </w:hyperlink>
+                  <w:r>
+                    <w:t xml:space="preserve"> </w:t>
+                  </w:r>
+                </w:p>
+              </w:tc>
+            </w:tr>
+            <w:tr>
+              <w:trPr>
+                <w:cnfStyle w:val="000000100000" w:firstRow="0" w:lastRow="0" w:firstColumn="0" w:lastColumn="0" w:oddVBand="0" w:evenVBand="0" w:oddHBand="1" w:evenHBand="0" w:firstRowFirstColumn="0" w:firstRowLastColumn="0" w:lastRowFirstColumn="0" w:lastRowLastColumn="0"/>
+              </w:trPr>
+              <w:tc>
+                <w:tcPr>
+                  <w:cnfStyle w:val="001000000000" w:firstRow="0" w:lastRow="0" w:firstColumn="1" w:lastColumn="0" w:oddVBand="0" w:evenVBand="0" w:oddHBand="0" w:evenHBand="0" w:firstRowFirstColumn="0" w:firstRowLastColumn="0" w:lastRowFirstColumn="0" w:lastRowLastColumn="0"/>
+                  <w:tcW w:w="3115" w:type="dxa"/>
+                </w:tcPr>
+                <w:p>
+                  <w:pPr>
+                    <w:rPr>
+                      <w:rFonts w:ascii="Calibri Light" w:hAnsi="Calibri Light" w:cs="Calibri Light"/>
+                    </w:rPr>
+                  </w:pPr>
+                  <w:r>
+                    <w:rPr>
+                      <w:rFonts w:ascii="Calibri Light" w:hAnsi="Calibri Light" w:cs="Calibri Light"/>
+                    </w:rPr>
+                    <w:t>PLOS Computational Biology</w:t>
+                  </w:r>
+                </w:p>
+              </w:tc>
+              <w:tc>
+                <w:tcPr>
+                  <w:tcW w:w="3115" w:type="dxa"/>
+                </w:tcPr>
+                <w:p>
+                  <w:pPr>
+                    <w:cnfStyle w:val="000000100000" w:firstRow="0" w:lastRow="0" w:firstColumn="0" w:lastColumn="0" w:oddVBand="0" w:evenVBand="0" w:oddHBand="1" w:evenHBand="0" w:firstRowFirstColumn="0" w:firstRowLastColumn="0" w:lastRowFirstColumn="0" w:lastRowLastColumn="0"/>
+                    <w:rPr>
+                      <w:rFonts w:ascii="Calibri Light" w:hAnsi="Calibri Light" w:cs="Calibri Light"/>
+                    </w:rPr>
+                  </w:pPr>
+                  <w:r>
+                    <w:t>Public Library of Science (PLOS)</w:t>
+                  </w:r>
+                </w:p>
+              </w:tc>
+              <w:tc>
+                <w:tcPr>
+                  <w:tcW w:w="3115" w:type="dxa"/>
+                </w:tcPr>
+                <w:p>
+                  <w:pPr>
+                    <w:cnfStyle w:val="000000100000" w:firstRow="0" w:lastRow="0" w:firstColumn="0" w:lastColumn="0" w:oddVBand="0" w:evenVBand="0" w:oddHBand="1" w:evenHBand="0" w:firstRowFirstColumn="0" w:firstRowLastColumn="0" w:lastRowFirstColumn="0" w:lastRowLastColumn="0"/>
+                  </w:pPr>
+                  <w:hyperlink r:id="rId34" w:history="1">
+                    <w:r>
+                      <w:rPr>
+                        <w:rStyle w:val="Hyperlink"/>
+                      </w:rPr>
+                      <w:t>https://journals.plos.org/ploscompbiol</w:t>
+                    </w:r>
+                  </w:hyperlink>
+                  <w:r>
+                    <w:t xml:space="preserve"> </w:t>
+                  </w:r>
                 </w:p>
               </w:tc>
             </w:tr>
@@ -6885,6 +8517,17 @@
                       <w:szCs w:val="24"/>
                     </w:rPr>
                   </w:pPr>
+                  <w:r>
+                    <w:t>African Society of Human Genetics (</w:t>
+                  </w:r>
+                  <w:proofErr w:type="spellStart"/>
+                  <w:r>
+                    <w:t>AfSHG</w:t>
+                  </w:r>
+                  <w:proofErr w:type="spellEnd"/>
+                  <w:r>
+                    <w:t>)</w:t>
+                  </w:r>
                 </w:p>
               </w:tc>
               <w:tc>
@@ -6901,6 +8544,36 @@
                       <w:szCs w:val="24"/>
                     </w:rPr>
                   </w:pPr>
+                  <w:r>
+                    <w:t xml:space="preserve">Dr. </w:t>
+                  </w:r>
+                  <w:proofErr w:type="spellStart"/>
+                  <w:r>
+                    <w:t>Ambroise</w:t>
+                  </w:r>
+                  <w:proofErr w:type="spellEnd"/>
+                  <w:r>
+                    <w:t xml:space="preserve"> </w:t>
+                  </w:r>
+                  <w:proofErr w:type="spellStart"/>
+                  <w:r>
+                    <w:t>Wonkam</w:t>
+                  </w:r>
+                  <w:proofErr w:type="spellEnd"/>
+                  <w:r>
+                    <w:t xml:space="preserve"> (President) </w:t>
+                  </w:r>
+                  <w:hyperlink r:id="rId35" w:history="1">
+                    <w:r>
+                      <w:rPr>
+                        <w:rStyle w:val="Hyperlink"/>
+                      </w:rPr>
+                      <w:t>info@afshg.org</w:t>
+                    </w:r>
+                  </w:hyperlink>
+                  <w:r>
+                    <w:t xml:space="preserve"> </w:t>
+                  </w:r>
                 </w:p>
               </w:tc>
               <w:tc>
@@ -6917,6 +8590,17 @@
                       <w:szCs w:val="24"/>
                     </w:rPr>
                   </w:pPr>
+                  <w:hyperlink r:id="rId36" w:history="1">
+                    <w:r>
+                      <w:rPr>
+                        <w:rStyle w:val="Hyperlink"/>
+                      </w:rPr>
+                      <w:t>https://www.afshg.org</w:t>
+                    </w:r>
+                  </w:hyperlink>
+                  <w:r>
+                    <w:t xml:space="preserve"> </w:t>
+                  </w:r>
                 </w:p>
               </w:tc>
             </w:tr>
@@ -6938,6 +8622,15 @@
                       <w:szCs w:val="24"/>
                     </w:rPr>
                   </w:pPr>
+                  <w:r>
+                    <w:rPr>
+                      <w:rFonts w:ascii="Calibri Light" w:hAnsi="Calibri Light" w:cs="Calibri Light"/>
+                      <w:snapToGrid w:val="0"/>
+                      <w:sz w:val="24"/>
+                      <w:szCs w:val="24"/>
+                    </w:rPr>
+                    <w:t>International Society for Computational Biology (ISCB)</w:t>
+                  </w:r>
                 </w:p>
               </w:tc>
               <w:tc>
@@ -6954,6 +8647,28 @@
                       <w:szCs w:val="24"/>
                     </w:rPr>
                   </w:pPr>
+                  <w:r>
+                    <w:t xml:space="preserve">Diane </w:t>
+                  </w:r>
+                  <w:proofErr w:type="spellStart"/>
+                  <w:r>
+                    <w:t>Kovats</w:t>
+                  </w:r>
+                  <w:proofErr w:type="spellEnd"/>
+                  <w:r>
+                    <w:t xml:space="preserve"> (Executive Director) </w:t>
+                  </w:r>
+                  <w:hyperlink r:id="rId37" w:history="1">
+                    <w:r>
+                      <w:rPr>
+                        <w:rStyle w:val="Hyperlink"/>
+                      </w:rPr>
+                      <w:t>admin@iscb.org</w:t>
+                    </w:r>
+                  </w:hyperlink>
+                  <w:r>
+                    <w:t xml:space="preserve"> </w:t>
+                  </w:r>
                 </w:p>
               </w:tc>
               <w:tc>
@@ -6970,6 +8685,17 @@
                       <w:szCs w:val="24"/>
                     </w:rPr>
                   </w:pPr>
+                  <w:hyperlink r:id="rId38" w:history="1">
+                    <w:r>
+                      <w:rPr>
+                        <w:rStyle w:val="Hyperlink"/>
+                      </w:rPr>
+                      <w:t>https://www.iscb.org</w:t>
+                    </w:r>
+                  </w:hyperlink>
+                  <w:r>
+                    <w:t xml:space="preserve"> </w:t>
+                  </w:r>
                 </w:p>
               </w:tc>
             </w:tr>
@@ -6992,6 +8718,15 @@
                       <w:szCs w:val="24"/>
                     </w:rPr>
                   </w:pPr>
+                  <w:r>
+                    <w:rPr>
+                      <w:rFonts w:ascii="Calibri Light" w:hAnsi="Calibri Light" w:cs="Calibri Light"/>
+                      <w:snapToGrid w:val="0"/>
+                      <w:sz w:val="24"/>
+                      <w:szCs w:val="24"/>
+                    </w:rPr>
+                    <w:t>Genetics Society (UK)</w:t>
+                  </w:r>
                 </w:p>
               </w:tc>
               <w:tc>
@@ -7008,6 +8743,20 @@
                       <w:szCs w:val="24"/>
                     </w:rPr>
                   </w:pPr>
+                  <w:r>
+                    <w:t xml:space="preserve">Dr. Tanya Whitfield (President)  </w:t>
+                  </w:r>
+                  <w:hyperlink r:id="rId39" w:history="1">
+                    <w:r>
+                      <w:rPr>
+                        <w:rStyle w:val="Hyperlink"/>
+                      </w:rPr>
+                      <w:t>theteam@genetics.org.uk</w:t>
+                    </w:r>
+                  </w:hyperlink>
+                  <w:r>
+                    <w:t xml:space="preserve"> </w:t>
+                  </w:r>
                 </w:p>
               </w:tc>
               <w:tc>
@@ -7024,6 +8773,111 @@
                       <w:szCs w:val="24"/>
                     </w:rPr>
                   </w:pPr>
+                  <w:hyperlink r:id="rId40" w:history="1">
+                    <w:r>
+                      <w:rPr>
+                        <w:rStyle w:val="Hyperlink"/>
+                      </w:rPr>
+                      <w:t>https://www.genetics.org.uk</w:t>
+                    </w:r>
+                  </w:hyperlink>
+                  <w:r>
+                    <w:t xml:space="preserve"> </w:t>
+                  </w:r>
+                </w:p>
+              </w:tc>
+            </w:tr>
+            <w:tr>
+              <w:trPr>
+                <w:trHeight w:val="262"/>
+              </w:trPr>
+              <w:tc>
+                <w:tcPr>
+                  <w:cnfStyle w:val="001000000000" w:firstRow="0" w:lastRow="0" w:firstColumn="1" w:lastColumn="0" w:oddVBand="0" w:evenVBand="0" w:oddHBand="0" w:evenHBand="0" w:firstRowFirstColumn="0" w:firstRowLastColumn="0" w:lastRowFirstColumn="0" w:lastRowLastColumn="0"/>
+                  <w:tcW w:w="2924" w:type="dxa"/>
+                </w:tcPr>
+                <w:p>
+                  <w:pPr>
+                    <w:rPr>
+                      <w:rFonts w:ascii="Calibri Light" w:hAnsi="Calibri Light" w:cs="Calibri Light"/>
+                      <w:snapToGrid w:val="0"/>
+                    </w:rPr>
+                  </w:pPr>
+                  <w:r>
+                    <w:rPr>
+                      <w:rStyle w:val="Strong"/>
+                    </w:rPr>
+                    <w:t xml:space="preserve">Human Genome </w:t>
+                  </w:r>
+                  <w:proofErr w:type="spellStart"/>
+                  <w:r>
+                    <w:rPr>
+                      <w:rStyle w:val="Strong"/>
+                    </w:rPr>
+                    <w:t>Organisation</w:t>
+                  </w:r>
+                  <w:proofErr w:type="spellEnd"/>
+                  <w:r>
+                    <w:rPr>
+                      <w:rStyle w:val="Strong"/>
+                    </w:rPr>
+                    <w:t xml:space="preserve"> (HUGO)</w:t>
+                  </w:r>
+                </w:p>
+              </w:tc>
+              <w:tc>
+                <w:tcPr>
+                  <w:tcW w:w="2901" w:type="dxa"/>
+                </w:tcPr>
+                <w:p>
+                  <w:pPr>
+                    <w:cnfStyle w:val="000000000000" w:firstRow="0" w:lastRow="0" w:firstColumn="0" w:lastColumn="0" w:oddVBand="0" w:evenVBand="0" w:oddHBand="0" w:evenHBand="0" w:firstRowFirstColumn="0" w:firstRowLastColumn="0" w:lastRowFirstColumn="0" w:lastRowLastColumn="0"/>
+                  </w:pPr>
+                  <w:r>
+                    <w:t xml:space="preserve">Dr. Charles </w:t>
+                  </w:r>
+                  <w:proofErr w:type="spellStart"/>
+                  <w:r>
+                    <w:t>Rotimi</w:t>
+                  </w:r>
+                  <w:proofErr w:type="spellEnd"/>
+                  <w:r>
+                    <w:t xml:space="preserve"> (President)  </w:t>
+                  </w:r>
+                  <w:hyperlink r:id="rId41" w:history="1">
+                    <w:r>
+                      <w:rPr>
+                        <w:rStyle w:val="Hyperlink"/>
+                      </w:rPr>
+                      <w:t>hugo@hugo-international.org</w:t>
+                    </w:r>
+                  </w:hyperlink>
+                  <w:r>
+                    <w:t xml:space="preserve"> </w:t>
+                  </w:r>
+                </w:p>
+              </w:tc>
+              <w:tc>
+                <w:tcPr>
+                  <w:tcW w:w="2831" w:type="dxa"/>
+                </w:tcPr>
+                <w:p>
+                  <w:pPr>
+                    <w:cnfStyle w:val="000000000000" w:firstRow="0" w:lastRow="0" w:firstColumn="0" w:lastColumn="0" w:oddVBand="0" w:evenVBand="0" w:oddHBand="0" w:evenHBand="0" w:firstRowFirstColumn="0" w:firstRowLastColumn="0" w:lastRowFirstColumn="0" w:lastRowLastColumn="0"/>
+                  </w:pPr>
+                  <w:hyperlink r:id="rId42" w:history="1">
+                    <w:r>
+                      <w:rPr>
+                        <w:rStyle w:val="Hyperlink"/>
+                      </w:rPr>
+                      <w:t>https://www.hugo-international.org</w:t>
+                    </w:r>
+                  </w:hyperlink>
+                  <w:r>
+                    <w:t xml:space="preserve"> </w:t>
+                  </w:r>
+                  <w:bookmarkStart w:id="1" w:name="_GoBack"/>
+                  <w:bookmarkEnd w:id="1"/>
                 </w:p>
               </w:tc>
             </w:tr>
@@ -7119,7 +8973,7 @@
               </w:rPr>
               <w:t xml:space="preserve"> - </w:t>
             </w:r>
-            <w:hyperlink r:id="rId20" w:history="1">
+            <w:hyperlink r:id="rId43" w:history="1">
               <w:r>
                 <w:rPr>
                   <w:rStyle w:val="Hyperlink"/>
@@ -7153,7 +9007,19 @@
                 <w:szCs w:val="24"/>
                 <w:lang w:val="en-GB"/>
               </w:rPr>
-              <w:t>) which mandates or recommends publishing open access?  If yes, please provide details</w:t>
+              <w:t xml:space="preserve">) which mandates or </w:t>
+            </w:r>
+            <w:r>
+              <w:rPr>
+                <w:rFonts w:ascii="Calibri Light" w:hAnsi="Calibri Light" w:cs="Calibri Light"/>
+                <w:b/>
+                <w:bCs/>
+                <w:sz w:val="24"/>
+                <w:szCs w:val="24"/>
+                <w:lang w:val="en-GB"/>
+              </w:rPr>
+              <w:lastRenderedPageBreak/>
+              <w:t>recommends publishing open access?  If yes, please provide details</w:t>
             </w:r>
             <w:r>
               <w:rPr>
@@ -7178,7 +9044,7 @@
               </w:rPr>
               <w:t xml:space="preserve">: </w:t>
             </w:r>
-            <w:hyperlink r:id="rId21" w:history="1">
+            <w:hyperlink r:id="rId44" w:history="1">
               <w:r>
                 <w:rPr>
                   <w:rStyle w:val="Hyperlink"/>
@@ -7431,7 +9297,27 @@
                 <w:sz w:val="24"/>
                 <w:szCs w:val="24"/>
               </w:rPr>
-              <w:t>Will part or all of your book be Open Access? (If so, please list those parts for which Open Access funding might become available, from where the funds will come and when)</w:t>
+              <w:t xml:space="preserve">Will part or </w:t>
+            </w:r>
+            <w:proofErr w:type="gramStart"/>
+            <w:r>
+              <w:rPr>
+                <w:rFonts w:ascii="Calibri Light" w:hAnsi="Calibri Light" w:cs="Calibri Light"/>
+                <w:b/>
+                <w:sz w:val="24"/>
+                <w:szCs w:val="24"/>
+              </w:rPr>
+              <w:t>all of your</w:t>
+            </w:r>
+            <w:proofErr w:type="gramEnd"/>
+            <w:r>
+              <w:rPr>
+                <w:rFonts w:ascii="Calibri Light" w:hAnsi="Calibri Light" w:cs="Calibri Light"/>
+                <w:b/>
+                <w:sz w:val="24"/>
+                <w:szCs w:val="24"/>
+              </w:rPr>
+              <w:t xml:space="preserve"> book be Open Access? (If so, please list those parts for which Open Access funding might become available, from where the funds will come and when)</w:t>
             </w:r>
           </w:p>
           <w:tbl>
@@ -7772,7 +9658,23 @@
                 <w:rFonts w:ascii="Calibri Light" w:hAnsi="Calibri Light" w:cs="Calibri Light"/>
                 <w:snapToGrid w:val="0"/>
               </w:rPr>
-              <w:t xml:space="preserve">What level is the corresponding course taught? </w:t>
+              <w:t xml:space="preserve">What level </w:t>
+            </w:r>
+            <w:proofErr w:type="gramStart"/>
+            <w:r>
+              <w:rPr>
+                <w:rFonts w:ascii="Calibri Light" w:hAnsi="Calibri Light" w:cs="Calibri Light"/>
+                <w:snapToGrid w:val="0"/>
+              </w:rPr>
+              <w:t>is the corresponding course taught</w:t>
+            </w:r>
+            <w:proofErr w:type="gramEnd"/>
+            <w:r>
+              <w:rPr>
+                <w:rFonts w:ascii="Calibri Light" w:hAnsi="Calibri Light" w:cs="Calibri Light"/>
+                <w:snapToGrid w:val="0"/>
+              </w:rPr>
+              <w:t xml:space="preserve">? </w:t>
             </w:r>
             <w:r>
               <w:rPr>
@@ -8088,7 +9990,6 @@
                 <w:sz w:val="24"/>
                 <w:szCs w:val="24"/>
               </w:rPr>
-              <w:lastRenderedPageBreak/>
               <w:t>Please name several of the universities (global) that teach this course.  This helps our textbook adoption team identify lecturers that might adopt your book.</w:t>
             </w:r>
           </w:p>
@@ -8128,7 +10029,25 @@
                 <w:sz w:val="24"/>
                 <w:szCs w:val="24"/>
               </w:rPr>
-              <w:t>What classes must be taken as a prerequisite?</w:t>
+              <w:t xml:space="preserve">What classes </w:t>
+            </w:r>
+            <w:proofErr w:type="gramStart"/>
+            <w:r>
+              <w:rPr>
+                <w:rFonts w:ascii="Calibri Light" w:hAnsi="Calibri Light" w:cs="Calibri Light"/>
+                <w:sz w:val="24"/>
+                <w:szCs w:val="24"/>
+              </w:rPr>
+              <w:t>must be taken</w:t>
+            </w:r>
+            <w:proofErr w:type="gramEnd"/>
+            <w:r>
+              <w:rPr>
+                <w:rFonts w:ascii="Calibri Light" w:hAnsi="Calibri Light" w:cs="Calibri Light"/>
+                <w:sz w:val="24"/>
+                <w:szCs w:val="24"/>
+              </w:rPr>
+              <w:t xml:space="preserve"> as a prerequisite?</w:t>
             </w:r>
           </w:p>
           <w:p>
@@ -8168,7 +10087,25 @@
                 <w:sz w:val="24"/>
                 <w:szCs w:val="24"/>
               </w:rPr>
-              <w:t>What classes are normally taken after?</w:t>
+              <w:t xml:space="preserve">What classes </w:t>
+            </w:r>
+            <w:proofErr w:type="gramStart"/>
+            <w:r>
+              <w:rPr>
+                <w:rFonts w:ascii="Calibri Light" w:hAnsi="Calibri Light" w:cs="Calibri Light"/>
+                <w:sz w:val="24"/>
+                <w:szCs w:val="24"/>
+              </w:rPr>
+              <w:t>are normally taken</w:t>
+            </w:r>
+            <w:proofErr w:type="gramEnd"/>
+            <w:r>
+              <w:rPr>
+                <w:rFonts w:ascii="Calibri Light" w:hAnsi="Calibri Light" w:cs="Calibri Light"/>
+                <w:sz w:val="24"/>
+                <w:szCs w:val="24"/>
+              </w:rPr>
+              <w:t xml:space="preserve"> after?</w:t>
             </w:r>
           </w:p>
           <w:p>
@@ -8209,6 +10146,7 @@
                 <w:sz w:val="24"/>
                 <w:szCs w:val="24"/>
               </w:rPr>
+              <w:lastRenderedPageBreak/>
               <w:t xml:space="preserve">If you are teaching such a course, then what book do you currently use as a text?  </w:t>
             </w:r>
           </w:p>
@@ -9107,8 +11045,17 @@
           <w:rFonts w:ascii="Calibri Light" w:hAnsi="Calibri Light" w:cs="Calibri Light"/>
           <w:snapToGrid w:val="0"/>
         </w:rPr>
-        <w:t xml:space="preserve"> are permitted</w:t>
+        <w:t xml:space="preserve"> </w:t>
       </w:r>
+      <w:proofErr w:type="gramStart"/>
+      <w:r>
+        <w:rPr>
+          <w:rFonts w:ascii="Calibri Light" w:hAnsi="Calibri Light" w:cs="Calibri Light"/>
+          <w:snapToGrid w:val="0"/>
+        </w:rPr>
+        <w:t>are permitted</w:t>
+      </w:r>
+      <w:proofErr w:type="gramEnd"/>
       <w:r>
         <w:rPr>
           <w:rFonts w:ascii="Calibri Light" w:hAnsi="Calibri Light" w:cs="Calibri Light"/>
@@ -9191,7 +11138,7 @@
           <w:iCs/>
         </w:rPr>
       </w:pPr>
-      <w:hyperlink r:id="rId22" w:history="1">
+      <w:hyperlink r:id="rId45" w:history="1">
         <w:r>
           <w:rPr>
             <w:rStyle w:val="Hyperlink"/>
@@ -9214,7 +11161,6 @@
           <w:rFonts w:ascii="Calibri Light" w:hAnsi="Calibri Light" w:cs="Calibri Light"/>
           <w:iCs/>
         </w:rPr>
-        <w:lastRenderedPageBreak/>
         <w:t>Tel: 510-710-2712</w:t>
       </w:r>
     </w:p>
@@ -9225,7 +11171,7 @@
           <w:rFonts w:ascii="Calibri Light" w:hAnsi="Calibri Light" w:cs="Calibri Light"/>
         </w:rPr>
       </w:pPr>
-      <w:hyperlink r:id="rId23" w:history="1">
+      <w:hyperlink r:id="rId46" w:history="1">
         <w:r>
           <w:rPr>
             <w:rStyle w:val="Hyperlink"/>
@@ -9252,7 +11198,7 @@
 </file>
 
 <file path=word/endnotes.xml><?xml version="1.0" encoding="utf-8"?>
-<w:endnotes xmlns:wpc="http://schemas.microsoft.com/office/word/2010/wordprocessingCanvas" xmlns:cx="http://schemas.microsoft.com/office/drawing/2014/chartex" xmlns:cx1="http://schemas.microsoft.com/office/drawing/2015/9/8/chartex" xmlns:cx2="http://schemas.microsoft.com/office/drawing/2015/10/21/chartex" xmlns:cx3="http://schemas.microsoft.com/office/drawing/2016/5/9/chartex" xmlns:cx4="http://schemas.microsoft.com/office/drawing/2016/5/10/chartex" xmlns:cx5="http://schemas.microsoft.com/office/drawing/2016/5/11/chartex" xmlns:cx6="http://schemas.microsoft.com/office/drawing/2016/5/12/chartex" xmlns:cx7="http://schemas.microsoft.com/office/drawing/2016/5/13/chartex" xmlns:cx8="http://schemas.microsoft.com/office/drawing/2016/5/14/chartex" xmlns:mc="http://schemas.openxmlformats.org/markup-compatibility/2006" xmlns:aink="http://schemas.microsoft.com/office/drawing/2016/ink" xmlns:am3d="http://schemas.microsoft.com/office/drawing/2017/model3d" xmlns:o="urn:schemas-microsoft-com:office:office" xmlns:oel="http://schemas.microsoft.com/office/2019/extlst" xmlns:r="http://schemas.openxmlformats.org/officeDocument/2006/relationships" xmlns:m="http://schemas.openxmlformats.org/officeDocument/2006/math" xmlns:v="urn:schemas-microsoft-com:vml" xmlns:wp14="http://schemas.microsoft.com/office/word/2010/wordprocessingDrawing" xmlns:wp="http://schemas.openxmlformats.org/drawingml/2006/wordprocessingDrawing" xmlns:w10="urn:schemas-microsoft-com:office:word" xmlns:w="http://schemas.openxmlformats.org/wordprocessingml/2006/main" xmlns:w14="http://schemas.microsoft.com/office/word/2010/wordml" xmlns:w15="http://schemas.microsoft.com/office/word/2012/wordml" xmlns:w16cex="http://schemas.microsoft.com/office/word/2018/wordml/cex" xmlns:w16cid="http://schemas.microsoft.com/office/word/2016/wordml/cid" xmlns:w16="http://schemas.microsoft.com/office/word/2018/wordml" xmlns:w16du="http://schemas.microsoft.com/office/word/2023/wordml/word16du" xmlns:w16sdtdh="http://schemas.microsoft.com/office/word/2020/wordml/sdtdatahash" xmlns:w16sdtfl="http://schemas.microsoft.com/office/word/2024/wordml/sdtformatlock" xmlns:w16se="http://schemas.microsoft.com/office/word/2015/wordml/symex" xmlns:wpg="http://schemas.microsoft.com/office/word/2010/wordprocessingGroup" xmlns:wpi="http://schemas.microsoft.com/office/word/2010/wordprocessingInk" xmlns:wne="http://schemas.microsoft.com/office/word/2006/wordml" xmlns:wps="http://schemas.microsoft.com/office/word/2010/wordprocessingShape" mc:Ignorable="w14 w15 w16se w16cid w16 w16cex w16sdtdh w16sdtfl w16du wp14">
+<w:endnotes xmlns:wpc="http://schemas.microsoft.com/office/word/2010/wordprocessingCanvas" xmlns:mc="http://schemas.openxmlformats.org/markup-compatibility/2006" xmlns:o="urn:schemas-microsoft-com:office:office" xmlns:r="http://schemas.openxmlformats.org/officeDocument/2006/relationships" xmlns:m="http://schemas.openxmlformats.org/officeDocument/2006/math" xmlns:v="urn:schemas-microsoft-com:vml" xmlns:wp14="http://schemas.microsoft.com/office/word/2010/wordprocessingDrawing" xmlns:wp="http://schemas.openxmlformats.org/drawingml/2006/wordprocessingDrawing" xmlns:w10="urn:schemas-microsoft-com:office:word" xmlns:w="http://schemas.openxmlformats.org/wordprocessingml/2006/main" xmlns:w14="http://schemas.microsoft.com/office/word/2010/wordml" xmlns:w15="http://schemas.microsoft.com/office/word/2012/wordml" xmlns:wpg="http://schemas.microsoft.com/office/word/2010/wordprocessingGroup" xmlns:wpi="http://schemas.microsoft.com/office/word/2010/wordprocessingInk" xmlns:wne="http://schemas.microsoft.com/office/word/2006/wordml" xmlns:wps="http://schemas.microsoft.com/office/word/2010/wordprocessingShape" mc:Ignorable="w14 w15 wp14">
   <w:endnote w:type="separator" w:id="-1">
     <w:p>
       <w:r>
@@ -9271,7 +11217,7 @@
 </file>
 
 <file path=word/footer1.xml><?xml version="1.0" encoding="utf-8"?>
-<w:ftr xmlns:wpc="http://schemas.microsoft.com/office/word/2010/wordprocessingCanvas" xmlns:cx="http://schemas.microsoft.com/office/drawing/2014/chartex" xmlns:cx1="http://schemas.microsoft.com/office/drawing/2015/9/8/chartex" xmlns:cx2="http://schemas.microsoft.com/office/drawing/2015/10/21/chartex" xmlns:cx3="http://schemas.microsoft.com/office/drawing/2016/5/9/chartex" xmlns:cx4="http://schemas.microsoft.com/office/drawing/2016/5/10/chartex" xmlns:cx5="http://schemas.microsoft.com/office/drawing/2016/5/11/chartex" xmlns:cx6="http://schemas.microsoft.com/office/drawing/2016/5/12/chartex" xmlns:cx7="http://schemas.microsoft.com/office/drawing/2016/5/13/chartex" xmlns:cx8="http://schemas.microsoft.com/office/drawing/2016/5/14/chartex" xmlns:mc="http://schemas.openxmlformats.org/markup-compatibility/2006" xmlns:aink="http://schemas.microsoft.com/office/drawing/2016/ink" xmlns:am3d="http://schemas.microsoft.com/office/drawing/2017/model3d" xmlns:o="urn:schemas-microsoft-com:office:office" xmlns:oel="http://schemas.microsoft.com/office/2019/extlst" xmlns:r="http://schemas.openxmlformats.org/officeDocument/2006/relationships" xmlns:m="http://schemas.openxmlformats.org/officeDocument/2006/math" xmlns:v="urn:schemas-microsoft-com:vml" xmlns:wp14="http://schemas.microsoft.com/office/word/2010/wordprocessingDrawing" xmlns:wp="http://schemas.openxmlformats.org/drawingml/2006/wordprocessingDrawing" xmlns:w10="urn:schemas-microsoft-com:office:word" xmlns:w="http://schemas.openxmlformats.org/wordprocessingml/2006/main" xmlns:w14="http://schemas.microsoft.com/office/word/2010/wordml" xmlns:w15="http://schemas.microsoft.com/office/word/2012/wordml" xmlns:w16cex="http://schemas.microsoft.com/office/word/2018/wordml/cex" xmlns:w16cid="http://schemas.microsoft.com/office/word/2016/wordml/cid" xmlns:w16="http://schemas.microsoft.com/office/word/2018/wordml" xmlns:w16du="http://schemas.microsoft.com/office/word/2023/wordml/word16du" xmlns:w16sdtdh="http://schemas.microsoft.com/office/word/2020/wordml/sdtdatahash" xmlns:w16sdtfl="http://schemas.microsoft.com/office/word/2024/wordml/sdtformatlock" xmlns:w16se="http://schemas.microsoft.com/office/word/2015/wordml/symex" xmlns:wpg="http://schemas.microsoft.com/office/word/2010/wordprocessingGroup" xmlns:wpi="http://schemas.microsoft.com/office/word/2010/wordprocessingInk" xmlns:wne="http://schemas.microsoft.com/office/word/2006/wordml" xmlns:wps="http://schemas.microsoft.com/office/word/2010/wordprocessingShape" mc:Ignorable="w14 w15 w16se w16cid w16 w16cex w16sdtdh w16sdtfl w16du wp14">
+<w:ftr xmlns:wpc="http://schemas.microsoft.com/office/word/2010/wordprocessingCanvas" xmlns:mc="http://schemas.openxmlformats.org/markup-compatibility/2006" xmlns:o="urn:schemas-microsoft-com:office:office" xmlns:r="http://schemas.openxmlformats.org/officeDocument/2006/relationships" xmlns:m="http://schemas.openxmlformats.org/officeDocument/2006/math" xmlns:v="urn:schemas-microsoft-com:vml" xmlns:wp14="http://schemas.microsoft.com/office/word/2010/wordprocessingDrawing" xmlns:wp="http://schemas.openxmlformats.org/drawingml/2006/wordprocessingDrawing" xmlns:w10="urn:schemas-microsoft-com:office:word" xmlns:w="http://schemas.openxmlformats.org/wordprocessingml/2006/main" xmlns:w14="http://schemas.microsoft.com/office/word/2010/wordml" xmlns:w15="http://schemas.microsoft.com/office/word/2012/wordml" xmlns:wpg="http://schemas.microsoft.com/office/word/2010/wordprocessingGroup" xmlns:wpi="http://schemas.microsoft.com/office/word/2010/wordprocessingInk" xmlns:wne="http://schemas.microsoft.com/office/word/2006/wordml" xmlns:wps="http://schemas.microsoft.com/office/word/2010/wordprocessingShape" mc:Ignorable="w14 w15 wp14">
   <w:p>
     <w:pPr>
       <w:pStyle w:val="Footer"/>
@@ -9281,7 +11227,7 @@
 </file>
 
 <file path=word/footer2.xml><?xml version="1.0" encoding="utf-8"?>
-<w:ftr xmlns:wpc="http://schemas.microsoft.com/office/word/2010/wordprocessingCanvas" xmlns:cx="http://schemas.microsoft.com/office/drawing/2014/chartex" xmlns:cx1="http://schemas.microsoft.com/office/drawing/2015/9/8/chartex" xmlns:cx2="http://schemas.microsoft.com/office/drawing/2015/10/21/chartex" xmlns:cx3="http://schemas.microsoft.com/office/drawing/2016/5/9/chartex" xmlns:cx4="http://schemas.microsoft.com/office/drawing/2016/5/10/chartex" xmlns:cx5="http://schemas.microsoft.com/office/drawing/2016/5/11/chartex" xmlns:cx6="http://schemas.microsoft.com/office/drawing/2016/5/12/chartex" xmlns:cx7="http://schemas.microsoft.com/office/drawing/2016/5/13/chartex" xmlns:cx8="http://schemas.microsoft.com/office/drawing/2016/5/14/chartex" xmlns:mc="http://schemas.openxmlformats.org/markup-compatibility/2006" xmlns:aink="http://schemas.microsoft.com/office/drawing/2016/ink" xmlns:am3d="http://schemas.microsoft.com/office/drawing/2017/model3d" xmlns:o="urn:schemas-microsoft-com:office:office" xmlns:oel="http://schemas.microsoft.com/office/2019/extlst" xmlns:r="http://schemas.openxmlformats.org/officeDocument/2006/relationships" xmlns:m="http://schemas.openxmlformats.org/officeDocument/2006/math" xmlns:v="urn:schemas-microsoft-com:vml" xmlns:wp14="http://schemas.microsoft.com/office/word/2010/wordprocessingDrawing" xmlns:wp="http://schemas.openxmlformats.org/drawingml/2006/wordprocessingDrawing" xmlns:w10="urn:schemas-microsoft-com:office:word" xmlns:w="http://schemas.openxmlformats.org/wordprocessingml/2006/main" xmlns:w14="http://schemas.microsoft.com/office/word/2010/wordml" xmlns:w15="http://schemas.microsoft.com/office/word/2012/wordml" xmlns:w16cex="http://schemas.microsoft.com/office/word/2018/wordml/cex" xmlns:w16cid="http://schemas.microsoft.com/office/word/2016/wordml/cid" xmlns:w16="http://schemas.microsoft.com/office/word/2018/wordml" xmlns:w16du="http://schemas.microsoft.com/office/word/2023/wordml/word16du" xmlns:w16sdtdh="http://schemas.microsoft.com/office/word/2020/wordml/sdtdatahash" xmlns:w16sdtfl="http://schemas.microsoft.com/office/word/2024/wordml/sdtformatlock" xmlns:w16se="http://schemas.microsoft.com/office/word/2015/wordml/symex" xmlns:wpg="http://schemas.microsoft.com/office/word/2010/wordprocessingGroup" xmlns:wpi="http://schemas.microsoft.com/office/word/2010/wordprocessingInk" xmlns:wne="http://schemas.microsoft.com/office/word/2006/wordml" xmlns:wps="http://schemas.microsoft.com/office/word/2010/wordprocessingShape" mc:Ignorable="w14 w15 w16se w16cid w16 w16cex w16sdtdh w16sdtfl w16du wp14">
+<w:ftr xmlns:wpc="http://schemas.microsoft.com/office/word/2010/wordprocessingCanvas" xmlns:mc="http://schemas.openxmlformats.org/markup-compatibility/2006" xmlns:o="urn:schemas-microsoft-com:office:office" xmlns:r="http://schemas.openxmlformats.org/officeDocument/2006/relationships" xmlns:m="http://schemas.openxmlformats.org/officeDocument/2006/math" xmlns:v="urn:schemas-microsoft-com:vml" xmlns:wp14="http://schemas.microsoft.com/office/word/2010/wordprocessingDrawing" xmlns:wp="http://schemas.openxmlformats.org/drawingml/2006/wordprocessingDrawing" xmlns:w10="urn:schemas-microsoft-com:office:word" xmlns:w="http://schemas.openxmlformats.org/wordprocessingml/2006/main" xmlns:w14="http://schemas.microsoft.com/office/word/2010/wordml" xmlns:w15="http://schemas.microsoft.com/office/word/2012/wordml" xmlns:wpg="http://schemas.microsoft.com/office/word/2010/wordprocessingGroup" xmlns:wpi="http://schemas.microsoft.com/office/word/2010/wordprocessingInk" xmlns:wne="http://schemas.microsoft.com/office/word/2006/wordml" xmlns:wps="http://schemas.microsoft.com/office/word/2010/wordprocessingShape" mc:Ignorable="w14 w15 wp14">
   <w:sdt>
     <w:sdtPr>
       <w:id w:val="22653012"/>
@@ -9290,7 +11236,6 @@
         <w:docPartUnique/>
       </w:docPartObj>
     </w:sdtPr>
-    <w:sdtEndPr/>
     <w:sdtContent>
       <w:p>
         <w:pPr>
@@ -9345,7 +11290,7 @@
           <w:rPr>
             <w:noProof/>
           </w:rPr>
-          <w:t>8</w:t>
+          <w:t>9</w:t>
         </w:r>
         <w:r>
           <w:rPr>
@@ -9365,7 +11310,7 @@
 </file>
 
 <file path=word/footer3.xml><?xml version="1.0" encoding="utf-8"?>
-<w:ftr xmlns:wpc="http://schemas.microsoft.com/office/word/2010/wordprocessingCanvas" xmlns:cx="http://schemas.microsoft.com/office/drawing/2014/chartex" xmlns:cx1="http://schemas.microsoft.com/office/drawing/2015/9/8/chartex" xmlns:cx2="http://schemas.microsoft.com/office/drawing/2015/10/21/chartex" xmlns:cx3="http://schemas.microsoft.com/office/drawing/2016/5/9/chartex" xmlns:cx4="http://schemas.microsoft.com/office/drawing/2016/5/10/chartex" xmlns:cx5="http://schemas.microsoft.com/office/drawing/2016/5/11/chartex" xmlns:cx6="http://schemas.microsoft.com/office/drawing/2016/5/12/chartex" xmlns:cx7="http://schemas.microsoft.com/office/drawing/2016/5/13/chartex" xmlns:cx8="http://schemas.microsoft.com/office/drawing/2016/5/14/chartex" xmlns:mc="http://schemas.openxmlformats.org/markup-compatibility/2006" xmlns:aink="http://schemas.microsoft.com/office/drawing/2016/ink" xmlns:am3d="http://schemas.microsoft.com/office/drawing/2017/model3d" xmlns:o="urn:schemas-microsoft-com:office:office" xmlns:oel="http://schemas.microsoft.com/office/2019/extlst" xmlns:r="http://schemas.openxmlformats.org/officeDocument/2006/relationships" xmlns:m="http://schemas.openxmlformats.org/officeDocument/2006/math" xmlns:v="urn:schemas-microsoft-com:vml" xmlns:wp14="http://schemas.microsoft.com/office/word/2010/wordprocessingDrawing" xmlns:wp="http://schemas.openxmlformats.org/drawingml/2006/wordprocessingDrawing" xmlns:w10="urn:schemas-microsoft-com:office:word" xmlns:w="http://schemas.openxmlformats.org/wordprocessingml/2006/main" xmlns:w14="http://schemas.microsoft.com/office/word/2010/wordml" xmlns:w15="http://schemas.microsoft.com/office/word/2012/wordml" xmlns:w16cex="http://schemas.microsoft.com/office/word/2018/wordml/cex" xmlns:w16cid="http://schemas.microsoft.com/office/word/2016/wordml/cid" xmlns:w16="http://schemas.microsoft.com/office/word/2018/wordml" xmlns:w16du="http://schemas.microsoft.com/office/word/2023/wordml/word16du" xmlns:w16sdtdh="http://schemas.microsoft.com/office/word/2020/wordml/sdtdatahash" xmlns:w16sdtfl="http://schemas.microsoft.com/office/word/2024/wordml/sdtformatlock" xmlns:w16se="http://schemas.microsoft.com/office/word/2015/wordml/symex" xmlns:wpg="http://schemas.microsoft.com/office/word/2010/wordprocessingGroup" xmlns:wpi="http://schemas.microsoft.com/office/word/2010/wordprocessingInk" xmlns:wne="http://schemas.microsoft.com/office/word/2006/wordml" xmlns:wps="http://schemas.microsoft.com/office/word/2010/wordprocessingShape" mc:Ignorable="w14 w15 w16se w16cid w16 w16cex w16sdtdh w16sdtfl w16du wp14">
+<w:ftr xmlns:wpc="http://schemas.microsoft.com/office/word/2010/wordprocessingCanvas" xmlns:mc="http://schemas.openxmlformats.org/markup-compatibility/2006" xmlns:o="urn:schemas-microsoft-com:office:office" xmlns:r="http://schemas.openxmlformats.org/officeDocument/2006/relationships" xmlns:m="http://schemas.openxmlformats.org/officeDocument/2006/math" xmlns:v="urn:schemas-microsoft-com:vml" xmlns:wp14="http://schemas.microsoft.com/office/word/2010/wordprocessingDrawing" xmlns:wp="http://schemas.openxmlformats.org/drawingml/2006/wordprocessingDrawing" xmlns:w10="urn:schemas-microsoft-com:office:word" xmlns:w="http://schemas.openxmlformats.org/wordprocessingml/2006/main" xmlns:w14="http://schemas.microsoft.com/office/word/2010/wordml" xmlns:w15="http://schemas.microsoft.com/office/word/2012/wordml" xmlns:wpg="http://schemas.microsoft.com/office/word/2010/wordprocessingGroup" xmlns:wpi="http://schemas.microsoft.com/office/word/2010/wordprocessingInk" xmlns:wne="http://schemas.microsoft.com/office/word/2006/wordml" xmlns:wps="http://schemas.microsoft.com/office/word/2010/wordprocessingShape" mc:Ignorable="w14 w15 wp14">
   <w:p>
     <w:pPr>
       <w:pStyle w:val="Footer"/>
@@ -9375,7 +11320,7 @@
 </file>
 
 <file path=word/footnotes.xml><?xml version="1.0" encoding="utf-8"?>
-<w:footnotes xmlns:wpc="http://schemas.microsoft.com/office/word/2010/wordprocessingCanvas" xmlns:cx="http://schemas.microsoft.com/office/drawing/2014/chartex" xmlns:cx1="http://schemas.microsoft.com/office/drawing/2015/9/8/chartex" xmlns:cx2="http://schemas.microsoft.com/office/drawing/2015/10/21/chartex" xmlns:cx3="http://schemas.microsoft.com/office/drawing/2016/5/9/chartex" xmlns:cx4="http://schemas.microsoft.com/office/drawing/2016/5/10/chartex" xmlns:cx5="http://schemas.microsoft.com/office/drawing/2016/5/11/chartex" xmlns:cx6="http://schemas.microsoft.com/office/drawing/2016/5/12/chartex" xmlns:cx7="http://schemas.microsoft.com/office/drawing/2016/5/13/chartex" xmlns:cx8="http://schemas.microsoft.com/office/drawing/2016/5/14/chartex" xmlns:mc="http://schemas.openxmlformats.org/markup-compatibility/2006" xmlns:aink="http://schemas.microsoft.com/office/drawing/2016/ink" xmlns:am3d="http://schemas.microsoft.com/office/drawing/2017/model3d" xmlns:o="urn:schemas-microsoft-com:office:office" xmlns:oel="http://schemas.microsoft.com/office/2019/extlst" xmlns:r="http://schemas.openxmlformats.org/officeDocument/2006/relationships" xmlns:m="http://schemas.openxmlformats.org/officeDocument/2006/math" xmlns:v="urn:schemas-microsoft-com:vml" xmlns:wp14="http://schemas.microsoft.com/office/word/2010/wordprocessingDrawing" xmlns:wp="http://schemas.openxmlformats.org/drawingml/2006/wordprocessingDrawing" xmlns:w10="urn:schemas-microsoft-com:office:word" xmlns:w="http://schemas.openxmlformats.org/wordprocessingml/2006/main" xmlns:w14="http://schemas.microsoft.com/office/word/2010/wordml" xmlns:w15="http://schemas.microsoft.com/office/word/2012/wordml" xmlns:w16cex="http://schemas.microsoft.com/office/word/2018/wordml/cex" xmlns:w16cid="http://schemas.microsoft.com/office/word/2016/wordml/cid" xmlns:w16="http://schemas.microsoft.com/office/word/2018/wordml" xmlns:w16du="http://schemas.microsoft.com/office/word/2023/wordml/word16du" xmlns:w16sdtdh="http://schemas.microsoft.com/office/word/2020/wordml/sdtdatahash" xmlns:w16sdtfl="http://schemas.microsoft.com/office/word/2024/wordml/sdtformatlock" xmlns:w16se="http://schemas.microsoft.com/office/word/2015/wordml/symex" xmlns:wpg="http://schemas.microsoft.com/office/word/2010/wordprocessingGroup" xmlns:wpi="http://schemas.microsoft.com/office/word/2010/wordprocessingInk" xmlns:wne="http://schemas.microsoft.com/office/word/2006/wordml" xmlns:wps="http://schemas.microsoft.com/office/word/2010/wordprocessingShape" mc:Ignorable="w14 w15 w16se w16cid w16 w16cex w16sdtdh w16sdtfl w16du wp14">
+<w:footnotes xmlns:wpc="http://schemas.microsoft.com/office/word/2010/wordprocessingCanvas" xmlns:mc="http://schemas.openxmlformats.org/markup-compatibility/2006" xmlns:o="urn:schemas-microsoft-com:office:office" xmlns:r="http://schemas.openxmlformats.org/officeDocument/2006/relationships" xmlns:m="http://schemas.openxmlformats.org/officeDocument/2006/math" xmlns:v="urn:schemas-microsoft-com:vml" xmlns:wp14="http://schemas.microsoft.com/office/word/2010/wordprocessingDrawing" xmlns:wp="http://schemas.openxmlformats.org/drawingml/2006/wordprocessingDrawing" xmlns:w10="urn:schemas-microsoft-com:office:word" xmlns:w="http://schemas.openxmlformats.org/wordprocessingml/2006/main" xmlns:w14="http://schemas.microsoft.com/office/word/2010/wordml" xmlns:w15="http://schemas.microsoft.com/office/word/2012/wordml" xmlns:wpg="http://schemas.microsoft.com/office/word/2010/wordprocessingGroup" xmlns:wpi="http://schemas.microsoft.com/office/word/2010/wordprocessingInk" xmlns:wne="http://schemas.microsoft.com/office/word/2006/wordml" xmlns:wps="http://schemas.microsoft.com/office/word/2010/wordprocessingShape" mc:Ignorable="w14 w15 wp14">
   <w:footnote w:type="separator" w:id="-1">
     <w:p>
       <w:r>
@@ -9394,7 +11339,7 @@
 </file>
 
 <file path=word/header1.xml><?xml version="1.0" encoding="utf-8"?>
-<w:hdr xmlns:wpc="http://schemas.microsoft.com/office/word/2010/wordprocessingCanvas" xmlns:cx="http://schemas.microsoft.com/office/drawing/2014/chartex" xmlns:cx1="http://schemas.microsoft.com/office/drawing/2015/9/8/chartex" xmlns:cx2="http://schemas.microsoft.com/office/drawing/2015/10/21/chartex" xmlns:cx3="http://schemas.microsoft.com/office/drawing/2016/5/9/chartex" xmlns:cx4="http://schemas.microsoft.com/office/drawing/2016/5/10/chartex" xmlns:cx5="http://schemas.microsoft.com/office/drawing/2016/5/11/chartex" xmlns:cx6="http://schemas.microsoft.com/office/drawing/2016/5/12/chartex" xmlns:cx7="http://schemas.microsoft.com/office/drawing/2016/5/13/chartex" xmlns:cx8="http://schemas.microsoft.com/office/drawing/2016/5/14/chartex" xmlns:mc="http://schemas.openxmlformats.org/markup-compatibility/2006" xmlns:aink="http://schemas.microsoft.com/office/drawing/2016/ink" xmlns:am3d="http://schemas.microsoft.com/office/drawing/2017/model3d" xmlns:o="urn:schemas-microsoft-com:office:office" xmlns:oel="http://schemas.microsoft.com/office/2019/extlst" xmlns:r="http://schemas.openxmlformats.org/officeDocument/2006/relationships" xmlns:m="http://schemas.openxmlformats.org/officeDocument/2006/math" xmlns:v="urn:schemas-microsoft-com:vml" xmlns:wp14="http://schemas.microsoft.com/office/word/2010/wordprocessingDrawing" xmlns:wp="http://schemas.openxmlformats.org/drawingml/2006/wordprocessingDrawing" xmlns:w10="urn:schemas-microsoft-com:office:word" xmlns:w="http://schemas.openxmlformats.org/wordprocessingml/2006/main" xmlns:w14="http://schemas.microsoft.com/office/word/2010/wordml" xmlns:w15="http://schemas.microsoft.com/office/word/2012/wordml" xmlns:w16cex="http://schemas.microsoft.com/office/word/2018/wordml/cex" xmlns:w16cid="http://schemas.microsoft.com/office/word/2016/wordml/cid" xmlns:w16="http://schemas.microsoft.com/office/word/2018/wordml" xmlns:w16du="http://schemas.microsoft.com/office/word/2023/wordml/word16du" xmlns:w16sdtdh="http://schemas.microsoft.com/office/word/2020/wordml/sdtdatahash" xmlns:w16sdtfl="http://schemas.microsoft.com/office/word/2024/wordml/sdtformatlock" xmlns:w16se="http://schemas.microsoft.com/office/word/2015/wordml/symex" xmlns:wpg="http://schemas.microsoft.com/office/word/2010/wordprocessingGroup" xmlns:wpi="http://schemas.microsoft.com/office/word/2010/wordprocessingInk" xmlns:wne="http://schemas.microsoft.com/office/word/2006/wordml" xmlns:wps="http://schemas.microsoft.com/office/word/2010/wordprocessingShape" mc:Ignorable="w14 w15 w16se w16cid w16 w16cex w16sdtdh w16sdtfl w16du wp14">
+<w:hdr xmlns:wpc="http://schemas.microsoft.com/office/word/2010/wordprocessingCanvas" xmlns:mc="http://schemas.openxmlformats.org/markup-compatibility/2006" xmlns:o="urn:schemas-microsoft-com:office:office" xmlns:r="http://schemas.openxmlformats.org/officeDocument/2006/relationships" xmlns:m="http://schemas.openxmlformats.org/officeDocument/2006/math" xmlns:v="urn:schemas-microsoft-com:vml" xmlns:wp14="http://schemas.microsoft.com/office/word/2010/wordprocessingDrawing" xmlns:wp="http://schemas.openxmlformats.org/drawingml/2006/wordprocessingDrawing" xmlns:w10="urn:schemas-microsoft-com:office:word" xmlns:w="http://schemas.openxmlformats.org/wordprocessingml/2006/main" xmlns:w14="http://schemas.microsoft.com/office/word/2010/wordml" xmlns:w15="http://schemas.microsoft.com/office/word/2012/wordml" xmlns:wpg="http://schemas.microsoft.com/office/word/2010/wordprocessingGroup" xmlns:wpi="http://schemas.microsoft.com/office/word/2010/wordprocessingInk" xmlns:wne="http://schemas.microsoft.com/office/word/2006/wordml" xmlns:wps="http://schemas.microsoft.com/office/word/2010/wordprocessingShape" mc:Ignorable="w14 w15 wp14">
   <w:p>
     <w:pPr>
       <w:pStyle w:val="Header"/>
@@ -9404,7 +11349,7 @@
 </file>
 
 <file path=word/header2.xml><?xml version="1.0" encoding="utf-8"?>
-<w:hdr xmlns:wpc="http://schemas.microsoft.com/office/word/2010/wordprocessingCanvas" xmlns:cx="http://schemas.microsoft.com/office/drawing/2014/chartex" xmlns:cx1="http://schemas.microsoft.com/office/drawing/2015/9/8/chartex" xmlns:cx2="http://schemas.microsoft.com/office/drawing/2015/10/21/chartex" xmlns:cx3="http://schemas.microsoft.com/office/drawing/2016/5/9/chartex" xmlns:cx4="http://schemas.microsoft.com/office/drawing/2016/5/10/chartex" xmlns:cx5="http://schemas.microsoft.com/office/drawing/2016/5/11/chartex" xmlns:cx6="http://schemas.microsoft.com/office/drawing/2016/5/12/chartex" xmlns:cx7="http://schemas.microsoft.com/office/drawing/2016/5/13/chartex" xmlns:cx8="http://schemas.microsoft.com/office/drawing/2016/5/14/chartex" xmlns:mc="http://schemas.openxmlformats.org/markup-compatibility/2006" xmlns:aink="http://schemas.microsoft.com/office/drawing/2016/ink" xmlns:am3d="http://schemas.microsoft.com/office/drawing/2017/model3d" xmlns:o="urn:schemas-microsoft-com:office:office" xmlns:oel="http://schemas.microsoft.com/office/2019/extlst" xmlns:r="http://schemas.openxmlformats.org/officeDocument/2006/relationships" xmlns:m="http://schemas.openxmlformats.org/officeDocument/2006/math" xmlns:v="urn:schemas-microsoft-com:vml" xmlns:wp14="http://schemas.microsoft.com/office/word/2010/wordprocessingDrawing" xmlns:wp="http://schemas.openxmlformats.org/drawingml/2006/wordprocessingDrawing" xmlns:w10="urn:schemas-microsoft-com:office:word" xmlns:w="http://schemas.openxmlformats.org/wordprocessingml/2006/main" xmlns:w14="http://schemas.microsoft.com/office/word/2010/wordml" xmlns:w15="http://schemas.microsoft.com/office/word/2012/wordml" xmlns:w16cex="http://schemas.microsoft.com/office/word/2018/wordml/cex" xmlns:w16cid="http://schemas.microsoft.com/office/word/2016/wordml/cid" xmlns:w16="http://schemas.microsoft.com/office/word/2018/wordml" xmlns:w16du="http://schemas.microsoft.com/office/word/2023/wordml/word16du" xmlns:w16sdtdh="http://schemas.microsoft.com/office/word/2020/wordml/sdtdatahash" xmlns:w16sdtfl="http://schemas.microsoft.com/office/word/2024/wordml/sdtformatlock" xmlns:w16se="http://schemas.microsoft.com/office/word/2015/wordml/symex" xmlns:wpg="http://schemas.microsoft.com/office/word/2010/wordprocessingGroup" xmlns:wpi="http://schemas.microsoft.com/office/word/2010/wordprocessingInk" xmlns:wne="http://schemas.microsoft.com/office/word/2006/wordml" xmlns:wps="http://schemas.microsoft.com/office/word/2010/wordprocessingShape" mc:Ignorable="w14 w15 w16se w16cid w16 w16cex w16sdtdh w16sdtfl w16du wp14">
+<w:hdr xmlns:wpc="http://schemas.microsoft.com/office/word/2010/wordprocessingCanvas" xmlns:mc="http://schemas.openxmlformats.org/markup-compatibility/2006" xmlns:o="urn:schemas-microsoft-com:office:office" xmlns:r="http://schemas.openxmlformats.org/officeDocument/2006/relationships" xmlns:m="http://schemas.openxmlformats.org/officeDocument/2006/math" xmlns:v="urn:schemas-microsoft-com:vml" xmlns:wp14="http://schemas.microsoft.com/office/word/2010/wordprocessingDrawing" xmlns:wp="http://schemas.openxmlformats.org/drawingml/2006/wordprocessingDrawing" xmlns:w10="urn:schemas-microsoft-com:office:word" xmlns:w="http://schemas.openxmlformats.org/wordprocessingml/2006/main" xmlns:w14="http://schemas.microsoft.com/office/word/2010/wordml" xmlns:w15="http://schemas.microsoft.com/office/word/2012/wordml" xmlns:wpg="http://schemas.microsoft.com/office/word/2010/wordprocessingGroup" xmlns:wpi="http://schemas.microsoft.com/office/word/2010/wordprocessingInk" xmlns:wne="http://schemas.microsoft.com/office/word/2006/wordml" xmlns:wps="http://schemas.microsoft.com/office/word/2010/wordprocessingShape" mc:Ignorable="w14 w15 wp14">
   <w:p>
     <w:pPr>
       <w:pStyle w:val="Header"/>
@@ -9472,7 +11417,7 @@
 </file>
 
 <file path=word/header3.xml><?xml version="1.0" encoding="utf-8"?>
-<w:hdr xmlns:wpc="http://schemas.microsoft.com/office/word/2010/wordprocessingCanvas" xmlns:cx="http://schemas.microsoft.com/office/drawing/2014/chartex" xmlns:cx1="http://schemas.microsoft.com/office/drawing/2015/9/8/chartex" xmlns:cx2="http://schemas.microsoft.com/office/drawing/2015/10/21/chartex" xmlns:cx3="http://schemas.microsoft.com/office/drawing/2016/5/9/chartex" xmlns:cx4="http://schemas.microsoft.com/office/drawing/2016/5/10/chartex" xmlns:cx5="http://schemas.microsoft.com/office/drawing/2016/5/11/chartex" xmlns:cx6="http://schemas.microsoft.com/office/drawing/2016/5/12/chartex" xmlns:cx7="http://schemas.microsoft.com/office/drawing/2016/5/13/chartex" xmlns:cx8="http://schemas.microsoft.com/office/drawing/2016/5/14/chartex" xmlns:mc="http://schemas.openxmlformats.org/markup-compatibility/2006" xmlns:aink="http://schemas.microsoft.com/office/drawing/2016/ink" xmlns:am3d="http://schemas.microsoft.com/office/drawing/2017/model3d" xmlns:o="urn:schemas-microsoft-com:office:office" xmlns:oel="http://schemas.microsoft.com/office/2019/extlst" xmlns:r="http://schemas.openxmlformats.org/officeDocument/2006/relationships" xmlns:m="http://schemas.openxmlformats.org/officeDocument/2006/math" xmlns:v="urn:schemas-microsoft-com:vml" xmlns:wp14="http://schemas.microsoft.com/office/word/2010/wordprocessingDrawing" xmlns:wp="http://schemas.openxmlformats.org/drawingml/2006/wordprocessingDrawing" xmlns:w10="urn:schemas-microsoft-com:office:word" xmlns:w="http://schemas.openxmlformats.org/wordprocessingml/2006/main" xmlns:w14="http://schemas.microsoft.com/office/word/2010/wordml" xmlns:w15="http://schemas.microsoft.com/office/word/2012/wordml" xmlns:w16cex="http://schemas.microsoft.com/office/word/2018/wordml/cex" xmlns:w16cid="http://schemas.microsoft.com/office/word/2016/wordml/cid" xmlns:w16="http://schemas.microsoft.com/office/word/2018/wordml" xmlns:w16du="http://schemas.microsoft.com/office/word/2023/wordml/word16du" xmlns:w16sdtdh="http://schemas.microsoft.com/office/word/2020/wordml/sdtdatahash" xmlns:w16sdtfl="http://schemas.microsoft.com/office/word/2024/wordml/sdtformatlock" xmlns:w16se="http://schemas.microsoft.com/office/word/2015/wordml/symex" xmlns:wpg="http://schemas.microsoft.com/office/word/2010/wordprocessingGroup" xmlns:wpi="http://schemas.microsoft.com/office/word/2010/wordprocessingInk" xmlns:wne="http://schemas.microsoft.com/office/word/2006/wordml" xmlns:wps="http://schemas.microsoft.com/office/word/2010/wordprocessingShape" mc:Ignorable="w14 w15 w16se w16cid w16 w16cex w16sdtdh w16sdtfl w16du wp14">
+<w:hdr xmlns:wpc="http://schemas.microsoft.com/office/word/2010/wordprocessingCanvas" xmlns:mc="http://schemas.openxmlformats.org/markup-compatibility/2006" xmlns:o="urn:schemas-microsoft-com:office:office" xmlns:r="http://schemas.openxmlformats.org/officeDocument/2006/relationships" xmlns:m="http://schemas.openxmlformats.org/officeDocument/2006/math" xmlns:v="urn:schemas-microsoft-com:vml" xmlns:wp14="http://schemas.microsoft.com/office/word/2010/wordprocessingDrawing" xmlns:wp="http://schemas.openxmlformats.org/drawingml/2006/wordprocessingDrawing" xmlns:w10="urn:schemas-microsoft-com:office:word" xmlns:w="http://schemas.openxmlformats.org/wordprocessingml/2006/main" xmlns:w14="http://schemas.microsoft.com/office/word/2010/wordml" xmlns:w15="http://schemas.microsoft.com/office/word/2012/wordml" xmlns:wpg="http://schemas.microsoft.com/office/word/2010/wordprocessingGroup" xmlns:wpi="http://schemas.microsoft.com/office/word/2010/wordprocessingInk" xmlns:wne="http://schemas.microsoft.com/office/word/2006/wordml" xmlns:wps="http://schemas.microsoft.com/office/word/2010/wordprocessingShape" mc:Ignorable="w14 w15 wp14">
   <w:p>
     <w:pPr>
       <w:pStyle w:val="Header"/>
@@ -9482,8 +11427,8 @@
 </file>
 
 <file path=word/numbering.xml><?xml version="1.0" encoding="utf-8"?>
-<w:numbering xmlns:wpc="http://schemas.microsoft.com/office/word/2010/wordprocessingCanvas" xmlns:cx="http://schemas.microsoft.com/office/drawing/2014/chartex" xmlns:cx1="http://schemas.microsoft.com/office/drawing/2015/9/8/chartex" xmlns:cx2="http://schemas.microsoft.com/office/drawing/2015/10/21/chartex" xmlns:cx3="http://schemas.microsoft.com/office/drawing/2016/5/9/chartex" xmlns:cx4="http://schemas.microsoft.com/office/drawing/2016/5/10/chartex" xmlns:cx5="http://schemas.microsoft.com/office/drawing/2016/5/11/chartex" xmlns:cx6="http://schemas.microsoft.com/office/drawing/2016/5/12/chartex" xmlns:cx7="http://schemas.microsoft.com/office/drawing/2016/5/13/chartex" xmlns:cx8="http://schemas.microsoft.com/office/drawing/2016/5/14/chartex" xmlns:mc="http://schemas.openxmlformats.org/markup-compatibility/2006" xmlns:aink="http://schemas.microsoft.com/office/drawing/2016/ink" xmlns:am3d="http://schemas.microsoft.com/office/drawing/2017/model3d" xmlns:o="urn:schemas-microsoft-com:office:office" xmlns:oel="http://schemas.microsoft.com/office/2019/extlst" xmlns:r="http://schemas.openxmlformats.org/officeDocument/2006/relationships" xmlns:m="http://schemas.openxmlformats.org/officeDocument/2006/math" xmlns:v="urn:schemas-microsoft-com:vml" xmlns:wp14="http://schemas.microsoft.com/office/word/2010/wordprocessingDrawing" xmlns:wp="http://schemas.openxmlformats.org/drawingml/2006/wordprocessingDrawing" xmlns:w10="urn:schemas-microsoft-com:office:word" xmlns:w="http://schemas.openxmlformats.org/wordprocessingml/2006/main" xmlns:w14="http://schemas.microsoft.com/office/word/2010/wordml" xmlns:w15="http://schemas.microsoft.com/office/word/2012/wordml" xmlns:w16cex="http://schemas.microsoft.com/office/word/2018/wordml/cex" xmlns:w16cid="http://schemas.microsoft.com/office/word/2016/wordml/cid" xmlns:w16="http://schemas.microsoft.com/office/word/2018/wordml" xmlns:w16du="http://schemas.microsoft.com/office/word/2023/wordml/word16du" xmlns:w16sdtdh="http://schemas.microsoft.com/office/word/2020/wordml/sdtdatahash" xmlns:w16sdtfl="http://schemas.microsoft.com/office/word/2024/wordml/sdtformatlock" xmlns:w16se="http://schemas.microsoft.com/office/word/2015/wordml/symex" xmlns:wpg="http://schemas.microsoft.com/office/word/2010/wordprocessingGroup" xmlns:wpi="http://schemas.microsoft.com/office/word/2010/wordprocessingInk" xmlns:wne="http://schemas.microsoft.com/office/word/2006/wordml" xmlns:wps="http://schemas.microsoft.com/office/word/2010/wordprocessingShape" mc:Ignorable="w14 w15 w16se w16cid w16 w16cex w16sdtdh w16sdtfl w16du wp14">
-  <w:abstractNum w:abstractNumId="0" w15:restartNumberingAfterBreak="0">
+<w:numbering xmlns:wpc="http://schemas.microsoft.com/office/word/2010/wordprocessingCanvas" xmlns:mc="http://schemas.openxmlformats.org/markup-compatibility/2006" xmlns:o="urn:schemas-microsoft-com:office:office" xmlns:r="http://schemas.openxmlformats.org/officeDocument/2006/relationships" xmlns:m="http://schemas.openxmlformats.org/officeDocument/2006/math" xmlns:v="urn:schemas-microsoft-com:vml" xmlns:wp14="http://schemas.microsoft.com/office/word/2010/wordprocessingDrawing" xmlns:wp="http://schemas.openxmlformats.org/drawingml/2006/wordprocessingDrawing" xmlns:w10="urn:schemas-microsoft-com:office:word" xmlns:w="http://schemas.openxmlformats.org/wordprocessingml/2006/main" xmlns:w14="http://schemas.microsoft.com/office/word/2010/wordml" xmlns:w15="http://schemas.microsoft.com/office/word/2012/wordml" xmlns:wpg="http://schemas.microsoft.com/office/word/2010/wordprocessingGroup" xmlns:wpi="http://schemas.microsoft.com/office/word/2010/wordprocessingInk" xmlns:wne="http://schemas.microsoft.com/office/word/2006/wordml" xmlns:wps="http://schemas.microsoft.com/office/word/2010/wordprocessingShape" mc:Ignorable="w14 w15 wp14">
+  <w:abstractNum w:abstractNumId="0">
     <w:nsid w:val="FFFFFF89"/>
     <w:multiLevelType w:val="singleLevel"/>
     <w:tmpl w:val="D3E6C2D4"/>
@@ -9503,7 +11448,7 @@
       </w:rPr>
     </w:lvl>
   </w:abstractNum>
-  <w:abstractNum w:abstractNumId="1" w15:restartNumberingAfterBreak="0">
+  <w:abstractNum w:abstractNumId="1">
     <w:nsid w:val="0F4F75DD"/>
     <w:multiLevelType w:val="hybridMultilevel"/>
     <w:tmpl w:val="F9028B88"/>
@@ -9616,7 +11561,7 @@
       </w:rPr>
     </w:lvl>
   </w:abstractNum>
-  <w:abstractNum w:abstractNumId="2" w15:restartNumberingAfterBreak="0">
+  <w:abstractNum w:abstractNumId="2">
     <w:nsid w:val="419A79E7"/>
     <w:multiLevelType w:val="hybridMultilevel"/>
     <w:tmpl w:val="D37A7430"/>
@@ -9729,7 +11674,7 @@
       </w:rPr>
     </w:lvl>
   </w:abstractNum>
-  <w:abstractNum w:abstractNumId="3" w15:restartNumberingAfterBreak="0">
+  <w:abstractNum w:abstractNumId="3">
     <w:nsid w:val="45D36853"/>
     <w:multiLevelType w:val="hybridMultilevel"/>
     <w:tmpl w:val="776AC13C"/>
@@ -9818,7 +11763,7 @@
       </w:pPr>
     </w:lvl>
   </w:abstractNum>
-  <w:abstractNum w:abstractNumId="4" w15:restartNumberingAfterBreak="0">
+  <w:abstractNum w:abstractNumId="4">
     <w:nsid w:val="48925125"/>
     <w:multiLevelType w:val="hybridMultilevel"/>
     <w:tmpl w:val="9B1613EC"/>
@@ -9904,7 +11849,7 @@
       </w:pPr>
     </w:lvl>
   </w:abstractNum>
-  <w:abstractNum w:abstractNumId="5" w15:restartNumberingAfterBreak="0">
+  <w:abstractNum w:abstractNumId="5">
     <w:nsid w:val="71297261"/>
     <w:multiLevelType w:val="hybridMultilevel"/>
     <w:tmpl w:val="6A1AFFD6"/>
@@ -10017,29 +11962,29 @@
       </w:rPr>
     </w:lvl>
   </w:abstractNum>
-  <w:num w:numId="1" w16cid:durableId="1291208649">
+  <w:num w:numId="1">
     <w:abstractNumId w:val="1"/>
   </w:num>
-  <w:num w:numId="2" w16cid:durableId="940255814">
+  <w:num w:numId="2">
     <w:abstractNumId w:val="2"/>
   </w:num>
-  <w:num w:numId="3" w16cid:durableId="58555648">
+  <w:num w:numId="3">
     <w:abstractNumId w:val="0"/>
   </w:num>
-  <w:num w:numId="4" w16cid:durableId="511186801">
+  <w:num w:numId="4">
     <w:abstractNumId w:val="4"/>
   </w:num>
-  <w:num w:numId="5" w16cid:durableId="37894623">
+  <w:num w:numId="5">
     <w:abstractNumId w:val="3"/>
   </w:num>
-  <w:num w:numId="6" w16cid:durableId="1336759613">
+  <w:num w:numId="6">
     <w:abstractNumId w:val="5"/>
   </w:num>
 </w:numbering>
 </file>
 
 <file path=word/styles.xml><?xml version="1.0" encoding="utf-8"?>
-<w:styles xmlns:mc="http://schemas.openxmlformats.org/markup-compatibility/2006" xmlns:r="http://schemas.openxmlformats.org/officeDocument/2006/relationships" xmlns:w="http://schemas.openxmlformats.org/wordprocessingml/2006/main" xmlns:w14="http://schemas.microsoft.com/office/word/2010/wordml" xmlns:w15="http://schemas.microsoft.com/office/word/2012/wordml" xmlns:w16cex="http://schemas.microsoft.com/office/word/2018/wordml/cex" xmlns:w16cid="http://schemas.microsoft.com/office/word/2016/wordml/cid" xmlns:w16="http://schemas.microsoft.com/office/word/2018/wordml" xmlns:w16du="http://schemas.microsoft.com/office/word/2023/wordml/word16du" xmlns:w16sdtdh="http://schemas.microsoft.com/office/word/2020/wordml/sdtdatahash" xmlns:w16sdtfl="http://schemas.microsoft.com/office/word/2024/wordml/sdtformatlock" xmlns:w16se="http://schemas.microsoft.com/office/word/2015/wordml/symex" mc:Ignorable="w14 w15 w16se w16cid w16 w16cex w16sdtdh w16sdtfl w16du">
+<w:styles xmlns:mc="http://schemas.openxmlformats.org/markup-compatibility/2006" xmlns:r="http://schemas.openxmlformats.org/officeDocument/2006/relationships" xmlns:w="http://schemas.openxmlformats.org/wordprocessingml/2006/main" xmlns:w14="http://schemas.microsoft.com/office/word/2010/wordml" xmlns:w15="http://schemas.microsoft.com/office/word/2012/wordml" mc:Ignorable="w14 w15">
   <w:docDefaults>
     <w:rPrDefault>
       <w:rPr>
@@ -10055,7 +12000,7 @@
       </w:pPr>
     </w:pPrDefault>
   </w:docDefaults>
-  <w:latentStyles w:defLockedState="0" w:defUIPriority="99" w:defSemiHidden="0" w:defUnhideWhenUsed="0" w:defQFormat="0" w:count="376">
+  <w:latentStyles w:defLockedState="0" w:defUIPriority="99" w:defSemiHidden="0" w:defUnhideWhenUsed="0" w:defQFormat="0" w:count="371">
     <w:lsdException w:name="Normal" w:uiPriority="0" w:qFormat="1"/>
     <w:lsdException w:name="heading 1" w:uiPriority="0" w:qFormat="1"/>
     <w:lsdException w:name="heading 2" w:semiHidden="1" w:uiPriority="9" w:unhideWhenUsed="1" w:qFormat="1"/>
@@ -10427,11 +12372,6 @@
     <w:lsdException w:name="List Table 5 Dark Accent 6" w:uiPriority="50"/>
     <w:lsdException w:name="List Table 6 Colorful Accent 6" w:uiPriority="51"/>
     <w:lsdException w:name="List Table 7 Colorful Accent 6" w:uiPriority="52"/>
-    <w:lsdException w:name="Mention" w:semiHidden="1" w:unhideWhenUsed="1"/>
-    <w:lsdException w:name="Smart Hyperlink" w:semiHidden="1" w:unhideWhenUsed="1"/>
-    <w:lsdException w:name="Hashtag" w:semiHidden="1" w:unhideWhenUsed="1"/>
-    <w:lsdException w:name="Unresolved Mention" w:semiHidden="1" w:unhideWhenUsed="1"/>
-    <w:lsdException w:name="Smart Link" w:semiHidden="1" w:unhideWhenUsed="1"/>
   </w:latentStyles>
   <w:style w:type="paragraph" w:default="1" w:styleId="Normal">
     <w:name w:val="Normal"/>
@@ -10565,6 +12505,7 @@
     <w:tblPr>
       <w:tblStyleRowBandSize w:val="1"/>
       <w:tblStyleColBandSize w:val="1"/>
+      <w:tblInd w:w="0" w:type="dxa"/>
       <w:tblBorders>
         <w:top w:val="single" w:sz="8" w:space="0" w:color="7BA0CD"/>
         <w:left w:val="single" w:sz="8" w:space="0" w:color="7BA0CD"/>
@@ -10572,6 +12513,12 @@
         <w:right w:val="single" w:sz="8" w:space="0" w:color="7BA0CD"/>
         <w:insideH w:val="single" w:sz="8" w:space="0" w:color="7BA0CD"/>
       </w:tblBorders>
+      <w:tblCellMar>
+        <w:top w:w="0" w:type="dxa"/>
+        <w:left w:w="108" w:type="dxa"/>
+        <w:bottom w:w="0" w:type="dxa"/>
+        <w:right w:w="108" w:type="dxa"/>
+      </w:tblCellMar>
     </w:tblPr>
     <w:tblStylePr w:type="firstRow">
       <w:pPr>
@@ -10741,6 +12688,7 @@
       <w:spacing w:after="0" w:line="240" w:lineRule="auto"/>
     </w:pPr>
     <w:tblPr>
+      <w:tblInd w:w="0" w:type="dxa"/>
       <w:tblBorders>
         <w:top w:val="single" w:sz="4" w:space="0" w:color="auto"/>
         <w:left w:val="single" w:sz="4" w:space="0" w:color="auto"/>
@@ -10749,6 +12697,12 @@
         <w:insideH w:val="single" w:sz="4" w:space="0" w:color="auto"/>
         <w:insideV w:val="single" w:sz="4" w:space="0" w:color="auto"/>
       </w:tblBorders>
+      <w:tblCellMar>
+        <w:top w:w="0" w:type="dxa"/>
+        <w:left w:w="108" w:type="dxa"/>
+        <w:bottom w:w="0" w:type="dxa"/>
+        <w:right w:w="108" w:type="dxa"/>
+      </w:tblCellMar>
     </w:tblPr>
   </w:style>
   <w:style w:type="table" w:customStyle="1" w:styleId="LightShading-Accent11">
@@ -10768,10 +12722,17 @@
     <w:tblPr>
       <w:tblStyleRowBandSize w:val="1"/>
       <w:tblStyleColBandSize w:val="1"/>
+      <w:tblInd w:w="0" w:type="dxa"/>
       <w:tblBorders>
         <w:top w:val="single" w:sz="8" w:space="0" w:color="4F81BD"/>
         <w:bottom w:val="single" w:sz="8" w:space="0" w:color="4F81BD"/>
       </w:tblBorders>
+      <w:tblCellMar>
+        <w:top w:w="0" w:type="dxa"/>
+        <w:left w:w="108" w:type="dxa"/>
+        <w:bottom w:w="0" w:type="dxa"/>
+        <w:right w:w="108" w:type="dxa"/>
+      </w:tblCellMar>
     </w:tblPr>
     <w:tblStylePr w:type="firstRow">
       <w:pPr>
@@ -10865,6 +12826,7 @@
     <w:tblPr>
       <w:tblStyleRowBandSize w:val="1"/>
       <w:tblStyleColBandSize w:val="1"/>
+      <w:tblInd w:w="0" w:type="dxa"/>
       <w:tblBorders>
         <w:top w:val="single" w:sz="8" w:space="0" w:color="4F81BD" w:themeColor="accent1"/>
         <w:left w:val="single" w:sz="8" w:space="0" w:color="4F81BD" w:themeColor="accent1"/>
@@ -10873,6 +12835,12 @@
         <w:insideH w:val="single" w:sz="8" w:space="0" w:color="4F81BD" w:themeColor="accent1"/>
         <w:insideV w:val="single" w:sz="8" w:space="0" w:color="4F81BD" w:themeColor="accent1"/>
       </w:tblBorders>
+      <w:tblCellMar>
+        <w:top w:w="0" w:type="dxa"/>
+        <w:left w:w="108" w:type="dxa"/>
+        <w:bottom w:w="0" w:type="dxa"/>
+        <w:right w:w="108" w:type="dxa"/>
+      </w:tblCellMar>
     </w:tblPr>
     <w:tcPr>
       <w:shd w:val="clear" w:color="auto" w:fill="D3DFEE" w:themeFill="accent1" w:themeFillTint="3F"/>
@@ -10979,6 +12947,7 @@
     <w:tblPr>
       <w:tblStyleRowBandSize w:val="1"/>
       <w:tblStyleColBandSize w:val="1"/>
+      <w:tblInd w:w="0" w:type="dxa"/>
       <w:tblBorders>
         <w:top w:val="single" w:sz="8" w:space="0" w:color="FFFFFF" w:themeColor="background1"/>
         <w:left w:val="single" w:sz="8" w:space="0" w:color="FFFFFF" w:themeColor="background1"/>
@@ -10987,6 +12956,12 @@
         <w:insideH w:val="single" w:sz="6" w:space="0" w:color="FFFFFF" w:themeColor="background1"/>
         <w:insideV w:val="single" w:sz="6" w:space="0" w:color="FFFFFF" w:themeColor="background1"/>
       </w:tblBorders>
+      <w:tblCellMar>
+        <w:top w:w="0" w:type="dxa"/>
+        <w:left w:w="108" w:type="dxa"/>
+        <w:bottom w:w="0" w:type="dxa"/>
+        <w:right w:w="108" w:type="dxa"/>
+      </w:tblCellMar>
     </w:tblPr>
     <w:tcPr>
       <w:shd w:val="clear" w:color="auto" w:fill="D3DFEE" w:themeFill="accent1" w:themeFillTint="3F"/>
@@ -11113,12 +13088,19 @@
     <w:tblPr>
       <w:tblStyleRowBandSize w:val="1"/>
       <w:tblStyleColBandSize w:val="1"/>
+      <w:tblInd w:w="0" w:type="dxa"/>
       <w:tblBorders>
         <w:top w:val="single" w:sz="8" w:space="0" w:color="4F81BD" w:themeColor="accent1"/>
         <w:left w:val="single" w:sz="8" w:space="0" w:color="4F81BD" w:themeColor="accent1"/>
         <w:bottom w:val="single" w:sz="8" w:space="0" w:color="4F81BD" w:themeColor="accent1"/>
         <w:right w:val="single" w:sz="8" w:space="0" w:color="4F81BD" w:themeColor="accent1"/>
       </w:tblBorders>
+      <w:tblCellMar>
+        <w:top w:w="0" w:type="dxa"/>
+        <w:left w:w="108" w:type="dxa"/>
+        <w:bottom w:w="0" w:type="dxa"/>
+        <w:right w:w="108" w:type="dxa"/>
+      </w:tblCellMar>
     </w:tblPr>
     <w:tblStylePr w:type="firstRow">
       <w:pPr>
@@ -11201,10 +13183,17 @@
     <w:tblPr>
       <w:tblStyleRowBandSize w:val="1"/>
       <w:tblStyleColBandSize w:val="1"/>
+      <w:tblInd w:w="0" w:type="dxa"/>
       <w:tblBorders>
         <w:top w:val="single" w:sz="8" w:space="0" w:color="4F81BD" w:themeColor="accent1"/>
         <w:bottom w:val="single" w:sz="8" w:space="0" w:color="4F81BD" w:themeColor="accent1"/>
       </w:tblBorders>
+      <w:tblCellMar>
+        <w:top w:w="0" w:type="dxa"/>
+        <w:left w:w="108" w:type="dxa"/>
+        <w:bottom w:w="0" w:type="dxa"/>
+        <w:right w:w="108" w:type="dxa"/>
+      </w:tblCellMar>
     </w:tblPr>
     <w:tblStylePr w:type="firstRow">
       <w:rPr>
@@ -11289,12 +13278,19 @@
     <w:tblPr>
       <w:tblStyleRowBandSize w:val="1"/>
       <w:tblStyleColBandSize w:val="1"/>
+      <w:tblInd w:w="0" w:type="dxa"/>
       <w:tblBorders>
         <w:top w:val="single" w:sz="8" w:space="0" w:color="4F81BD" w:themeColor="accent1"/>
         <w:left w:val="single" w:sz="8" w:space="0" w:color="4F81BD" w:themeColor="accent1"/>
         <w:bottom w:val="single" w:sz="8" w:space="0" w:color="4F81BD" w:themeColor="accent1"/>
         <w:right w:val="single" w:sz="8" w:space="0" w:color="4F81BD" w:themeColor="accent1"/>
       </w:tblBorders>
+      <w:tblCellMar>
+        <w:top w:w="0" w:type="dxa"/>
+        <w:left w:w="108" w:type="dxa"/>
+        <w:bottom w:w="0" w:type="dxa"/>
+        <w:right w:w="108" w:type="dxa"/>
+      </w:tblCellMar>
     </w:tblPr>
     <w:tblStylePr w:type="firstRow">
       <w:rPr>
@@ -11406,6 +13402,7 @@
     <w:tblPr>
       <w:tblStyleRowBandSize w:val="1"/>
       <w:tblStyleColBandSize w:val="1"/>
+      <w:tblInd w:w="0" w:type="dxa"/>
       <w:tblBorders>
         <w:top w:val="single" w:sz="8" w:space="0" w:color="7BA0CD" w:themeColor="accent1" w:themeTint="BF"/>
         <w:left w:val="single" w:sz="8" w:space="0" w:color="7BA0CD" w:themeColor="accent1" w:themeTint="BF"/>
@@ -11413,6 +13410,12 @@
         <w:right w:val="single" w:sz="8" w:space="0" w:color="7BA0CD" w:themeColor="accent1" w:themeTint="BF"/>
         <w:insideH w:val="single" w:sz="8" w:space="0" w:color="7BA0CD" w:themeColor="accent1" w:themeTint="BF"/>
       </w:tblBorders>
+      <w:tblCellMar>
+        <w:top w:w="0" w:type="dxa"/>
+        <w:left w:w="108" w:type="dxa"/>
+        <w:bottom w:w="0" w:type="dxa"/>
+        <w:right w:w="108" w:type="dxa"/>
+      </w:tblCellMar>
     </w:tblPr>
     <w:tblStylePr w:type="firstRow">
       <w:pPr>
@@ -11505,6 +13508,7 @@
     <w:tblPr>
       <w:tblStyleRowBandSize w:val="1"/>
       <w:tblStyleColBandSize w:val="1"/>
+      <w:tblInd w:w="0" w:type="dxa"/>
       <w:tblBorders>
         <w:top w:val="single" w:sz="8" w:space="0" w:color="404040" w:themeColor="text1" w:themeTint="BF"/>
         <w:left w:val="single" w:sz="8" w:space="0" w:color="404040" w:themeColor="text1" w:themeTint="BF"/>
@@ -11512,6 +13516,12 @@
         <w:right w:val="single" w:sz="8" w:space="0" w:color="404040" w:themeColor="text1" w:themeTint="BF"/>
         <w:insideH w:val="single" w:sz="8" w:space="0" w:color="404040" w:themeColor="text1" w:themeTint="BF"/>
       </w:tblBorders>
+      <w:tblCellMar>
+        <w:top w:w="0" w:type="dxa"/>
+        <w:left w:w="108" w:type="dxa"/>
+        <w:bottom w:w="0" w:type="dxa"/>
+        <w:right w:w="108" w:type="dxa"/>
+      </w:tblCellMar>
     </w:tblPr>
     <w:tblStylePr w:type="firstRow">
       <w:pPr>
@@ -11604,6 +13614,7 @@
     <w:tblPr>
       <w:tblStyleRowBandSize w:val="1"/>
       <w:tblStyleColBandSize w:val="1"/>
+      <w:tblInd w:w="0" w:type="dxa"/>
       <w:tblBorders>
         <w:top w:val="single" w:sz="8" w:space="0" w:color="4BACC6" w:themeColor="accent5"/>
         <w:left w:val="single" w:sz="8" w:space="0" w:color="4BACC6" w:themeColor="accent5"/>
@@ -11612,6 +13623,12 @@
         <w:insideH w:val="single" w:sz="8" w:space="0" w:color="4BACC6" w:themeColor="accent5"/>
         <w:insideV w:val="single" w:sz="8" w:space="0" w:color="4BACC6" w:themeColor="accent5"/>
       </w:tblBorders>
+      <w:tblCellMar>
+        <w:top w:w="0" w:type="dxa"/>
+        <w:left w:w="108" w:type="dxa"/>
+        <w:bottom w:w="0" w:type="dxa"/>
+        <w:right w:w="108" w:type="dxa"/>
+      </w:tblCellMar>
     </w:tblPr>
     <w:tblStylePr w:type="firstRow">
       <w:pPr>
@@ -11730,10 +13747,17 @@
     <w:tblPr>
       <w:tblStyleRowBandSize w:val="1"/>
       <w:tblStyleColBandSize w:val="1"/>
+      <w:tblInd w:w="0" w:type="dxa"/>
       <w:tblBorders>
         <w:top w:val="single" w:sz="8" w:space="0" w:color="4F81BD" w:themeColor="accent1"/>
         <w:bottom w:val="single" w:sz="8" w:space="0" w:color="4F81BD" w:themeColor="accent1"/>
       </w:tblBorders>
+      <w:tblCellMar>
+        <w:top w:w="0" w:type="dxa"/>
+        <w:left w:w="108" w:type="dxa"/>
+        <w:bottom w:w="0" w:type="dxa"/>
+        <w:right w:w="108" w:type="dxa"/>
+      </w:tblCellMar>
     </w:tblPr>
     <w:tblStylePr w:type="firstRow">
       <w:rPr>
@@ -11807,9 +13831,16 @@
     <w:tblPr>
       <w:tblStyleRowBandSize w:val="1"/>
       <w:tblStyleColBandSize w:val="1"/>
+      <w:tblInd w:w="0" w:type="dxa"/>
       <w:tblBorders>
         <w:insideH w:val="single" w:sz="4" w:space="0" w:color="FFFFFF" w:themeColor="background1"/>
       </w:tblBorders>
+      <w:tblCellMar>
+        <w:top w:w="0" w:type="dxa"/>
+        <w:left w:w="108" w:type="dxa"/>
+        <w:bottom w:w="0" w:type="dxa"/>
+        <w:right w:w="108" w:type="dxa"/>
+      </w:tblCellMar>
     </w:tblPr>
     <w:tcPr>
       <w:shd w:val="clear" w:color="auto" w:fill="DBE5F1" w:themeFill="accent1" w:themeFillTint="33"/>
@@ -11877,12 +13908,19 @@
     <w:tblPr>
       <w:tblStyleRowBandSize w:val="1"/>
       <w:tblStyleColBandSize w:val="1"/>
+      <w:tblInd w:w="0" w:type="dxa"/>
       <w:tblBorders>
         <w:top w:val="single" w:sz="8" w:space="0" w:color="4F81BD" w:themeColor="accent1"/>
         <w:left w:val="single" w:sz="8" w:space="0" w:color="4F81BD" w:themeColor="accent1"/>
         <w:bottom w:val="single" w:sz="8" w:space="0" w:color="4F81BD" w:themeColor="accent1"/>
         <w:right w:val="single" w:sz="8" w:space="0" w:color="4F81BD" w:themeColor="accent1"/>
       </w:tblBorders>
+      <w:tblCellMar>
+        <w:top w:w="0" w:type="dxa"/>
+        <w:left w:w="108" w:type="dxa"/>
+        <w:bottom w:w="0" w:type="dxa"/>
+        <w:right w:w="108" w:type="dxa"/>
+      </w:tblCellMar>
     </w:tblPr>
     <w:tblStylePr w:type="firstRow">
       <w:pPr>
@@ -11962,6 +14000,7 @@
     <w:tblPr>
       <w:tblStyleRowBandSize w:val="1"/>
       <w:tblStyleColBandSize w:val="1"/>
+      <w:tblInd w:w="0" w:type="dxa"/>
       <w:tblBorders>
         <w:top w:val="single" w:sz="8" w:space="0" w:color="7BA0CD" w:themeColor="accent1" w:themeTint="BF"/>
         <w:left w:val="single" w:sz="8" w:space="0" w:color="7BA0CD" w:themeColor="accent1" w:themeTint="BF"/>
@@ -11970,6 +14009,12 @@
         <w:insideH w:val="single" w:sz="8" w:space="0" w:color="7BA0CD" w:themeColor="accent1" w:themeTint="BF"/>
         <w:insideV w:val="single" w:sz="8" w:space="0" w:color="7BA0CD" w:themeColor="accent1" w:themeTint="BF"/>
       </w:tblBorders>
+      <w:tblCellMar>
+        <w:top w:w="0" w:type="dxa"/>
+        <w:left w:w="108" w:type="dxa"/>
+        <w:bottom w:w="0" w:type="dxa"/>
+        <w:right w:w="108" w:type="dxa"/>
+      </w:tblCellMar>
     </w:tblPr>
     <w:tcPr>
       <w:shd w:val="clear" w:color="auto" w:fill="D3DFEE" w:themeFill="accent1" w:themeFillTint="3F"/>
@@ -12059,7 +14104,7 @@
       <w:u w:val="single"/>
     </w:rPr>
   </w:style>
-  <w:style w:type="character" w:styleId="UnresolvedMention">
+  <w:style w:type="character" w:customStyle="1" w:styleId="UnresolvedMention">
     <w:name w:val="Unresolved Mention"/>
     <w:basedOn w:val="DefaultParagraphFont"/>
     <w:uiPriority w:val="99"/>
@@ -12069,6 +14114,17 @@
     <w:rPr>
       <w:color w:val="605E5C"/>
       <w:shd w:val="clear" w:color="auto" w:fill="E1DFDD"/>
+    </w:rPr>
+  </w:style>
+  <w:style w:type="character" w:styleId="Strong">
+    <w:name w:val="Strong"/>
+    <w:basedOn w:val="DefaultParagraphFont"/>
+    <w:uiPriority w:val="22"/>
+    <w:qFormat/>
+    <w:rsid w:val="00F23C72"/>
+    <w:rPr>
+      <w:b/>
+      <w:bCs/>
     </w:rPr>
   </w:style>
 </w:styles>
@@ -12370,7 +14426,7 @@
 </file>
 
 <file path=customXml/itemProps1.xml><?xml version="1.0" encoding="utf-8"?>
-<ds:datastoreItem xmlns:ds="http://schemas.openxmlformats.org/officeDocument/2006/customXml" ds:itemID="{1A6187CE-0FAD-44C6-B6C4-9EEE3810D56D}">
+<ds:datastoreItem xmlns:ds="http://schemas.openxmlformats.org/officeDocument/2006/customXml" ds:itemID="{F95D8057-E51E-4545-9381-F5E8EEECB8EA}">
   <ds:schemaRefs>
     <ds:schemaRef ds:uri="http://schemas.openxmlformats.org/officeDocument/2006/bibliography"/>
   </ds:schemaRefs>

</xml_diff>